<commit_message>
finished running 15x15 R allo and added a missed coords run.
</commit_message>
<xml_diff>
--- a/15x15_score_investigation.docx
+++ b/15x15_score_investigation.docx
@@ -7,154 +7,1277 @@
         <w:rPr>
           <w:b/>
           <w:bCs/>
-          <w:lang w:val="en-US"/>
+          <w:sz w:val="12"/>
+          <w:szCs w:val="12"/>
         </w:rPr>
       </w:pPr>
       <w:r>
         <w:rPr>
           <w:b/>
           <w:bCs/>
-          <w:lang w:val="en-US"/>
-        </w:rPr>
-        <w:t>R – Coords</w:t>
-      </w:r>
+          <w:sz w:val="12"/>
+          <w:szCs w:val="12"/>
+        </w:rPr>
+        <w:t xml:space="preserve">R – </w:t>
+      </w:r>
+      <w:proofErr w:type="spellStart"/>
+      <w:r>
+        <w:rPr>
+          <w:b/>
+          <w:bCs/>
+          <w:sz w:val="12"/>
+          <w:szCs w:val="12"/>
+        </w:rPr>
+        <w:t>Coords</w:t>
+      </w:r>
+      <w:proofErr w:type="spellEnd"/>
     </w:p>
     <w:p>
-      <w:r>
-        <w:t>Jpg line</w:t>
-      </w:r>
-      <w:r>
-        <w:t xml:space="preserve"> : Conclusie: ge</w:t>
-      </w:r>
-      <w:r>
-        <w:t>bruiken allemaal (0,1) en (14,13) als begin/eind. Wat gaat er mis?</w:t>
+      <w:pPr>
+        <w:rPr>
+          <w:color w:val="45B0E1" w:themeColor="accent1" w:themeTint="99"/>
+          <w:sz w:val="12"/>
+          <w:szCs w:val="12"/>
+          <w:lang w:val="en-US"/>
+        </w:rPr>
+      </w:pPr>
+      <w:proofErr w:type="spellStart"/>
+      <w:r>
+        <w:rPr>
+          <w:color w:val="45B0E1" w:themeColor="accent1" w:themeTint="99"/>
+          <w:sz w:val="12"/>
+          <w:szCs w:val="12"/>
+          <w:lang w:val="en-US"/>
+        </w:rPr>
+        <w:t>line_adj_json</w:t>
+      </w:r>
+      <w:proofErr w:type="spellEnd"/>
+      <w:r>
+        <w:rPr>
+          <w:color w:val="45B0E1" w:themeColor="accent1" w:themeTint="99"/>
+          <w:sz w:val="12"/>
+          <w:szCs w:val="12"/>
+          <w:lang w:val="en-US"/>
+        </w:rPr>
+        <w:t xml:space="preserve"> = </w:t>
+      </w:r>
+      <w:r>
+        <w:rPr>
+          <w:color w:val="45B0E1" w:themeColor="accent1" w:themeTint="99"/>
+          <w:sz w:val="12"/>
+          <w:szCs w:val="12"/>
+          <w:lang w:val="en-US"/>
+        </w:rPr>
+        <w:t>[</w:t>
+      </w:r>
+      <w:r>
+        <w:rPr>
+          <w:color w:val="45B0E1" w:themeColor="accent1" w:themeTint="99"/>
+          <w:sz w:val="12"/>
+          <w:szCs w:val="12"/>
+          <w:lang w:val="en-US"/>
+        </w:rPr>
+        <w:t>100.0, 100.0, 100.0, 100.0, 100.0, 100.0, 100.0, 100.0, 100.0, 100.0</w:t>
+      </w:r>
+      <w:r>
+        <w:rPr>
+          <w:color w:val="45B0E1" w:themeColor="accent1" w:themeTint="99"/>
+          <w:sz w:val="12"/>
+          <w:szCs w:val="12"/>
+          <w:lang w:val="en-US"/>
+        </w:rPr>
+        <w:t>]</w:t>
       </w:r>
     </w:p>
     <w:p>
-      <w:r>
+      <w:pPr>
+        <w:rPr>
+          <w:sz w:val="12"/>
+          <w:szCs w:val="12"/>
+        </w:rPr>
+      </w:pPr>
+      <w:proofErr w:type="spellStart"/>
+      <w:r>
+        <w:rPr>
+          <w:sz w:val="12"/>
+          <w:szCs w:val="12"/>
+          <w:lang w:val="en-US"/>
+        </w:rPr>
+        <w:t>line_adj_txt</w:t>
+      </w:r>
+      <w:proofErr w:type="spellEnd"/>
+      <w:r>
+        <w:rPr>
+          <w:sz w:val="12"/>
+          <w:szCs w:val="12"/>
+          <w:lang w:val="en-US"/>
+        </w:rPr>
+        <w:t xml:space="preserve"> = </w:t>
+      </w:r>
+      <w:r>
+        <w:rPr>
+          <w:sz w:val="12"/>
+          <w:szCs w:val="12"/>
+          <w:lang w:val="en-US"/>
+        </w:rPr>
+        <w:t>[</w:t>
+      </w:r>
+      <w:r>
+        <w:rPr>
+          <w:sz w:val="12"/>
+          <w:szCs w:val="12"/>
+          <w:lang w:val="en-US"/>
+        </w:rPr>
+        <w:t xml:space="preserve">19.083969465648856, 14.492753623188406, 51.798561151079134, 100.0, 60.629921259842526, 92.07920792079209, 100.0, </w:t>
+      </w:r>
+      <w:r>
+        <w:rPr>
+          <w:sz w:val="12"/>
+          <w:szCs w:val="12"/>
+        </w:rPr>
+        <w:t>56.9620253164557</w:t>
+      </w:r>
+      <w:r>
+        <w:rPr>
+          <w:sz w:val="12"/>
+          <w:szCs w:val="12"/>
+          <w:lang w:val="en-US"/>
+        </w:rPr>
+        <w:t>, 46.616541353383454, 100.0</w:t>
+      </w:r>
+      <w:r>
+        <w:rPr>
+          <w:sz w:val="12"/>
+          <w:szCs w:val="12"/>
+          <w:lang w:val="en-US"/>
+        </w:rPr>
+        <w:t>]</w:t>
+      </w:r>
+    </w:p>
+    <w:p>
+      <w:pPr>
+        <w:rPr>
+          <w:color w:val="45B0E1" w:themeColor="accent1" w:themeTint="99"/>
+          <w:sz w:val="12"/>
+          <w:szCs w:val="12"/>
+          <w:lang w:val="en-US"/>
+        </w:rPr>
+      </w:pPr>
+      <w:proofErr w:type="spellStart"/>
+      <w:r>
+        <w:rPr>
+          <w:color w:val="45B0E1" w:themeColor="accent1" w:themeTint="99"/>
+          <w:sz w:val="12"/>
+          <w:szCs w:val="12"/>
+          <w:lang w:val="en-US"/>
+        </w:rPr>
+        <w:t>line_jpg</w:t>
+      </w:r>
+      <w:proofErr w:type="spellEnd"/>
+      <w:r>
+        <w:rPr>
+          <w:color w:val="45B0E1" w:themeColor="accent1" w:themeTint="99"/>
+          <w:sz w:val="12"/>
+          <w:szCs w:val="12"/>
+          <w:lang w:val="en-US"/>
+        </w:rPr>
+        <w:t xml:space="preserve"> = </w:t>
+      </w:r>
+      <w:r>
+        <w:rPr>
+          <w:color w:val="45B0E1" w:themeColor="accent1" w:themeTint="99"/>
+          <w:sz w:val="12"/>
+          <w:szCs w:val="12"/>
+          <w:lang w:val="en-US"/>
+        </w:rPr>
+        <w:t>[</w:t>
+      </w:r>
+      <w:r>
+        <w:rPr>
+          <w:color w:val="45B0E1" w:themeColor="accent1" w:themeTint="99"/>
+          <w:sz w:val="12"/>
+          <w:szCs w:val="12"/>
+          <w:lang w:val="en-US"/>
+        </w:rPr>
+        <w:t>0.0, 0.0, 0.0, 0.0, 0.0, 0.0, 0.0, 0.0, 0.0, 0.0</w:t>
+      </w:r>
+      <w:r>
+        <w:rPr>
+          <w:color w:val="45B0E1" w:themeColor="accent1" w:themeTint="99"/>
+          <w:sz w:val="12"/>
+          <w:szCs w:val="12"/>
+          <w:lang w:val="en-US"/>
+        </w:rPr>
+        <w:t>]</w:t>
+      </w:r>
+    </w:p>
+    <w:p>
+      <w:pPr>
+        <w:rPr>
+          <w:sz w:val="12"/>
+          <w:szCs w:val="12"/>
+          <w:lang w:val="en-US"/>
+        </w:rPr>
+      </w:pPr>
+      <w:proofErr w:type="spellStart"/>
+      <w:r>
+        <w:rPr>
+          <w:sz w:val="12"/>
+          <w:szCs w:val="12"/>
+          <w:lang w:val="en-US"/>
+        </w:rPr>
+        <w:t>line_json</w:t>
+      </w:r>
+      <w:proofErr w:type="spellEnd"/>
+      <w:r>
+        <w:rPr>
+          <w:sz w:val="12"/>
+          <w:szCs w:val="12"/>
+          <w:lang w:val="en-US"/>
+        </w:rPr>
+        <w:t xml:space="preserve"> = </w:t>
+      </w:r>
+      <w:r>
+        <w:rPr>
+          <w:sz w:val="12"/>
+          <w:szCs w:val="12"/>
+          <w:lang w:val="en-US"/>
+        </w:rPr>
+        <w:t>[</w:t>
+      </w:r>
+      <w:r>
+        <w:rPr>
+          <w:sz w:val="12"/>
+          <w:szCs w:val="12"/>
+          <w:lang w:val="en-US"/>
+        </w:rPr>
+        <w:t>23.66412213740458, 15.942028985507244, 7.194244604316546, 7.017543859649122, 12.598425196850393, 9.900990099009901, 56.71641791044776, 50.63291139240506, 1.5037593984962405, 42.5531914893617</w:t>
+      </w:r>
+      <w:r>
+        <w:rPr>
+          <w:sz w:val="12"/>
+          <w:szCs w:val="12"/>
+          <w:lang w:val="en-US"/>
+        </w:rPr>
+        <w:t>]</w:t>
+      </w:r>
+    </w:p>
+    <w:p>
+      <w:pPr>
+        <w:rPr>
+          <w:color w:val="EE0000"/>
+          <w:sz w:val="12"/>
+          <w:szCs w:val="12"/>
+          <w:u w:val="single"/>
+          <w:lang w:val="en-US"/>
+        </w:rPr>
+      </w:pPr>
+      <w:proofErr w:type="spellStart"/>
+      <w:r>
+        <w:rPr>
+          <w:sz w:val="12"/>
+          <w:szCs w:val="12"/>
+        </w:rPr>
+        <w:t>line_tokenized_txt</w:t>
+      </w:r>
+      <w:proofErr w:type="spellEnd"/>
+      <w:r>
+        <w:rPr>
+          <w:sz w:val="12"/>
+          <w:szCs w:val="12"/>
+        </w:rPr>
+        <w:t xml:space="preserve"> = </w:t>
+      </w:r>
+      <w:r>
+        <w:rPr>
+          <w:sz w:val="12"/>
+          <w:szCs w:val="12"/>
+        </w:rPr>
+        <w:t>[</w:t>
+      </w:r>
+      <w:r>
+        <w:rPr>
+          <w:color w:val="EE0000"/>
+          <w:sz w:val="12"/>
+          <w:szCs w:val="12"/>
+        </w:rPr>
+        <w:t>96.18320610687023</w:t>
+      </w:r>
+      <w:r>
+        <w:rPr>
+          <w:sz w:val="12"/>
+          <w:szCs w:val="12"/>
+        </w:rPr>
+        <w:t xml:space="preserve">, 100.0, 100.0, 100.0, </w:t>
+      </w:r>
+      <w:r>
+        <w:rPr>
+          <w:color w:val="EE0000"/>
+          <w:sz w:val="12"/>
+          <w:szCs w:val="12"/>
+        </w:rPr>
+        <w:t>92.1259842519685</w:t>
+      </w:r>
+      <w:r>
+        <w:rPr>
+          <w:sz w:val="12"/>
+          <w:szCs w:val="12"/>
+        </w:rPr>
+        <w:t xml:space="preserve">, 22.772277227722775, 100.0, </w:t>
+      </w:r>
+      <w:r>
+        <w:rPr>
+          <w:color w:val="EE0000"/>
+          <w:sz w:val="12"/>
+          <w:szCs w:val="12"/>
+        </w:rPr>
+        <w:t>62.0253164556962</w:t>
+      </w:r>
+      <w:r>
+        <w:rPr>
+          <w:sz w:val="12"/>
+          <w:szCs w:val="12"/>
+        </w:rPr>
+        <w:t>, 100.0, 100.0</w:t>
+      </w:r>
+      <w:r>
+        <w:rPr>
+          <w:sz w:val="12"/>
+          <w:szCs w:val="12"/>
+        </w:rPr>
+        <w:t>]</w:t>
+      </w:r>
+      <w:r>
+        <w:rPr>
+          <w:sz w:val="12"/>
+          <w:szCs w:val="12"/>
+        </w:rPr>
+        <w:br/>
+      </w:r>
+      <w:r>
+        <w:rPr>
+          <w:color w:val="EE0000"/>
+          <w:sz w:val="12"/>
+          <w:szCs w:val="12"/>
+          <w:u w:val="single"/>
+        </w:rPr>
+        <w:t xml:space="preserve">Run 1: </w:t>
+      </w:r>
+      <w:r>
+        <w:rPr>
+          <w:color w:val="EE0000"/>
+          <w:sz w:val="12"/>
+          <w:szCs w:val="12"/>
+          <w:u w:val="single"/>
+        </w:rPr>
+        <w:t>Alles goed behalve het laatste muurtje. Geen uitleg hiervoor in summary.</w:t>
+      </w:r>
+      <w:r>
+        <w:rPr>
+          <w:color w:val="EE0000"/>
+          <w:sz w:val="12"/>
+          <w:szCs w:val="12"/>
+          <w:u w:val="single"/>
+        </w:rPr>
+        <w:t xml:space="preserve"> </w:t>
+      </w:r>
+      <w:r>
+        <w:rPr>
+          <w:noProof/>
+          <w:color w:val="EE0000"/>
+          <w:sz w:val="12"/>
+          <w:szCs w:val="12"/>
+        </w:rPr>
+        <w:drawing>
+          <wp:inline distT="0" distB="0" distL="0" distR="0" wp14:anchorId="62EF3F69" wp14:editId="3927D58D">
+            <wp:extent cx="361200" cy="355600"/>
+            <wp:effectExtent l="0" t="0" r="1270" b="6350"/>
+            <wp:docPr id="1532841882" name="Picture 1" descr="A maze game with a black and blue line&#10;&#10;AI-generated content may be incorrect."/>
+            <wp:cNvGraphicFramePr>
+              <a:graphicFrameLocks xmlns:a="http://schemas.openxmlformats.org/drawingml/2006/main" noChangeAspect="1"/>
+            </wp:cNvGraphicFramePr>
+            <a:graphic xmlns:a="http://schemas.openxmlformats.org/drawingml/2006/main">
+              <a:graphicData uri="http://schemas.openxmlformats.org/drawingml/2006/picture">
+                <pic:pic xmlns:pic="http://schemas.openxmlformats.org/drawingml/2006/picture">
+                  <pic:nvPicPr>
+                    <pic:cNvPr id="1861170435" name="Picture 1" descr="A maze game with a black and blue line&#10;&#10;AI-generated content may be incorrect."/>
+                    <pic:cNvPicPr/>
+                  </pic:nvPicPr>
+                  <pic:blipFill>
+                    <a:blip r:embed="rId4"/>
+                    <a:stretch>
+                      <a:fillRect/>
+                    </a:stretch>
+                  </pic:blipFill>
+                  <pic:spPr>
+                    <a:xfrm>
+                      <a:off x="0" y="0"/>
+                      <a:ext cx="376337" cy="370502"/>
+                    </a:xfrm>
+                    <a:prstGeom prst="rect">
+                      <a:avLst/>
+                    </a:prstGeom>
+                  </pic:spPr>
+                </pic:pic>
+              </a:graphicData>
+            </a:graphic>
+          </wp:inline>
+        </w:drawing>
+      </w:r>
+    </w:p>
+    <w:p>
+      <w:pPr>
+        <w:rPr>
+          <w:sz w:val="12"/>
+          <w:szCs w:val="12"/>
+          <w:lang w:val="en-US"/>
+        </w:rPr>
+      </w:pPr>
+      <w:proofErr w:type="spellStart"/>
+      <w:r>
+        <w:rPr>
+          <w:sz w:val="12"/>
+          <w:szCs w:val="12"/>
+          <w:lang w:val="en-US"/>
+        </w:rPr>
+        <w:t>occupancy_adj_json</w:t>
+      </w:r>
+      <w:proofErr w:type="spellEnd"/>
+      <w:r>
+        <w:rPr>
+          <w:sz w:val="12"/>
+          <w:szCs w:val="12"/>
+          <w:lang w:val="en-US"/>
+        </w:rPr>
+        <w:t xml:space="preserve"> = </w:t>
+      </w:r>
+      <w:r>
+        <w:rPr>
+          <w:sz w:val="12"/>
+          <w:szCs w:val="12"/>
+          <w:lang w:val="en-US"/>
+        </w:rPr>
+        <w:t>[</w:t>
+      </w:r>
+      <w:r>
+        <w:rPr>
+          <w:sz w:val="12"/>
+          <w:szCs w:val="12"/>
+          <w:lang w:val="en-US"/>
+        </w:rPr>
+        <w:t>100.0, 100.0,</w:t>
+      </w:r>
+      <w:r>
+        <w:rPr>
+          <w:color w:val="EE0000"/>
+          <w:sz w:val="12"/>
+          <w:szCs w:val="12"/>
+          <w:lang w:val="en-US"/>
+        </w:rPr>
+        <w:t xml:space="preserve"> 68.95306859205776</w:t>
+      </w:r>
+      <w:r>
+        <w:rPr>
+          <w:sz w:val="12"/>
+          <w:szCs w:val="12"/>
+          <w:lang w:val="en-US"/>
+        </w:rPr>
+        <w:t>, 100.0, 100.0, 100.0, 100.0, 100.0, 100.0, 100.0</w:t>
+      </w:r>
+      <w:r>
+        <w:rPr>
+          <w:sz w:val="12"/>
+          <w:szCs w:val="12"/>
+          <w:lang w:val="en-US"/>
+        </w:rPr>
+        <w:t>]</w:t>
+      </w:r>
+    </w:p>
+    <w:p>
+      <w:pPr>
+        <w:rPr>
+          <w:sz w:val="12"/>
+          <w:szCs w:val="12"/>
+          <w:lang w:val="en-US"/>
+        </w:rPr>
+      </w:pPr>
+      <w:proofErr w:type="spellStart"/>
+      <w:r>
+        <w:rPr>
+          <w:sz w:val="12"/>
+          <w:szCs w:val="12"/>
+          <w:lang w:val="en-US"/>
+        </w:rPr>
+        <w:t>occupancy_adj_txt</w:t>
+      </w:r>
+      <w:proofErr w:type="spellEnd"/>
+      <w:r>
+        <w:rPr>
+          <w:sz w:val="12"/>
+          <w:szCs w:val="12"/>
+          <w:lang w:val="en-US"/>
+        </w:rPr>
+        <w:t xml:space="preserve"> = </w:t>
+      </w:r>
+      <w:r>
+        <w:rPr>
+          <w:sz w:val="12"/>
+          <w:szCs w:val="12"/>
+          <w:lang w:val="en-US"/>
+        </w:rPr>
+        <w:t>[</w:t>
+      </w:r>
+      <w:r>
+        <w:rPr>
+          <w:sz w:val="12"/>
+          <w:szCs w:val="12"/>
+          <w:lang w:val="en-US"/>
+        </w:rPr>
+        <w:t>34.099616858237546, 15.328467153284672, 24.90974729241877, 29.20353982300885, 12.25296442687747, 42.28855721393035, 3.7593984962406015, 57.961783439490446, 46.41509433962264, 95.6989247311828</w:t>
+      </w:r>
+      <w:r>
+        <w:rPr>
+          <w:sz w:val="12"/>
+          <w:szCs w:val="12"/>
+          <w:lang w:val="en-US"/>
+        </w:rPr>
+        <w:t>]</w:t>
+      </w:r>
+    </w:p>
+    <w:p>
+      <w:pPr>
+        <w:rPr>
+          <w:sz w:val="12"/>
+          <w:szCs w:val="12"/>
+          <w:lang w:val="en-US"/>
+        </w:rPr>
+      </w:pPr>
+      <w:proofErr w:type="spellStart"/>
+      <w:r>
+        <w:rPr>
+          <w:sz w:val="12"/>
+          <w:szCs w:val="12"/>
+          <w:lang w:val="en-US"/>
+        </w:rPr>
+        <w:t>occupancy_ascii_txt</w:t>
+      </w:r>
+      <w:proofErr w:type="spellEnd"/>
+      <w:r>
+        <w:rPr>
+          <w:sz w:val="12"/>
+          <w:szCs w:val="12"/>
+          <w:lang w:val="en-US"/>
+        </w:rPr>
+        <w:t xml:space="preserve"> = </w:t>
+      </w:r>
+      <w:r>
+        <w:rPr>
+          <w:sz w:val="12"/>
+          <w:szCs w:val="12"/>
+          <w:lang w:val="en-US"/>
+        </w:rPr>
+        <w:t>[</w:t>
+      </w:r>
+      <w:r>
+        <w:rPr>
+          <w:sz w:val="12"/>
+          <w:szCs w:val="12"/>
+          <w:lang w:val="en-US"/>
+        </w:rPr>
+        <w:t xml:space="preserve">0.0, 0.0, 0.0, 0.0, 0.0, 0.0, 0.0, 0.0, 0.0, </w:t>
+      </w:r>
+      <w:r>
+        <w:rPr>
+          <w:color w:val="EE0000"/>
+          <w:sz w:val="12"/>
+          <w:szCs w:val="12"/>
+          <w:lang w:val="en-US"/>
+        </w:rPr>
+        <w:t>4.301075268817205</w:t>
+      </w:r>
+      <w:r>
+        <w:rPr>
+          <w:sz w:val="12"/>
+          <w:szCs w:val="12"/>
+          <w:lang w:val="en-US"/>
+        </w:rPr>
+        <w:t>]</w:t>
+      </w:r>
+    </w:p>
+    <w:p>
+      <w:pPr>
+        <w:rPr>
+          <w:sz w:val="12"/>
+          <w:szCs w:val="12"/>
+          <w:u w:val="single"/>
+        </w:rPr>
+      </w:pPr>
+      <w:proofErr w:type="spellStart"/>
+      <w:r>
+        <w:rPr>
+          <w:sz w:val="12"/>
+          <w:szCs w:val="12"/>
+          <w:lang w:val="en-US"/>
+        </w:rPr>
+        <w:t>occupancy_jpg</w:t>
+      </w:r>
+      <w:proofErr w:type="spellEnd"/>
+      <w:r>
+        <w:rPr>
+          <w:sz w:val="12"/>
+          <w:szCs w:val="12"/>
+          <w:lang w:val="en-US"/>
+        </w:rPr>
+        <w:t xml:space="preserve"> = </w:t>
+      </w:r>
+      <w:r>
+        <w:rPr>
+          <w:sz w:val="12"/>
+          <w:szCs w:val="12"/>
+          <w:lang w:val="en-US"/>
+        </w:rPr>
+        <w:t>[</w:t>
+      </w:r>
+      <w:r>
+        <w:rPr>
+          <w:color w:val="EE0000"/>
+          <w:sz w:val="12"/>
+          <w:szCs w:val="12"/>
+          <w:lang w:val="en-US"/>
+        </w:rPr>
+        <w:t xml:space="preserve">1.9157088122605364, 4.37956204379562, 1.083032490974729, 0.8849557522123894, 0.3952569169960474, </w:t>
+      </w:r>
+      <w:r>
+        <w:rPr>
+          <w:sz w:val="12"/>
+          <w:szCs w:val="12"/>
+          <w:lang w:val="en-US"/>
+        </w:rPr>
+        <w:t xml:space="preserve">0.0, </w:t>
+      </w:r>
+      <w:r>
+        <w:rPr>
+          <w:color w:val="EE0000"/>
+          <w:sz w:val="12"/>
+          <w:szCs w:val="12"/>
+          <w:lang w:val="en-US"/>
+        </w:rPr>
+        <w:t>0.7518796992481203</w:t>
+      </w:r>
+      <w:r>
+        <w:rPr>
+          <w:sz w:val="12"/>
+          <w:szCs w:val="12"/>
+          <w:lang w:val="en-US"/>
+        </w:rPr>
+        <w:t>, 0.0, 0.0, 0.0</w:t>
+      </w:r>
+      <w:r>
+        <w:rPr>
+          <w:sz w:val="12"/>
+          <w:szCs w:val="12"/>
+          <w:lang w:val="en-US"/>
+        </w:rPr>
+        <w:t>]</w:t>
+      </w:r>
+      <w:r>
+        <w:rPr>
+          <w:sz w:val="12"/>
+          <w:szCs w:val="12"/>
+          <w:lang w:val="en-US"/>
+        </w:rPr>
+        <w:br/>
+      </w:r>
+      <w:r>
+        <w:rPr>
+          <w:sz w:val="12"/>
+          <w:szCs w:val="12"/>
+          <w:u w:val="single"/>
+          <w:lang w:val="en-US"/>
+        </w:rPr>
+        <w:t xml:space="preserve">Run 1: </w:t>
+      </w:r>
+      <w:proofErr w:type="spellStart"/>
+      <w:r>
+        <w:rPr>
+          <w:sz w:val="12"/>
+          <w:szCs w:val="12"/>
+          <w:u w:val="single"/>
+          <w:lang w:val="en-US"/>
+        </w:rPr>
+        <w:t>eindpunt</w:t>
+      </w:r>
+      <w:proofErr w:type="spellEnd"/>
+      <w:r>
+        <w:rPr>
+          <w:sz w:val="12"/>
+          <w:szCs w:val="12"/>
+          <w:u w:val="single"/>
+          <w:lang w:val="en-US"/>
+        </w:rPr>
+        <w:t xml:space="preserve"> </w:t>
+      </w:r>
+      <w:proofErr w:type="spellStart"/>
+      <w:r>
+        <w:rPr>
+          <w:sz w:val="12"/>
+          <w:szCs w:val="12"/>
+          <w:u w:val="single"/>
+          <w:lang w:val="en-US"/>
+        </w:rPr>
+        <w:t>fout</w:t>
+      </w:r>
+      <w:proofErr w:type="spellEnd"/>
+      <w:r>
+        <w:rPr>
+          <w:sz w:val="12"/>
+          <w:szCs w:val="12"/>
+          <w:u w:val="single"/>
+          <w:lang w:val="en-US"/>
+        </w:rPr>
+        <w:t xml:space="preserve"> </w:t>
+      </w:r>
+      <w:proofErr w:type="spellStart"/>
+      <w:r>
+        <w:rPr>
+          <w:sz w:val="12"/>
+          <w:szCs w:val="12"/>
+          <w:u w:val="single"/>
+          <w:lang w:val="en-US"/>
+        </w:rPr>
+        <w:t>geidentificeerd</w:t>
+      </w:r>
+      <w:proofErr w:type="spellEnd"/>
+      <w:r>
+        <w:rPr>
+          <w:sz w:val="12"/>
+          <w:szCs w:val="12"/>
+          <w:u w:val="single"/>
+          <w:lang w:val="en-US"/>
+        </w:rPr>
+        <w:t xml:space="preserve">. </w:t>
+      </w:r>
+      <w:r>
+        <w:rPr>
+          <w:sz w:val="12"/>
+          <w:szCs w:val="12"/>
+          <w:u w:val="single"/>
+        </w:rPr>
+        <w:t>Pad ook gauw fout. Lijkt op een m</w:t>
+      </w:r>
+      <w:r>
+        <w:rPr>
+          <w:sz w:val="12"/>
+          <w:szCs w:val="12"/>
+          <w:u w:val="single"/>
+        </w:rPr>
+        <w:t xml:space="preserve">engsel van muren missen, rare </w:t>
+      </w:r>
+      <w:proofErr w:type="spellStart"/>
+      <w:r>
+        <w:rPr>
+          <w:sz w:val="12"/>
+          <w:szCs w:val="12"/>
+          <w:u w:val="single"/>
+        </w:rPr>
+        <w:t>waypoints</w:t>
+      </w:r>
+      <w:proofErr w:type="spellEnd"/>
+      <w:r>
+        <w:rPr>
+          <w:sz w:val="12"/>
+          <w:szCs w:val="12"/>
+          <w:u w:val="single"/>
+        </w:rPr>
+        <w:t xml:space="preserve"> volgen, trappetjes maken en soms proberen het pad een beetje te volgen </w:t>
+      </w:r>
+      <w:r>
+        <w:rPr>
+          <w:sz w:val="12"/>
+          <w:szCs w:val="12"/>
+          <w:u w:val="single"/>
+        </w:rPr>
+        <w:drawing>
+          <wp:inline distT="0" distB="0" distL="0" distR="0" wp14:anchorId="0903EB4F" wp14:editId="42388599">
+            <wp:extent cx="139700" cy="139700"/>
+            <wp:effectExtent l="0" t="0" r="0" b="0"/>
+            <wp:docPr id="1255436621" name="Picture 1" descr="A maze with a path in the middle&#10;&#10;AI-generated content may be incorrect."/>
+            <wp:cNvGraphicFramePr>
+              <a:graphicFrameLocks xmlns:a="http://schemas.openxmlformats.org/drawingml/2006/main" noChangeAspect="1"/>
+            </wp:cNvGraphicFramePr>
+            <a:graphic xmlns:a="http://schemas.openxmlformats.org/drawingml/2006/main">
+              <a:graphicData uri="http://schemas.openxmlformats.org/drawingml/2006/picture">
+                <pic:pic xmlns:pic="http://schemas.openxmlformats.org/drawingml/2006/picture">
+                  <pic:nvPicPr>
+                    <pic:cNvPr id="1255436621" name="Picture 1" descr="A maze with a path in the middle&#10;&#10;AI-generated content may be incorrect."/>
+                    <pic:cNvPicPr/>
+                  </pic:nvPicPr>
+                  <pic:blipFill>
+                    <a:blip r:embed="rId5"/>
+                    <a:stretch>
+                      <a:fillRect/>
+                    </a:stretch>
+                  </pic:blipFill>
+                  <pic:spPr>
+                    <a:xfrm>
+                      <a:off x="0" y="0"/>
+                      <a:ext cx="143573" cy="143573"/>
+                    </a:xfrm>
+                    <a:prstGeom prst="rect">
+                      <a:avLst/>
+                    </a:prstGeom>
+                  </pic:spPr>
+                </pic:pic>
+              </a:graphicData>
+            </a:graphic>
+          </wp:inline>
+        </w:drawing>
+      </w:r>
+      <w:r>
+        <w:rPr>
+          <w:sz w:val="12"/>
+          <w:szCs w:val="12"/>
+          <w:u w:val="single"/>
+        </w:rPr>
+        <w:t>.</w:t>
+      </w:r>
+    </w:p>
+    <w:p>
+      <w:pPr>
+        <w:rPr>
+          <w:sz w:val="12"/>
+          <w:szCs w:val="12"/>
+        </w:rPr>
+      </w:pPr>
+      <w:proofErr w:type="spellStart"/>
+      <w:r>
+        <w:rPr>
+          <w:sz w:val="12"/>
+          <w:szCs w:val="12"/>
+        </w:rPr>
+        <w:t>occupancy_json</w:t>
+      </w:r>
+      <w:proofErr w:type="spellEnd"/>
+      <w:r>
+        <w:rPr>
+          <w:sz w:val="12"/>
+          <w:szCs w:val="12"/>
+        </w:rPr>
+        <w:t xml:space="preserve"> = </w:t>
+      </w:r>
+      <w:r>
+        <w:rPr>
+          <w:sz w:val="12"/>
+          <w:szCs w:val="12"/>
+        </w:rPr>
+        <w:t>[</w:t>
+      </w:r>
+      <w:r>
+        <w:rPr>
+          <w:sz w:val="12"/>
+          <w:szCs w:val="12"/>
+        </w:rPr>
+        <w:t>11.877394636015326, 35.03649635036496, 1.8050541516245486, 15.04424778761062, 3.557312252964427, 21.393034825870647, 30.075187969924812, 15.92356687898089, 7.169811320754717, 33.33333333333333</w:t>
+      </w:r>
+      <w:r>
+        <w:rPr>
+          <w:sz w:val="12"/>
+          <w:szCs w:val="12"/>
+        </w:rPr>
+        <w:t>]</w:t>
+      </w:r>
+    </w:p>
+    <w:p>
+      <w:pPr>
+        <w:rPr>
+          <w:sz w:val="12"/>
+          <w:szCs w:val="12"/>
+          <w:lang w:val="en-US"/>
+        </w:rPr>
+      </w:pPr>
+      <w:proofErr w:type="spellStart"/>
+      <w:r>
+        <w:rPr>
+          <w:sz w:val="12"/>
+          <w:szCs w:val="12"/>
+          <w:lang w:val="en-US"/>
+        </w:rPr>
+        <w:t>occupancy_tokenized_txt</w:t>
+      </w:r>
+      <w:proofErr w:type="spellEnd"/>
+      <w:r>
+        <w:rPr>
+          <w:sz w:val="12"/>
+          <w:szCs w:val="12"/>
+          <w:lang w:val="en-US"/>
+        </w:rPr>
+        <w:t xml:space="preserve"> = </w:t>
+      </w:r>
+      <w:r>
+        <w:rPr>
+          <w:sz w:val="12"/>
+          <w:szCs w:val="12"/>
+          <w:lang w:val="en-US"/>
+        </w:rPr>
+        <w:t>[</w:t>
+      </w:r>
+      <w:r>
+        <w:rPr>
+          <w:sz w:val="12"/>
+          <w:szCs w:val="12"/>
+          <w:lang w:val="en-US"/>
+        </w:rPr>
+        <w:t xml:space="preserve">39.46360153256705, </w:t>
+      </w:r>
+      <w:r>
+        <w:rPr>
+          <w:color w:val="EE0000"/>
+          <w:sz w:val="12"/>
+          <w:szCs w:val="12"/>
+          <w:lang w:val="en-US"/>
+        </w:rPr>
+        <w:t>100.0</w:t>
+      </w:r>
+      <w:r>
+        <w:rPr>
+          <w:sz w:val="12"/>
+          <w:szCs w:val="12"/>
+          <w:lang w:val="en-US"/>
+        </w:rPr>
+        <w:t xml:space="preserve">, 7.581227436823104, </w:t>
+      </w:r>
+      <w:r>
+        <w:rPr>
+          <w:color w:val="EE0000"/>
+          <w:sz w:val="12"/>
+          <w:szCs w:val="12"/>
+          <w:lang w:val="en-US"/>
+        </w:rPr>
+        <w:t>100.0</w:t>
+      </w:r>
+      <w:r>
+        <w:rPr>
+          <w:sz w:val="12"/>
+          <w:szCs w:val="12"/>
+          <w:lang w:val="en-US"/>
+        </w:rPr>
+        <w:t xml:space="preserve">, 7.905138339920949, 7.462686567164178, </w:t>
+      </w:r>
+      <w:r>
+        <w:rPr>
+          <w:color w:val="EE0000"/>
+          <w:sz w:val="12"/>
+          <w:szCs w:val="12"/>
+          <w:lang w:val="en-US"/>
+        </w:rPr>
+        <w:t>100.0,</w:t>
+      </w:r>
+      <w:r>
+        <w:rPr>
+          <w:sz w:val="12"/>
+          <w:szCs w:val="12"/>
+          <w:lang w:val="en-US"/>
+        </w:rPr>
+        <w:t xml:space="preserve"> 13.375796178343949, 6.415094339622642, 11.827956989247312</w:t>
+      </w:r>
+      <w:r>
+        <w:rPr>
+          <w:sz w:val="12"/>
+          <w:szCs w:val="12"/>
+          <w:lang w:val="en-US"/>
+        </w:rPr>
+        <w:t>]</w:t>
+      </w:r>
+    </w:p>
+    <w:p>
+      <w:pPr>
+        <w:rPr>
+          <w:sz w:val="12"/>
+          <w:szCs w:val="12"/>
+          <w:lang w:val="en-US"/>
+        </w:rPr>
+      </w:pPr>
+    </w:p>
+    <w:p>
+      <w:pPr>
+        <w:rPr>
+          <w:b/>
+          <w:bCs/>
+          <w:sz w:val="12"/>
+          <w:szCs w:val="12"/>
+          <w:lang w:val="en-US"/>
+        </w:rPr>
+      </w:pPr>
+    </w:p>
+    <w:p>
+      <w:pPr>
+        <w:rPr>
+          <w:sz w:val="12"/>
+          <w:szCs w:val="12"/>
+        </w:rPr>
+      </w:pPr>
+      <w:r>
+        <w:rPr>
+          <w:sz w:val="12"/>
+          <w:szCs w:val="12"/>
+        </w:rPr>
+        <w:t>Jpg line</w:t>
+      </w:r>
+      <w:r>
+        <w:rPr>
+          <w:sz w:val="12"/>
+          <w:szCs w:val="12"/>
+        </w:rPr>
+        <w:t xml:space="preserve"> : Conclusie: gebruiken allemaal (0,1) en (14,13) als begin/eind. Wat gaat er mis?</w:t>
+      </w:r>
+    </w:p>
+    <w:p>
+      <w:pPr>
+        <w:rPr>
+          <w:sz w:val="12"/>
+          <w:szCs w:val="12"/>
+        </w:rPr>
+      </w:pPr>
+      <w:r>
+        <w:rPr>
+          <w:sz w:val="12"/>
+          <w:szCs w:val="12"/>
+        </w:rPr>
         <w:t xml:space="preserve">Run 1: begin/eind fout </w:t>
       </w:r>
       <w:proofErr w:type="spellStart"/>
       <w:r>
+        <w:rPr>
+          <w:sz w:val="12"/>
+          <w:szCs w:val="12"/>
+        </w:rPr>
         <w:t>geidentificeerd</w:t>
       </w:r>
       <w:proofErr w:type="spellEnd"/>
       <w:r>
-        <w:t>. Loopt in al</w:t>
-      </w:r>
-      <w:r>
-        <w:t>lemaal trappetjes maar het is best wel random.</w:t>
-      </w:r>
-      <w:r>
+        <w:rPr>
+          <w:sz w:val="12"/>
+          <w:szCs w:val="12"/>
+        </w:rPr>
+        <w:t>. Loopt in allemaal trappetjes maar het is best wel random.</w:t>
+      </w:r>
+      <w:r>
+        <w:rPr>
+          <w:sz w:val="12"/>
+          <w:szCs w:val="12"/>
+        </w:rPr>
         <w:br/>
         <w:t>Run 2:</w:t>
       </w:r>
       <w:r>
-        <w:t xml:space="preserve"> </w:t>
-      </w:r>
-      <w:r>
-        <w:t xml:space="preserve">begin/eind fout </w:t>
-      </w:r>
-      <w:proofErr w:type="spellStart"/>
-      <w:r>
+        <w:rPr>
+          <w:sz w:val="12"/>
+          <w:szCs w:val="12"/>
+        </w:rPr>
+        <w:t xml:space="preserve"> begin/eind fout </w:t>
+      </w:r>
+      <w:proofErr w:type="spellStart"/>
+      <w:r>
+        <w:rPr>
+          <w:sz w:val="12"/>
+          <w:szCs w:val="12"/>
+        </w:rPr>
         <w:t>geidentificeerd</w:t>
       </w:r>
       <w:proofErr w:type="spellEnd"/>
       <w:r>
-        <w:t>. Loopt in al</w:t>
-      </w:r>
-      <w:r>
-        <w:t>lemaal trappetjes maar het is best wel random.</w:t>
-      </w:r>
-      <w:r>
+        <w:rPr>
+          <w:sz w:val="12"/>
+          <w:szCs w:val="12"/>
+        </w:rPr>
+        <w:t>. Loopt in allemaal trappetjes maar het is best wel random.</w:t>
+      </w:r>
+      <w:r>
+        <w:rPr>
+          <w:sz w:val="12"/>
+          <w:szCs w:val="12"/>
+        </w:rPr>
+        <w:br/>
+        <w:t xml:space="preserve">Run 3: begin/eind fout </w:t>
+      </w:r>
+      <w:proofErr w:type="spellStart"/>
+      <w:r>
+        <w:rPr>
+          <w:sz w:val="12"/>
+          <w:szCs w:val="12"/>
+        </w:rPr>
+        <w:t>geidentificeerd</w:t>
+      </w:r>
+      <w:proofErr w:type="spellEnd"/>
+      <w:r>
+        <w:rPr>
+          <w:sz w:val="12"/>
+          <w:szCs w:val="12"/>
+        </w:rPr>
+        <w:t xml:space="preserve">. Loopt in allemaal trappetjes maar het is best wel random. Zegt dat 14,13 eind is, maar loopt </w:t>
+      </w:r>
+      <w:proofErr w:type="spellStart"/>
+      <w:r>
+        <w:rPr>
+          <w:sz w:val="12"/>
+          <w:szCs w:val="12"/>
+        </w:rPr>
+        <w:t>tm</w:t>
+      </w:r>
+      <w:proofErr w:type="spellEnd"/>
+      <w:r>
+        <w:rPr>
+          <w:sz w:val="12"/>
+          <w:szCs w:val="12"/>
+        </w:rPr>
+        <w:t xml:space="preserve"> 14,14 (via 14,13).</w:t>
+      </w:r>
+    </w:p>
+    <w:p>
+      <w:pPr>
+        <w:rPr>
+          <w:sz w:val="12"/>
+          <w:szCs w:val="12"/>
+        </w:rPr>
+      </w:pPr>
+    </w:p>
+    <w:p>
+      <w:pPr>
+        <w:rPr>
+          <w:sz w:val="12"/>
+          <w:szCs w:val="12"/>
+        </w:rPr>
+      </w:pPr>
+      <w:proofErr w:type="spellStart"/>
+      <w:r>
+        <w:rPr>
+          <w:sz w:val="12"/>
+          <w:szCs w:val="12"/>
+        </w:rPr>
+        <w:t>Json</w:t>
+      </w:r>
+      <w:proofErr w:type="spellEnd"/>
+      <w:r>
+        <w:rPr>
+          <w:sz w:val="12"/>
+          <w:szCs w:val="12"/>
+        </w:rPr>
+        <w:t xml:space="preserve"> line: </w:t>
+      </w:r>
+    </w:p>
+    <w:p>
+      <w:pPr>
+        <w:rPr>
+          <w:sz w:val="12"/>
+          <w:szCs w:val="12"/>
+        </w:rPr>
+      </w:pPr>
+      <w:r>
+        <w:rPr>
+          <w:sz w:val="12"/>
+          <w:szCs w:val="12"/>
+        </w:rPr>
+        <w:t xml:space="preserve">Run 1: doet het begin goed, en pakt een punt ergens rond het eind als </w:t>
+      </w:r>
+      <w:proofErr w:type="spellStart"/>
+      <w:r>
+        <w:rPr>
+          <w:sz w:val="12"/>
+          <w:szCs w:val="12"/>
+        </w:rPr>
+        <w:t>waypoint</w:t>
+      </w:r>
+      <w:proofErr w:type="spellEnd"/>
+      <w:r>
+        <w:rPr>
+          <w:sz w:val="12"/>
+          <w:szCs w:val="12"/>
+        </w:rPr>
+        <w:t>. Gaat mis in proberen daar op uit te komen.</w:t>
+      </w:r>
+      <w:r>
+        <w:rPr>
+          <w:sz w:val="12"/>
+          <w:szCs w:val="12"/>
+        </w:rPr>
+        <w:br/>
+        <w:t xml:space="preserve">Run 2: doet het begin goed en gaat daarna met trappetje bijna meteen naar eind. </w:t>
+      </w:r>
+      <w:r>
+        <w:rPr>
+          <w:sz w:val="12"/>
+          <w:szCs w:val="12"/>
+        </w:rPr>
         <w:br/>
         <w:t xml:space="preserve">Run 3: </w:t>
       </w:r>
-      <w:r>
-        <w:t xml:space="preserve">begin/eind fout </w:t>
-      </w:r>
-      <w:proofErr w:type="spellStart"/>
-      <w:r>
-        <w:t>geidentificeerd</w:t>
-      </w:r>
-      <w:proofErr w:type="spellEnd"/>
-      <w:r>
-        <w:t>. Loopt in al</w:t>
-      </w:r>
-      <w:r>
-        <w:t>lemaal trappetjes maar het is best wel random.</w:t>
-      </w:r>
-      <w:r>
-        <w:t xml:space="preserve"> Zegt dat 14,13 eind is, maar loopt </w:t>
-      </w:r>
-      <w:proofErr w:type="spellStart"/>
-      <w:r>
-        <w:t>tm</w:t>
-      </w:r>
-      <w:proofErr w:type="spellEnd"/>
-      <w:r>
-        <w:t xml:space="preserve"> 14,14 (via 14,13).</w:t>
-      </w:r>
-    </w:p>
-    <w:p/>
-    <w:p>
-      <w:proofErr w:type="spellStart"/>
-      <w:r>
-        <w:t>Json</w:t>
-      </w:r>
-      <w:proofErr w:type="spellEnd"/>
-      <w:r>
-        <w:t xml:space="preserve"> line: </w:t>
+      <w:proofErr w:type="spellStart"/>
+      <w:r>
+        <w:rPr>
+          <w:sz w:val="12"/>
+          <w:szCs w:val="12"/>
+        </w:rPr>
+        <w:t>reasoning</w:t>
+      </w:r>
+      <w:proofErr w:type="spellEnd"/>
+      <w:r>
+        <w:rPr>
+          <w:sz w:val="12"/>
+          <w:szCs w:val="12"/>
+        </w:rPr>
+        <w:t xml:space="preserve"> gaat goed maar</w:t>
+      </w:r>
+      <w:r>
+        <w:rPr>
+          <w:sz w:val="12"/>
+          <w:szCs w:val="12"/>
+        </w:rPr>
+        <w:t xml:space="preserve"> summary</w:t>
+      </w:r>
+      <w:r>
+        <w:rPr>
+          <w:sz w:val="12"/>
+          <w:szCs w:val="12"/>
+        </w:rPr>
+        <w:t xml:space="preserve"> stopt plots. Loopt in eindantwoord een ander pad dan omschreven in </w:t>
+      </w:r>
+      <w:proofErr w:type="spellStart"/>
+      <w:r>
+        <w:rPr>
+          <w:sz w:val="12"/>
+          <w:szCs w:val="12"/>
+        </w:rPr>
+        <w:t>reasoning</w:t>
+      </w:r>
+      <w:proofErr w:type="spellEnd"/>
+      <w:r>
+        <w:rPr>
+          <w:sz w:val="12"/>
+          <w:szCs w:val="12"/>
+        </w:rPr>
+        <w:t xml:space="preserve">. </w:t>
       </w:r>
     </w:p>
     <w:p>
-      <w:r>
-        <w:t xml:space="preserve">Run 1: doet het begin goed, en pakt een punt ergens rond het eind als </w:t>
-      </w:r>
-      <w:proofErr w:type="spellStart"/>
-      <w:r>
-        <w:t>waypoint</w:t>
-      </w:r>
-      <w:proofErr w:type="spellEnd"/>
-      <w:r>
-        <w:t>. Gaat mis in proberen daar op uit te komen.</w:t>
-      </w:r>
-      <w:r>
-        <w:br/>
-        <w:t xml:space="preserve">Run 2: doet het begin goed en gaat daarna met trappetje bijna meteen naar eind. </w:t>
-      </w:r>
-      <w:r>
-        <w:br/>
-        <w:t xml:space="preserve">Run 3: </w:t>
-      </w:r>
-      <w:proofErr w:type="spellStart"/>
-      <w:r>
-        <w:t>reasoning</w:t>
-      </w:r>
-      <w:proofErr w:type="spellEnd"/>
-      <w:r>
-        <w:t xml:space="preserve"> gaat goed maar</w:t>
-      </w:r>
-      <w:r>
-        <w:t xml:space="preserve"> summary</w:t>
-      </w:r>
-      <w:r>
-        <w:t xml:space="preserve"> stopt plots. Loopt in eindantwoord een ander pad dan omschreven in </w:t>
-      </w:r>
-      <w:proofErr w:type="spellStart"/>
-      <w:r>
-        <w:t>reasoning</w:t>
-      </w:r>
-      <w:proofErr w:type="spellEnd"/>
-      <w:r>
-        <w:t xml:space="preserve">. </w:t>
-      </w:r>
+      <w:pPr>
+        <w:rPr>
+          <w:sz w:val="12"/>
+          <w:szCs w:val="12"/>
+        </w:rPr>
+      </w:pPr>
     </w:p>
-    <w:p/>
     <w:p>
-      <w:proofErr w:type="spellStart"/>
-      <w:r>
-        <w:rPr>
+      <w:pPr>
+        <w:rPr>
+          <w:sz w:val="12"/>
+          <w:szCs w:val="12"/>
+        </w:rPr>
+      </w:pPr>
+      <w:proofErr w:type="spellStart"/>
+      <w:r>
+        <w:rPr>
+          <w:sz w:val="12"/>
+          <w:szCs w:val="12"/>
           <w:lang w:val="en-US"/>
         </w:rPr>
         <w:t>Adjaceny</w:t>
@@ -162,12 +1285,16 @@
       <w:proofErr w:type="spellEnd"/>
       <w:r>
         <w:rPr>
+          <w:sz w:val="12"/>
+          <w:szCs w:val="12"/>
           <w:lang w:val="en-US"/>
         </w:rPr>
         <w:t xml:space="preserve"> JSON line:</w:t>
       </w:r>
       <w:r>
         <w:rPr>
+          <w:sz w:val="12"/>
+          <w:szCs w:val="12"/>
           <w:lang w:val="en-US"/>
         </w:rPr>
         <w:br/>
@@ -176,6 +1303,8 @@
       <w:proofErr w:type="spellStart"/>
       <w:r>
         <w:rPr>
+          <w:sz w:val="12"/>
+          <w:szCs w:val="12"/>
           <w:lang w:val="en-US"/>
         </w:rPr>
         <w:t>doet</w:t>
@@ -183,83 +1312,118 @@
       <w:proofErr w:type="spellEnd"/>
       <w:r>
         <w:rPr>
-          <w:lang w:val="en-US"/>
+          <w:sz w:val="12"/>
+          <w:szCs w:val="12"/>
+          <w:lang w:val="en-US"/>
+        </w:rPr>
+        <w:t xml:space="preserve"> BFS ‘mentally’</w:t>
+      </w:r>
+      <w:r>
+        <w:rPr>
+          <w:sz w:val="12"/>
+          <w:szCs w:val="12"/>
+          <w:lang w:val="en-US"/>
+        </w:rPr>
+        <w:t xml:space="preserve">. </w:t>
+      </w:r>
+      <w:proofErr w:type="spellStart"/>
+      <w:r>
+        <w:rPr>
+          <w:sz w:val="12"/>
+          <w:szCs w:val="12"/>
+        </w:rPr>
+        <w:t>Reasoning</w:t>
+      </w:r>
+      <w:proofErr w:type="spellEnd"/>
+      <w:r>
+        <w:rPr>
+          <w:sz w:val="12"/>
+          <w:szCs w:val="12"/>
+        </w:rPr>
+        <w:t xml:space="preserve"> summary stopt plots.</w:t>
+      </w:r>
+      <w:r>
+        <w:rPr>
+          <w:sz w:val="12"/>
+          <w:szCs w:val="12"/>
+        </w:rPr>
+        <w:br/>
+        <w:t xml:space="preserve">Run 2: </w:t>
+      </w:r>
+      <w:r>
+        <w:rPr>
+          <w:sz w:val="12"/>
+          <w:szCs w:val="12"/>
+        </w:rPr>
+        <w:t>niks bijzonders</w:t>
+      </w:r>
+      <w:r>
+        <w:rPr>
+          <w:sz w:val="12"/>
+          <w:szCs w:val="12"/>
+        </w:rPr>
+        <w:br/>
+        <w:t>Run 3: niks bijzonders.</w:t>
+      </w:r>
+      <w:r>
+        <w:rPr>
+          <w:sz w:val="12"/>
+          <w:szCs w:val="12"/>
+        </w:rPr>
+        <w:br/>
+      </w:r>
+      <w:r>
+        <w:rPr>
+          <w:sz w:val="12"/>
+          <w:szCs w:val="12"/>
+        </w:rPr>
+        <w:br/>
+      </w:r>
+      <w:proofErr w:type="spellStart"/>
+      <w:r>
+        <w:rPr>
+          <w:sz w:val="12"/>
+          <w:szCs w:val="12"/>
+        </w:rPr>
+        <w:t>Adjacency</w:t>
+      </w:r>
+      <w:proofErr w:type="spellEnd"/>
+      <w:r>
+        <w:rPr>
+          <w:sz w:val="12"/>
+          <w:szCs w:val="12"/>
         </w:rPr>
         <w:t xml:space="preserve"> </w:t>
       </w:r>
-      <w:r>
-        <w:rPr>
-          <w:lang w:val="en-US"/>
-        </w:rPr>
-        <w:t>BFS ‘mentally’</w:t>
-      </w:r>
-      <w:r>
-        <w:rPr>
-          <w:lang w:val="en-US"/>
-        </w:rPr>
-        <w:t xml:space="preserve">. Reasoning summary </w:t>
-      </w:r>
-      <w:proofErr w:type="spellStart"/>
-      <w:r>
-        <w:rPr>
-          <w:lang w:val="en-US"/>
-        </w:rPr>
-        <w:t>stopt</w:t>
-      </w:r>
-      <w:proofErr w:type="spellEnd"/>
-      <w:r>
-        <w:rPr>
-          <w:lang w:val="en-US"/>
-        </w:rPr>
-        <w:t xml:space="preserve"> plots.</w:t>
-      </w:r>
-      <w:r>
-        <w:rPr>
-          <w:lang w:val="en-US"/>
-        </w:rPr>
-        <w:br/>
-      </w:r>
-      <w:r>
-        <w:t xml:space="preserve">Run 2: </w:t>
-      </w:r>
-      <w:r>
-        <w:t>niks bijzonders</w:t>
-      </w:r>
-      <w:r>
-        <w:br/>
-        <w:t>Run 3:</w:t>
-      </w:r>
-      <w:r>
-        <w:t xml:space="preserve"> niks bijzonders.</w:t>
-      </w:r>
-      <w:r>
-        <w:br/>
-      </w:r>
-      <w:r>
-        <w:br/>
-      </w:r>
-      <w:proofErr w:type="spellStart"/>
-      <w:r>
-        <w:t>Adjacency</w:t>
-      </w:r>
-      <w:proofErr w:type="spellEnd"/>
-      <w:r>
-        <w:t xml:space="preserve"> </w:t>
-      </w:r>
-      <w:proofErr w:type="spellStart"/>
-      <w:r>
+      <w:proofErr w:type="spellStart"/>
+      <w:r>
+        <w:rPr>
+          <w:sz w:val="12"/>
+          <w:szCs w:val="12"/>
+        </w:rPr>
         <w:t>text</w:t>
       </w:r>
       <w:proofErr w:type="spellEnd"/>
       <w:r>
+        <w:rPr>
+          <w:sz w:val="12"/>
+          <w:szCs w:val="12"/>
+        </w:rPr>
         <w:t xml:space="preserve"> line: </w:t>
       </w:r>
       <w:r>
+        <w:rPr>
+          <w:sz w:val="12"/>
+          <w:szCs w:val="12"/>
+        </w:rPr>
         <w:br/>
         <w:t xml:space="preserve">Run 1: </w:t>
       </w:r>
       <w:r>
         <w:rPr>
+          <w:noProof/>
+          <w:sz w:val="12"/>
+          <w:szCs w:val="12"/>
           <w:lang w:val="en-US"/>
         </w:rPr>
         <w:drawing>
@@ -278,7 +1442,7 @@
                     <pic:cNvPicPr/>
                   </pic:nvPicPr>
                   <pic:blipFill>
-                    <a:blip r:embed="rId4"/>
+                    <a:blip r:embed="rId6"/>
                     <a:stretch>
                       <a:fillRect/>
                     </a:stretch>
@@ -299,38 +1463,72 @@
         </w:drawing>
       </w:r>
       <w:r>
-        <w:t xml:space="preserve"> maakt 1 foutje en volgt daar</w:t>
-      </w:r>
-      <w:r>
-        <w:t xml:space="preserve">na weer de regels. Dan een dead-end zet met correcte backtrack! Op het eind nog een foutje. </w:t>
-      </w:r>
-      <w:r>
+        <w:rPr>
+          <w:sz w:val="12"/>
+          <w:szCs w:val="12"/>
+        </w:rPr>
+        <w:t xml:space="preserve"> maakt 1 foutje en volgt daarna weer de regels. Dan een dead-end zet met correcte backtrack! Op het eind nog een foutje. </w:t>
+      </w:r>
+      <w:r>
+        <w:rPr>
+          <w:sz w:val="12"/>
+          <w:szCs w:val="12"/>
+        </w:rPr>
         <w:br/>
         <w:t>Run 2:</w:t>
       </w:r>
       <w:r>
+        <w:rPr>
+          <w:sz w:val="12"/>
+          <w:szCs w:val="12"/>
+        </w:rPr>
         <w:br/>
         <w:t>Run 3:</w:t>
       </w:r>
       <w:r>
+        <w:rPr>
+          <w:sz w:val="12"/>
+          <w:szCs w:val="12"/>
+        </w:rPr>
         <w:br/>
       </w:r>
       <w:r>
+        <w:rPr>
+          <w:sz w:val="12"/>
+          <w:szCs w:val="12"/>
+        </w:rPr>
         <w:br/>
       </w:r>
       <w:proofErr w:type="spellStart"/>
       <w:r>
+        <w:rPr>
+          <w:sz w:val="12"/>
+          <w:szCs w:val="12"/>
+        </w:rPr>
         <w:t>Tokenized</w:t>
       </w:r>
       <w:proofErr w:type="spellEnd"/>
       <w:r>
+        <w:rPr>
+          <w:sz w:val="12"/>
+          <w:szCs w:val="12"/>
+        </w:rPr>
         <w:t xml:space="preserve"> line: </w:t>
       </w:r>
       <w:r>
+        <w:rPr>
+          <w:sz w:val="12"/>
+          <w:szCs w:val="12"/>
+        </w:rPr>
         <w:br/>
         <w:t xml:space="preserve">Run 1: Alles goed behalve het laatste muurtje. Geen uitleg hiervoor in summary. </w:t>
       </w:r>
       <w:r>
+        <w:rPr>
+          <w:noProof/>
+          <w:sz w:val="12"/>
+          <w:szCs w:val="12"/>
+        </w:rPr>
         <w:drawing>
           <wp:inline distT="0" distB="0" distL="0" distR="0" wp14:anchorId="3AC14E49" wp14:editId="4ED1F496">
             <wp:extent cx="505326" cy="497491"/>
@@ -347,7 +1545,7 @@
                     <pic:cNvPicPr/>
                   </pic:nvPicPr>
                   <pic:blipFill>
-                    <a:blip r:embed="rId5"/>
+                    <a:blip r:embed="rId4"/>
                     <a:stretch>
                       <a:fillRect/>
                     </a:stretch>
@@ -367,6 +1565,68 @@
           </wp:inline>
         </w:drawing>
       </w:r>
+    </w:p>
+    <w:p>
+      <w:pPr>
+        <w:rPr>
+          <w:sz w:val="12"/>
+          <w:szCs w:val="12"/>
+        </w:rPr>
+      </w:pPr>
+    </w:p>
+    <w:p>
+      <w:pPr>
+        <w:rPr>
+          <w:sz w:val="12"/>
+          <w:szCs w:val="12"/>
+        </w:rPr>
+      </w:pPr>
+    </w:p>
+    <w:p>
+      <w:pPr>
+        <w:rPr>
+          <w:b/>
+          <w:bCs/>
+          <w:sz w:val="12"/>
+          <w:szCs w:val="12"/>
+        </w:rPr>
+      </w:pPr>
+      <w:r>
+        <w:rPr>
+          <w:b/>
+          <w:bCs/>
+          <w:sz w:val="12"/>
+          <w:szCs w:val="12"/>
+        </w:rPr>
+        <w:t xml:space="preserve">R </w:t>
+      </w:r>
+      <w:r>
+        <w:rPr>
+          <w:b/>
+          <w:bCs/>
+          <w:sz w:val="12"/>
+          <w:szCs w:val="12"/>
+        </w:rPr>
+        <w:t>– Allo</w:t>
+      </w:r>
+    </w:p>
+    <w:p>
+      <w:pPr>
+        <w:rPr>
+          <w:sz w:val="12"/>
+          <w:szCs w:val="12"/>
+        </w:rPr>
+      </w:pPr>
+    </w:p>
+    <w:p>
+      <w:pPr>
+        <w:rPr>
+          <w:b/>
+          <w:bCs/>
+          <w:sz w:val="12"/>
+          <w:szCs w:val="12"/>
+        </w:rPr>
+      </w:pPr>
     </w:p>
     <w:sectPr>
       <w:pgSz w:w="11906" w:h="16838"/>
@@ -778,6 +2038,7 @@
   <w:style w:type="paragraph" w:default="1" w:styleId="Normal">
     <w:name w:val="Normal"/>
     <w:qFormat/>
+    <w:rsid w:val="00D31650"/>
   </w:style>
   <w:style w:type="paragraph" w:styleId="Heading1">
     <w:name w:val="heading 1"/>
@@ -981,7 +2242,6 @@
   <w:style w:type="character" w:default="1" w:styleId="DefaultParagraphFont">
     <w:name w:val="Default Paragraph Font"/>
     <w:uiPriority w:val="1"/>
-    <w:semiHidden/>
     <w:unhideWhenUsed/>
   </w:style>
   <w:style w:type="table" w:default="1" w:styleId="TableNormal">

</xml_diff>

<commit_message>
ran 15x15 ego 2-3
</commit_message>
<xml_diff>
--- a/15x15_score_investigation.docx
+++ b/15x15_score_investigation.docx
@@ -323,15 +323,30 @@
           <w:sz w:val="12"/>
           <w:szCs w:val="12"/>
         </w:rPr>
-        <w:t xml:space="preserve">, 22.772277227722775, 100.0, </w:t>
-      </w:r>
-      <w:r>
-        <w:rPr>
-          <w:color w:val="EE0000"/>
-          <w:sz w:val="12"/>
-          <w:szCs w:val="12"/>
-        </w:rPr>
-        <w:t>62.0253164556962</w:t>
+        <w:t xml:space="preserve">, </w:t>
+      </w:r>
+      <w:r>
+        <w:rPr>
+          <w:color w:val="EE0000"/>
+          <w:sz w:val="12"/>
+          <w:szCs w:val="12"/>
+        </w:rPr>
+        <w:t>22.772277227722775</w:t>
+      </w:r>
+      <w:r>
+        <w:rPr>
+          <w:sz w:val="12"/>
+          <w:szCs w:val="12"/>
+        </w:rPr>
+        <w:t xml:space="preserve">, 100.0, </w:t>
+      </w:r>
+      <w:r>
+        <w:rPr>
+          <w:color w:val="EE0000"/>
+          <w:sz w:val="12"/>
+          <w:szCs w:val="12"/>
+        </w:rPr>
+        <w:t>56.9620253164557</w:t>
       </w:r>
       <w:r>
         <w:rPr>
@@ -389,9 +404,9 @@
           <w:szCs w:val="12"/>
         </w:rPr>
         <w:drawing>
-          <wp:inline distT="0" distB="0" distL="0" distR="0" wp14:anchorId="62EF3F69" wp14:editId="3927D58D">
-            <wp:extent cx="361200" cy="355600"/>
-            <wp:effectExtent l="0" t="0" r="1270" b="6350"/>
+          <wp:inline distT="0" distB="0" distL="0" distR="0" wp14:anchorId="62EF3F69" wp14:editId="605D72D7">
+            <wp:extent cx="131233" cy="129198"/>
+            <wp:effectExtent l="0" t="0" r="2540" b="4445"/>
             <wp:docPr id="1532841882" name="Picture 1" descr="A maze game with a black and blue line&#10;&#10;AI-generated content may be incorrect."/>
             <wp:cNvGraphicFramePr>
               <a:graphicFrameLocks xmlns:a="http://schemas.openxmlformats.org/drawingml/2006/main" noChangeAspect="1"/>
@@ -412,7 +427,7 @@
                   <pic:spPr>
                     <a:xfrm>
                       <a:off x="0" y="0"/>
-                      <a:ext cx="376337" cy="370502"/>
+                      <a:ext cx="140202" cy="138028"/>
                     </a:xfrm>
                     <a:prstGeom prst="rect">
                       <a:avLst/>
@@ -424,13 +439,54 @@
           </wp:inline>
         </w:drawing>
       </w:r>
+      <w:r>
+        <w:rPr>
+          <w:color w:val="EE0000"/>
+          <w:sz w:val="12"/>
+          <w:szCs w:val="12"/>
+          <w:u w:val="single"/>
+        </w:rPr>
+        <w:br/>
+      </w:r>
+      <w:r>
+        <w:rPr>
+          <w:color w:val="EE0000"/>
+          <w:sz w:val="12"/>
+          <w:szCs w:val="12"/>
+          <w:u w:val="single"/>
+          <w:lang w:val="en-US"/>
+        </w:rPr>
+        <w:t>Run 5:</w:t>
+      </w:r>
+      <w:r>
+        <w:rPr>
+          <w:color w:val="EE0000"/>
+          <w:sz w:val="12"/>
+          <w:szCs w:val="12"/>
+          <w:u w:val="single"/>
+          <w:lang w:val="en-US"/>
+        </w:rPr>
+        <w:br/>
+        <w:t xml:space="preserve">Run 6: </w:t>
+      </w:r>
+      <w:r>
+        <w:rPr>
+          <w:color w:val="EE0000"/>
+          <w:sz w:val="12"/>
+          <w:szCs w:val="12"/>
+          <w:u w:val="single"/>
+          <w:lang w:val="en-US"/>
+        </w:rPr>
+        <w:br/>
+        <w:t>Run 8:</w:t>
+      </w:r>
     </w:p>
     <w:p>
       <w:pPr>
         <w:rPr>
           <w:sz w:val="12"/>
           <w:szCs w:val="12"/>
-          <w:lang w:val="en-US"/>
+          <w:u w:val="single"/>
         </w:rPr>
       </w:pPr>
       <w:proofErr w:type="spellStart"/>
@@ -491,6 +547,95 @@
           <w:lang w:val="en-US"/>
         </w:rPr>
         <w:t>]</w:t>
+      </w:r>
+      <w:r>
+        <w:rPr>
+          <w:sz w:val="12"/>
+          <w:szCs w:val="12"/>
+          <w:lang w:val="en-US"/>
+        </w:rPr>
+        <w:t xml:space="preserve"> </w:t>
+      </w:r>
+      <w:r>
+        <w:rPr>
+          <w:color w:val="EE0000"/>
+          <w:sz w:val="12"/>
+          <w:szCs w:val="12"/>
+          <w:u w:val="single"/>
+          <w:lang w:val="en-US"/>
+        </w:rPr>
+        <w:t>No internal thoughts.</w:t>
+      </w:r>
+      <w:r>
+        <w:rPr>
+          <w:color w:val="EE0000"/>
+          <w:sz w:val="12"/>
+          <w:szCs w:val="12"/>
+          <w:u w:val="single"/>
+          <w:lang w:val="en-US"/>
+        </w:rPr>
+        <w:t xml:space="preserve"> </w:t>
+      </w:r>
+      <w:r>
+        <w:rPr>
+          <w:color w:val="EE0000"/>
+          <w:sz w:val="12"/>
+          <w:szCs w:val="12"/>
+          <w:u w:val="single"/>
+        </w:rPr>
+        <w:t>Loopt geheel volgens de regels, en la</w:t>
+      </w:r>
+      <w:r>
+        <w:rPr>
+          <w:color w:val="EE0000"/>
+          <w:sz w:val="12"/>
+          <w:szCs w:val="12"/>
+          <w:u w:val="single"/>
+        </w:rPr>
+        <w:t>at zelfs een ronde backtracking zien in zijn antwoord!!! Maar lost hem helaas niet op</w:t>
+      </w:r>
+      <w:r>
+        <w:rPr>
+          <w:color w:val="EE0000"/>
+          <w:sz w:val="12"/>
+          <w:szCs w:val="12"/>
+          <w:u w:val="single"/>
+        </w:rPr>
+        <w:drawing>
+          <wp:inline distT="0" distB="0" distL="0" distR="0" wp14:anchorId="2936E1CA" wp14:editId="2D1B82DF">
+            <wp:extent cx="106096" cy="106680"/>
+            <wp:effectExtent l="0" t="0" r="8255" b="7620"/>
+            <wp:docPr id="1787739238" name="Picture 1" descr="A maze with a black square with a blue line&#10;&#10;AI-generated content may be incorrect."/>
+            <wp:cNvGraphicFramePr>
+              <a:graphicFrameLocks xmlns:a="http://schemas.openxmlformats.org/drawingml/2006/main" noChangeAspect="1"/>
+            </wp:cNvGraphicFramePr>
+            <a:graphic xmlns:a="http://schemas.openxmlformats.org/drawingml/2006/main">
+              <a:graphicData uri="http://schemas.openxmlformats.org/drawingml/2006/picture">
+                <pic:pic xmlns:pic="http://schemas.openxmlformats.org/drawingml/2006/picture">
+                  <pic:nvPicPr>
+                    <pic:cNvPr id="1787739238" name="Picture 1" descr="A maze with a black square with a blue line&#10;&#10;AI-generated content may be incorrect."/>
+                    <pic:cNvPicPr/>
+                  </pic:nvPicPr>
+                  <pic:blipFill>
+                    <a:blip r:embed="rId5"/>
+                    <a:stretch>
+                      <a:fillRect/>
+                    </a:stretch>
+                  </pic:blipFill>
+                  <pic:spPr>
+                    <a:xfrm>
+                      <a:off x="0" y="0"/>
+                      <a:ext cx="110679" cy="111288"/>
+                    </a:xfrm>
+                    <a:prstGeom prst="rect">
+                      <a:avLst/>
+                    </a:prstGeom>
+                  </pic:spPr>
+                </pic:pic>
+              </a:graphicData>
+            </a:graphic>
+          </wp:inline>
+        </w:drawing>
       </w:r>
     </w:p>
     <w:p>
@@ -498,7 +643,6 @@
         <w:rPr>
           <w:sz w:val="12"/>
           <w:szCs w:val="12"/>
-          <w:lang w:val="en-US"/>
         </w:rPr>
       </w:pPr>
       <w:proofErr w:type="spellStart"/>
@@ -506,7 +650,6 @@
         <w:rPr>
           <w:sz w:val="12"/>
           <w:szCs w:val="12"/>
-          <w:lang w:val="en-US"/>
         </w:rPr>
         <w:t>occupancy_adj_txt</w:t>
       </w:r>
@@ -515,7 +658,6 @@
         <w:rPr>
           <w:sz w:val="12"/>
           <w:szCs w:val="12"/>
-          <w:lang w:val="en-US"/>
         </w:rPr>
         <w:t xml:space="preserve"> = </w:t>
       </w:r>
@@ -523,7 +665,6 @@
         <w:rPr>
           <w:sz w:val="12"/>
           <w:szCs w:val="12"/>
-          <w:lang w:val="en-US"/>
         </w:rPr>
         <w:t>[</w:t>
       </w:r>
@@ -531,7 +672,6 @@
         <w:rPr>
           <w:sz w:val="12"/>
           <w:szCs w:val="12"/>
-          <w:lang w:val="en-US"/>
         </w:rPr>
         <w:t>34.099616858237546, 15.328467153284672, 24.90974729241877, 29.20353982300885, 12.25296442687747, 42.28855721393035, 3.7593984962406015, 57.961783439490446, 46.41509433962264, 95.6989247311828</w:t>
       </w:r>
@@ -539,7 +679,6 @@
         <w:rPr>
           <w:sz w:val="12"/>
           <w:szCs w:val="12"/>
-          <w:lang w:val="en-US"/>
         </w:rPr>
         <w:t>]</w:t>
       </w:r>
@@ -607,6 +746,7 @@
     <w:p>
       <w:pPr>
         <w:rPr>
+          <w:color w:val="EE0000"/>
           <w:sz w:val="12"/>
           <w:szCs w:val="12"/>
           <w:u w:val="single"/>
@@ -690,101 +830,37 @@
       </w:r>
       <w:r>
         <w:rPr>
-          <w:sz w:val="12"/>
-          <w:szCs w:val="12"/>
-          <w:u w:val="single"/>
-          <w:lang w:val="en-US"/>
-        </w:rPr>
-        <w:t xml:space="preserve">Run 1: </w:t>
+          <w:color w:val="EE0000"/>
+          <w:sz w:val="12"/>
+          <w:szCs w:val="12"/>
+          <w:u w:val="single"/>
+          <w:lang w:val="en-US"/>
+        </w:rPr>
+        <w:t xml:space="preserve">Run 1: eindpunt fout geidentificeerd. </w:t>
+      </w:r>
+      <w:r>
+        <w:rPr>
+          <w:color w:val="EE0000"/>
+          <w:sz w:val="12"/>
+          <w:szCs w:val="12"/>
+          <w:u w:val="single"/>
+        </w:rPr>
+        <w:t xml:space="preserve">Pad ook gauw fout. Lijkt op een mengsel van muren missen, rare </w:t>
       </w:r>
       <w:proofErr w:type="spellStart"/>
       <w:r>
         <w:rPr>
-          <w:sz w:val="12"/>
-          <w:szCs w:val="12"/>
-          <w:u w:val="single"/>
-          <w:lang w:val="en-US"/>
-        </w:rPr>
-        <w:t>eindpunt</w:t>
+          <w:color w:val="EE0000"/>
+          <w:sz w:val="12"/>
+          <w:szCs w:val="12"/>
+          <w:u w:val="single"/>
+        </w:rPr>
+        <w:t>waypoints</w:t>
       </w:r>
       <w:proofErr w:type="spellEnd"/>
       <w:r>
         <w:rPr>
-          <w:sz w:val="12"/>
-          <w:szCs w:val="12"/>
-          <w:u w:val="single"/>
-          <w:lang w:val="en-US"/>
-        </w:rPr>
-        <w:t xml:space="preserve"> </w:t>
-      </w:r>
-      <w:proofErr w:type="spellStart"/>
-      <w:r>
-        <w:rPr>
-          <w:sz w:val="12"/>
-          <w:szCs w:val="12"/>
-          <w:u w:val="single"/>
-          <w:lang w:val="en-US"/>
-        </w:rPr>
-        <w:t>fout</w:t>
-      </w:r>
-      <w:proofErr w:type="spellEnd"/>
-      <w:r>
-        <w:rPr>
-          <w:sz w:val="12"/>
-          <w:szCs w:val="12"/>
-          <w:u w:val="single"/>
-          <w:lang w:val="en-US"/>
-        </w:rPr>
-        <w:t xml:space="preserve"> </w:t>
-      </w:r>
-      <w:proofErr w:type="spellStart"/>
-      <w:r>
-        <w:rPr>
-          <w:sz w:val="12"/>
-          <w:szCs w:val="12"/>
-          <w:u w:val="single"/>
-          <w:lang w:val="en-US"/>
-        </w:rPr>
-        <w:t>geidentificeerd</w:t>
-      </w:r>
-      <w:proofErr w:type="spellEnd"/>
-      <w:r>
-        <w:rPr>
-          <w:sz w:val="12"/>
-          <w:szCs w:val="12"/>
-          <w:u w:val="single"/>
-          <w:lang w:val="en-US"/>
-        </w:rPr>
-        <w:t xml:space="preserve">. </w:t>
-      </w:r>
-      <w:r>
-        <w:rPr>
-          <w:sz w:val="12"/>
-          <w:szCs w:val="12"/>
-          <w:u w:val="single"/>
-        </w:rPr>
-        <w:t>Pad ook gauw fout. Lijkt op een m</w:t>
-      </w:r>
-      <w:r>
-        <w:rPr>
-          <w:sz w:val="12"/>
-          <w:szCs w:val="12"/>
-          <w:u w:val="single"/>
-        </w:rPr>
-        <w:t xml:space="preserve">engsel van muren missen, rare </w:t>
-      </w:r>
-      <w:proofErr w:type="spellStart"/>
-      <w:r>
-        <w:rPr>
-          <w:sz w:val="12"/>
-          <w:szCs w:val="12"/>
-          <w:u w:val="single"/>
-        </w:rPr>
-        <w:t>waypoints</w:t>
-      </w:r>
-      <w:proofErr w:type="spellEnd"/>
-      <w:r>
-        <w:rPr>
+          <w:color w:val="EE0000"/>
           <w:sz w:val="12"/>
           <w:szCs w:val="12"/>
           <w:u w:val="single"/>
@@ -793,6 +869,7 @@
       </w:r>
       <w:r>
         <w:rPr>
+          <w:color w:val="EE0000"/>
           <w:sz w:val="12"/>
           <w:szCs w:val="12"/>
           <w:u w:val="single"/>
@@ -813,7 +890,7 @@
                     <pic:cNvPicPr/>
                   </pic:nvPicPr>
                   <pic:blipFill>
-                    <a:blip r:embed="rId5"/>
+                    <a:blip r:embed="rId6"/>
                     <a:stretch>
                       <a:fillRect/>
                     </a:stretch>
@@ -835,11 +912,114 @@
       </w:r>
       <w:r>
         <w:rPr>
+          <w:color w:val="EE0000"/>
           <w:sz w:val="12"/>
           <w:szCs w:val="12"/>
           <w:u w:val="single"/>
         </w:rPr>
         <w:t>.</w:t>
+      </w:r>
+      <w:r>
+        <w:rPr>
+          <w:color w:val="EE0000"/>
+          <w:sz w:val="12"/>
+          <w:szCs w:val="12"/>
+          <w:u w:val="single"/>
+        </w:rPr>
+        <w:br/>
+        <w:t>Run 2:</w:t>
+      </w:r>
+      <w:r>
+        <w:rPr>
+          <w:color w:val="EE0000"/>
+          <w:sz w:val="12"/>
+          <w:szCs w:val="12"/>
+          <w:u w:val="single"/>
+        </w:rPr>
+        <w:t xml:space="preserve"> De summary klinkt alsof de eerste stappen intentioneel goed zijn, alles daarna lijkt op een trappetje en gok. </w:t>
+      </w:r>
+      <w:r>
+        <w:rPr>
+          <w:color w:val="EE0000"/>
+          <w:sz w:val="12"/>
+          <w:szCs w:val="12"/>
+          <w:u w:val="single"/>
+        </w:rPr>
+        <w:drawing>
+          <wp:inline distT="0" distB="0" distL="0" distR="0" wp14:anchorId="4898C6CC" wp14:editId="71C8ABDF">
+            <wp:extent cx="136321" cy="135466"/>
+            <wp:effectExtent l="0" t="0" r="0" b="0"/>
+            <wp:docPr id="1727027812" name="Picture 1" descr="A maze with a blue line going into the center&#10;&#10;AI-generated content may be incorrect."/>
+            <wp:cNvGraphicFramePr>
+              <a:graphicFrameLocks xmlns:a="http://schemas.openxmlformats.org/drawingml/2006/main" noChangeAspect="1"/>
+            </wp:cNvGraphicFramePr>
+            <a:graphic xmlns:a="http://schemas.openxmlformats.org/drawingml/2006/main">
+              <a:graphicData uri="http://schemas.openxmlformats.org/drawingml/2006/picture">
+                <pic:pic xmlns:pic="http://schemas.openxmlformats.org/drawingml/2006/picture">
+                  <pic:nvPicPr>
+                    <pic:cNvPr id="1727027812" name="Picture 1" descr="A maze with a blue line going into the center&#10;&#10;AI-generated content may be incorrect."/>
+                    <pic:cNvPicPr/>
+                  </pic:nvPicPr>
+                  <pic:blipFill>
+                    <a:blip r:embed="rId7"/>
+                    <a:stretch>
+                      <a:fillRect/>
+                    </a:stretch>
+                  </pic:blipFill>
+                  <pic:spPr>
+                    <a:xfrm>
+                      <a:off x="0" y="0"/>
+                      <a:ext cx="138483" cy="137614"/>
+                    </a:xfrm>
+                    <a:prstGeom prst="rect">
+                      <a:avLst/>
+                    </a:prstGeom>
+                  </pic:spPr>
+                </pic:pic>
+              </a:graphicData>
+            </a:graphic>
+          </wp:inline>
+        </w:drawing>
+      </w:r>
+      <w:r>
+        <w:rPr>
+          <w:color w:val="EE0000"/>
+          <w:sz w:val="12"/>
+          <w:szCs w:val="12"/>
+          <w:u w:val="single"/>
+        </w:rPr>
+        <w:br/>
+        <w:t>Run 3:</w:t>
+      </w:r>
+      <w:r>
+        <w:rPr>
+          <w:color w:val="EE0000"/>
+          <w:sz w:val="12"/>
+          <w:szCs w:val="12"/>
+          <w:u w:val="single"/>
+        </w:rPr>
+        <w:br/>
+        <w:t>Run 4:</w:t>
+      </w:r>
+      <w:r>
+        <w:rPr>
+          <w:color w:val="EE0000"/>
+          <w:sz w:val="12"/>
+          <w:szCs w:val="12"/>
+          <w:u w:val="single"/>
+        </w:rPr>
+        <w:br/>
+        <w:t>Run 5:</w:t>
+      </w:r>
+      <w:r>
+        <w:rPr>
+          <w:color w:val="EE0000"/>
+          <w:sz w:val="12"/>
+          <w:szCs w:val="12"/>
+          <w:u w:val="single"/>
+        </w:rPr>
+        <w:br/>
+        <w:t>Run 7:</w:t>
       </w:r>
     </w:p>
     <w:p>
@@ -847,6 +1027,7 @@
         <w:rPr>
           <w:sz w:val="12"/>
           <w:szCs w:val="12"/>
+          <w:lang w:val="en-US"/>
         </w:rPr>
       </w:pPr>
       <w:proofErr w:type="spellStart"/>
@@ -854,6 +1035,7 @@
         <w:rPr>
           <w:sz w:val="12"/>
           <w:szCs w:val="12"/>
+          <w:lang w:val="en-US"/>
         </w:rPr>
         <w:t>occupancy_json</w:t>
       </w:r>
@@ -862,6 +1044,7 @@
         <w:rPr>
           <w:sz w:val="12"/>
           <w:szCs w:val="12"/>
+          <w:lang w:val="en-US"/>
         </w:rPr>
         <w:t xml:space="preserve"> = </w:t>
       </w:r>
@@ -869,6 +1052,7 @@
         <w:rPr>
           <w:sz w:val="12"/>
           <w:szCs w:val="12"/>
+          <w:lang w:val="en-US"/>
         </w:rPr>
         <w:t>[</w:t>
       </w:r>
@@ -876,6 +1060,7 @@
         <w:rPr>
           <w:sz w:val="12"/>
           <w:szCs w:val="12"/>
+          <w:lang w:val="en-US"/>
         </w:rPr>
         <w:t>11.877394636015326, 35.03649635036496, 1.8050541516245486, 15.04424778761062, 3.557312252964427, 21.393034825870647, 30.075187969924812, 15.92356687898089, 7.169811320754717, 33.33333333333333</w:t>
       </w:r>
@@ -883,6 +1068,7 @@
         <w:rPr>
           <w:sz w:val="12"/>
           <w:szCs w:val="12"/>
+          <w:lang w:val="en-US"/>
         </w:rPr>
         <w:t>]</w:t>
       </w:r>
@@ -892,7 +1078,7 @@
         <w:rPr>
           <w:sz w:val="12"/>
           <w:szCs w:val="12"/>
-          <w:lang w:val="en-US"/>
+          <w:u w:val="single"/>
         </w:rPr>
       </w:pPr>
       <w:proofErr w:type="spellStart"/>
@@ -987,6 +1173,176 @@
           <w:lang w:val="en-US"/>
         </w:rPr>
         <w:t>]</w:t>
+      </w:r>
+      <w:r>
+        <w:rPr>
+          <w:sz w:val="12"/>
+          <w:szCs w:val="12"/>
+          <w:lang w:val="en-US"/>
+        </w:rPr>
+        <w:br/>
+      </w:r>
+      <w:r>
+        <w:rPr>
+          <w:color w:val="EE0000"/>
+          <w:sz w:val="12"/>
+          <w:szCs w:val="12"/>
+          <w:u w:val="single"/>
+          <w:lang w:val="en-US"/>
+        </w:rPr>
+        <w:t>Run 2:</w:t>
+      </w:r>
+      <w:r>
+        <w:rPr>
+          <w:color w:val="EE0000"/>
+          <w:sz w:val="12"/>
+          <w:szCs w:val="12"/>
+          <w:u w:val="single"/>
+          <w:lang w:val="en-US"/>
+        </w:rPr>
+        <w:t xml:space="preserve">  </w:t>
+      </w:r>
+      <w:proofErr w:type="spellStart"/>
+      <w:r>
+        <w:rPr>
+          <w:color w:val="EE0000"/>
+          <w:sz w:val="12"/>
+          <w:szCs w:val="12"/>
+          <w:u w:val="single"/>
+          <w:lang w:val="en-US"/>
+        </w:rPr>
+        <w:t>gewoon</w:t>
+      </w:r>
+      <w:proofErr w:type="spellEnd"/>
+      <w:r>
+        <w:rPr>
+          <w:color w:val="EE0000"/>
+          <w:sz w:val="12"/>
+          <w:szCs w:val="12"/>
+          <w:u w:val="single"/>
+          <w:lang w:val="en-US"/>
+        </w:rPr>
+        <w:t xml:space="preserve"> </w:t>
+      </w:r>
+      <w:proofErr w:type="spellStart"/>
+      <w:r>
+        <w:rPr>
+          <w:color w:val="EE0000"/>
+          <w:sz w:val="12"/>
+          <w:szCs w:val="12"/>
+          <w:u w:val="single"/>
+          <w:lang w:val="en-US"/>
+        </w:rPr>
+        <w:t>goed</w:t>
+      </w:r>
+      <w:proofErr w:type="spellEnd"/>
+      <w:r>
+        <w:rPr>
+          <w:color w:val="EE0000"/>
+          <w:sz w:val="12"/>
+          <w:szCs w:val="12"/>
+          <w:u w:val="single"/>
+          <w:lang w:val="en-US"/>
+        </w:rPr>
+        <w:t xml:space="preserve">. </w:t>
+      </w:r>
+      <w:r>
+        <w:rPr>
+          <w:color w:val="EE0000"/>
+          <w:sz w:val="12"/>
+          <w:szCs w:val="12"/>
+          <w:u w:val="single"/>
+        </w:rPr>
+        <w:t xml:space="preserve">Omschrijft een </w:t>
+      </w:r>
+      <w:proofErr w:type="spellStart"/>
+      <w:r>
+        <w:rPr>
+          <w:color w:val="EE0000"/>
+          <w:sz w:val="12"/>
+          <w:szCs w:val="12"/>
+          <w:u w:val="single"/>
+        </w:rPr>
+        <w:t>iteratrief</w:t>
+      </w:r>
+      <w:proofErr w:type="spellEnd"/>
+      <w:r>
+        <w:rPr>
+          <w:color w:val="EE0000"/>
+          <w:sz w:val="12"/>
+          <w:szCs w:val="12"/>
+          <w:u w:val="single"/>
+        </w:rPr>
+        <w:t xml:space="preserve"> </w:t>
+      </w:r>
+      <w:proofErr w:type="spellStart"/>
+      <w:r>
+        <w:rPr>
+          <w:color w:val="EE0000"/>
+          <w:sz w:val="12"/>
+          <w:szCs w:val="12"/>
+          <w:u w:val="single"/>
+        </w:rPr>
+        <w:t>process</w:t>
+      </w:r>
+      <w:proofErr w:type="spellEnd"/>
+      <w:r>
+        <w:rPr>
+          <w:color w:val="EE0000"/>
+          <w:sz w:val="12"/>
+          <w:szCs w:val="12"/>
+          <w:u w:val="single"/>
+        </w:rPr>
+        <w:t xml:space="preserve"> van DFS en </w:t>
+      </w:r>
+      <w:proofErr w:type="spellStart"/>
+      <w:r>
+        <w:rPr>
+          <w:color w:val="EE0000"/>
+          <w:sz w:val="12"/>
+          <w:szCs w:val="12"/>
+          <w:u w:val="single"/>
+        </w:rPr>
+        <w:t>self</w:t>
+      </w:r>
+      <w:proofErr w:type="spellEnd"/>
+      <w:r>
+        <w:rPr>
+          <w:color w:val="EE0000"/>
+          <w:sz w:val="12"/>
+          <w:szCs w:val="12"/>
+          <w:u w:val="single"/>
+        </w:rPr>
+        <w:t xml:space="preserve">-checks. </w:t>
+      </w:r>
+      <w:r>
+        <w:rPr>
+          <w:color w:val="EE0000"/>
+          <w:sz w:val="12"/>
+          <w:szCs w:val="12"/>
+          <w:u w:val="single"/>
+        </w:rPr>
+        <w:br/>
+        <w:t>Run 4:</w:t>
+      </w:r>
+      <w:r>
+        <w:rPr>
+          <w:color w:val="EE0000"/>
+          <w:sz w:val="12"/>
+          <w:szCs w:val="12"/>
+          <w:u w:val="single"/>
+        </w:rPr>
+        <w:br/>
+        <w:t>Run 7:</w:t>
+      </w:r>
+      <w:r>
+        <w:rPr>
+          <w:color w:val="EE0000"/>
+          <w:sz w:val="12"/>
+          <w:szCs w:val="12"/>
+          <w:u w:val="single"/>
+        </w:rPr>
+        <w:t xml:space="preserve"> </w:t>
       </w:r>
     </w:p>
     <w:p>
@@ -994,7 +1350,6 @@
         <w:rPr>
           <w:sz w:val="12"/>
           <w:szCs w:val="12"/>
-          <w:lang w:val="en-US"/>
         </w:rPr>
       </w:pPr>
     </w:p>
@@ -1005,7 +1360,6 @@
           <w:bCs/>
           <w:sz w:val="12"/>
           <w:szCs w:val="12"/>
-          <w:lang w:val="en-US"/>
         </w:rPr>
       </w:pPr>
     </w:p>
@@ -1442,7 +1796,7 @@
                     <pic:cNvPicPr/>
                   </pic:nvPicPr>
                   <pic:blipFill>
-                    <a:blip r:embed="rId6"/>
+                    <a:blip r:embed="rId8"/>
                     <a:stretch>
                       <a:fillRect/>
                     </a:stretch>
@@ -1505,6 +1859,7 @@
           <w:sz w:val="12"/>
           <w:szCs w:val="12"/>
         </w:rPr>
+        <w:lastRenderedPageBreak/>
         <w:t>Tokenized</w:t>
       </w:r>
       <w:proofErr w:type="spellEnd"/>

</xml_diff>

<commit_message>
ran test R 15x15 ego 4-5
</commit_message>
<xml_diff>
--- a/15x15_score_investigation.docx
+++ b/15x15_score_investigation.docx
@@ -18,19 +18,8 @@
           <w:sz w:val="12"/>
           <w:szCs w:val="12"/>
         </w:rPr>
-        <w:t xml:space="preserve">R – </w:t>
-      </w:r>
-      <w:proofErr w:type="spellStart"/>
-      <w:r>
-        <w:rPr>
-          <w:b/>
-          <w:bCs/>
-          <w:sz w:val="12"/>
-          <w:szCs w:val="12"/>
-        </w:rPr>
-        <w:t>Coords</w:t>
-      </w:r>
-      <w:proofErr w:type="spellEnd"/>
+        <w:t>R – Coords</w:t>
+      </w:r>
     </w:p>
     <w:p>
       <w:pPr>
@@ -41,7 +30,6 @@
           <w:lang w:val="en-US"/>
         </w:rPr>
       </w:pPr>
-      <w:proofErr w:type="spellStart"/>
       <w:r>
         <w:rPr>
           <w:color w:val="45B0E1" w:themeColor="accent1" w:themeTint="99"/>
@@ -49,17 +37,7 @@
           <w:szCs w:val="12"/>
           <w:lang w:val="en-US"/>
         </w:rPr>
-        <w:t>line_adj_json</w:t>
-      </w:r>
-      <w:proofErr w:type="spellEnd"/>
-      <w:r>
-        <w:rPr>
-          <w:color w:val="45B0E1" w:themeColor="accent1" w:themeTint="99"/>
-          <w:sz w:val="12"/>
-          <w:szCs w:val="12"/>
-          <w:lang w:val="en-US"/>
-        </w:rPr>
-        <w:t xml:space="preserve"> = </w:t>
+        <w:t xml:space="preserve">line_adj_json = </w:t>
       </w:r>
       <w:r>
         <w:rPr>
@@ -96,23 +74,13 @@
           <w:szCs w:val="12"/>
         </w:rPr>
       </w:pPr>
-      <w:proofErr w:type="spellStart"/>
-      <w:r>
-        <w:rPr>
-          <w:sz w:val="12"/>
-          <w:szCs w:val="12"/>
-          <w:lang w:val="en-US"/>
-        </w:rPr>
-        <w:t>line_adj_txt</w:t>
-      </w:r>
-      <w:proofErr w:type="spellEnd"/>
-      <w:r>
-        <w:rPr>
-          <w:sz w:val="12"/>
-          <w:szCs w:val="12"/>
-          <w:lang w:val="en-US"/>
-        </w:rPr>
-        <w:t xml:space="preserve"> = </w:t>
+      <w:r>
+        <w:rPr>
+          <w:sz w:val="12"/>
+          <w:szCs w:val="12"/>
+          <w:lang w:val="en-US"/>
+        </w:rPr>
+        <w:t xml:space="preserve">line_adj_txt = </w:t>
       </w:r>
       <w:r>
         <w:rPr>
@@ -163,7 +131,6 @@
           <w:lang w:val="en-US"/>
         </w:rPr>
       </w:pPr>
-      <w:proofErr w:type="spellStart"/>
       <w:r>
         <w:rPr>
           <w:color w:val="45B0E1" w:themeColor="accent1" w:themeTint="99"/>
@@ -171,17 +138,7 @@
           <w:szCs w:val="12"/>
           <w:lang w:val="en-US"/>
         </w:rPr>
-        <w:t>line_jpg</w:t>
-      </w:r>
-      <w:proofErr w:type="spellEnd"/>
-      <w:r>
-        <w:rPr>
-          <w:color w:val="45B0E1" w:themeColor="accent1" w:themeTint="99"/>
-          <w:sz w:val="12"/>
-          <w:szCs w:val="12"/>
-          <w:lang w:val="en-US"/>
-        </w:rPr>
-        <w:t xml:space="preserve"> = </w:t>
+        <w:t xml:space="preserve">line_jpg = </w:t>
       </w:r>
       <w:r>
         <w:rPr>
@@ -219,23 +176,13 @@
           <w:lang w:val="en-US"/>
         </w:rPr>
       </w:pPr>
-      <w:proofErr w:type="spellStart"/>
-      <w:r>
-        <w:rPr>
-          <w:sz w:val="12"/>
-          <w:szCs w:val="12"/>
-          <w:lang w:val="en-US"/>
-        </w:rPr>
-        <w:t>line_json</w:t>
-      </w:r>
-      <w:proofErr w:type="spellEnd"/>
-      <w:r>
-        <w:rPr>
-          <w:sz w:val="12"/>
-          <w:szCs w:val="12"/>
-          <w:lang w:val="en-US"/>
-        </w:rPr>
-        <w:t xml:space="preserve"> = </w:t>
+      <w:r>
+        <w:rPr>
+          <w:sz w:val="12"/>
+          <w:szCs w:val="12"/>
+          <w:lang w:val="en-US"/>
+        </w:rPr>
+        <w:t xml:space="preserve">line_json = </w:t>
       </w:r>
       <w:r>
         <w:rPr>
@@ -269,24 +216,14 @@
           <w:sz w:val="12"/>
           <w:szCs w:val="12"/>
           <w:u w:val="single"/>
-          <w:lang w:val="en-US"/>
         </w:rPr>
       </w:pPr>
-      <w:proofErr w:type="spellStart"/>
-      <w:r>
-        <w:rPr>
-          <w:sz w:val="12"/>
-          <w:szCs w:val="12"/>
-        </w:rPr>
-        <w:t>line_tokenized_txt</w:t>
-      </w:r>
-      <w:proofErr w:type="spellEnd"/>
-      <w:r>
-        <w:rPr>
-          <w:sz w:val="12"/>
-          <w:szCs w:val="12"/>
-        </w:rPr>
-        <w:t xml:space="preserve"> = </w:t>
+      <w:r>
+        <w:rPr>
+          <w:sz w:val="12"/>
+          <w:szCs w:val="12"/>
+        </w:rPr>
+        <w:t xml:space="preserve">line_tokenized_txt = </w:t>
       </w:r>
       <w:r>
         <w:rPr>
@@ -454,7 +391,6 @@
           <w:sz w:val="12"/>
           <w:szCs w:val="12"/>
           <w:u w:val="single"/>
-          <w:lang w:val="en-US"/>
         </w:rPr>
         <w:t>Run 5:</w:t>
       </w:r>
@@ -464,7 +400,67 @@
           <w:sz w:val="12"/>
           <w:szCs w:val="12"/>
           <w:u w:val="single"/>
-          <w:lang w:val="en-US"/>
+        </w:rPr>
+        <w:t xml:space="preserve"> Alles goed behalve 1 muurtje  bij het e</w:t>
+      </w:r>
+      <w:r>
+        <w:rPr>
+          <w:color w:val="EE0000"/>
+          <w:sz w:val="12"/>
+          <w:szCs w:val="12"/>
+          <w:u w:val="single"/>
+        </w:rPr>
+        <w:t xml:space="preserve">ind. Ook na het muurtje alles goed. Hiervoor geen toelichting in summary. </w:t>
+      </w:r>
+      <w:r>
+        <w:rPr>
+          <w:color w:val="EE0000"/>
+          <w:sz w:val="12"/>
+          <w:szCs w:val="12"/>
+          <w:u w:val="single"/>
+        </w:rPr>
+        <w:drawing>
+          <wp:inline distT="0" distB="0" distL="0" distR="0" wp14:anchorId="2A14E0B2" wp14:editId="0D7FDED0">
+            <wp:extent cx="125003" cy="124326"/>
+            <wp:effectExtent l="0" t="0" r="8890" b="0"/>
+            <wp:docPr id="1493243299" name="Picture 1"/>
+            <wp:cNvGraphicFramePr>
+              <a:graphicFrameLocks xmlns:a="http://schemas.openxmlformats.org/drawingml/2006/main" noChangeAspect="1"/>
+            </wp:cNvGraphicFramePr>
+            <a:graphic xmlns:a="http://schemas.openxmlformats.org/drawingml/2006/main">
+              <a:graphicData uri="http://schemas.openxmlformats.org/drawingml/2006/picture">
+                <pic:pic xmlns:pic="http://schemas.openxmlformats.org/drawingml/2006/picture">
+                  <pic:nvPicPr>
+                    <pic:cNvPr id="1493243299" name=""/>
+                    <pic:cNvPicPr/>
+                  </pic:nvPicPr>
+                  <pic:blipFill>
+                    <a:blip r:embed="rId5"/>
+                    <a:stretch>
+                      <a:fillRect/>
+                    </a:stretch>
+                  </pic:blipFill>
+                  <pic:spPr>
+                    <a:xfrm>
+                      <a:off x="0" y="0"/>
+                      <a:ext cx="131985" cy="131271"/>
+                    </a:xfrm>
+                    <a:prstGeom prst="rect">
+                      <a:avLst/>
+                    </a:prstGeom>
+                  </pic:spPr>
+                </pic:pic>
+              </a:graphicData>
+            </a:graphic>
+          </wp:inline>
+        </w:drawing>
+      </w:r>
+      <w:r>
+        <w:rPr>
+          <w:color w:val="EE0000"/>
+          <w:sz w:val="12"/>
+          <w:szCs w:val="12"/>
+          <w:u w:val="single"/>
         </w:rPr>
         <w:br/>
         <w:t xml:space="preserve">Run 6: </w:t>
@@ -475,7 +471,24 @@
           <w:sz w:val="12"/>
           <w:szCs w:val="12"/>
           <w:u w:val="single"/>
-          <w:lang w:val="en-US"/>
+        </w:rPr>
+        <w:t xml:space="preserve">Begint goed maar gaat opeens trappetje maken. </w:t>
+      </w:r>
+      <w:r>
+        <w:rPr>
+          <w:color w:val="EE0000"/>
+          <w:sz w:val="12"/>
+          <w:szCs w:val="12"/>
+          <w:u w:val="single"/>
+        </w:rPr>
+        <w:t>Geen toelichting in summary, hij vond de maze gewoon moeilijk.</w:t>
+      </w:r>
+      <w:r>
+        <w:rPr>
+          <w:color w:val="EE0000"/>
+          <w:sz w:val="12"/>
+          <w:szCs w:val="12"/>
+          <w:u w:val="single"/>
         </w:rPr>
         <w:br/>
         <w:t>Run 8:</w:t>
@@ -489,23 +502,13 @@
           <w:u w:val="single"/>
         </w:rPr>
       </w:pPr>
-      <w:proofErr w:type="spellStart"/>
-      <w:r>
-        <w:rPr>
-          <w:sz w:val="12"/>
-          <w:szCs w:val="12"/>
-          <w:lang w:val="en-US"/>
-        </w:rPr>
-        <w:t>occupancy_adj_json</w:t>
-      </w:r>
-      <w:proofErr w:type="spellEnd"/>
-      <w:r>
-        <w:rPr>
-          <w:sz w:val="12"/>
-          <w:szCs w:val="12"/>
-          <w:lang w:val="en-US"/>
-        </w:rPr>
-        <w:t xml:space="preserve"> = </w:t>
+      <w:r>
+        <w:rPr>
+          <w:sz w:val="12"/>
+          <w:szCs w:val="12"/>
+          <w:lang w:val="en-US"/>
+        </w:rPr>
+        <w:t xml:space="preserve">occupancy_adj_json = </w:t>
       </w:r>
       <w:r>
         <w:rPr>
@@ -617,7 +620,7 @@
                     <pic:cNvPicPr/>
                   </pic:nvPicPr>
                   <pic:blipFill>
-                    <a:blip r:embed="rId5"/>
+                    <a:blip r:embed="rId6"/>
                     <a:stretch>
                       <a:fillRect/>
                     </a:stretch>
@@ -645,21 +648,12 @@
           <w:szCs w:val="12"/>
         </w:rPr>
       </w:pPr>
-      <w:proofErr w:type="spellStart"/>
-      <w:r>
-        <w:rPr>
-          <w:sz w:val="12"/>
-          <w:szCs w:val="12"/>
-        </w:rPr>
-        <w:t>occupancy_adj_txt</w:t>
-      </w:r>
-      <w:proofErr w:type="spellEnd"/>
-      <w:r>
-        <w:rPr>
-          <w:sz w:val="12"/>
-          <w:szCs w:val="12"/>
-        </w:rPr>
-        <w:t xml:space="preserve"> = </w:t>
+      <w:r>
+        <w:rPr>
+          <w:sz w:val="12"/>
+          <w:szCs w:val="12"/>
+        </w:rPr>
+        <w:t xml:space="preserve">occupancy_adj_txt = </w:t>
       </w:r>
       <w:r>
         <w:rPr>
@@ -691,23 +685,13 @@
           <w:lang w:val="en-US"/>
         </w:rPr>
       </w:pPr>
-      <w:proofErr w:type="spellStart"/>
-      <w:r>
-        <w:rPr>
-          <w:sz w:val="12"/>
-          <w:szCs w:val="12"/>
-          <w:lang w:val="en-US"/>
-        </w:rPr>
-        <w:t>occupancy_ascii_txt</w:t>
-      </w:r>
-      <w:proofErr w:type="spellEnd"/>
-      <w:r>
-        <w:rPr>
-          <w:sz w:val="12"/>
-          <w:szCs w:val="12"/>
-          <w:lang w:val="en-US"/>
-        </w:rPr>
-        <w:t xml:space="preserve"> = </w:t>
+      <w:r>
+        <w:rPr>
+          <w:sz w:val="12"/>
+          <w:szCs w:val="12"/>
+          <w:lang w:val="en-US"/>
+        </w:rPr>
+        <w:t xml:space="preserve">occupancy_ascii_txt = </w:t>
       </w:r>
       <w:r>
         <w:rPr>
@@ -752,23 +736,13 @@
           <w:u w:val="single"/>
         </w:rPr>
       </w:pPr>
-      <w:proofErr w:type="spellStart"/>
-      <w:r>
-        <w:rPr>
-          <w:sz w:val="12"/>
-          <w:szCs w:val="12"/>
-          <w:lang w:val="en-US"/>
-        </w:rPr>
-        <w:t>occupancy_jpg</w:t>
-      </w:r>
-      <w:proofErr w:type="spellEnd"/>
-      <w:r>
-        <w:rPr>
-          <w:sz w:val="12"/>
-          <w:szCs w:val="12"/>
-          <w:lang w:val="en-US"/>
-        </w:rPr>
-        <w:t xml:space="preserve"> = </w:t>
+      <w:r>
+        <w:rPr>
+          <w:sz w:val="12"/>
+          <w:szCs w:val="12"/>
+          <w:lang w:val="en-US"/>
+        </w:rPr>
+        <w:t xml:space="preserve">occupancy_jpg = </w:t>
       </w:r>
       <w:r>
         <w:rPr>
@@ -845,27 +819,7 @@
           <w:szCs w:val="12"/>
           <w:u w:val="single"/>
         </w:rPr>
-        <w:t xml:space="preserve">Pad ook gauw fout. Lijkt op een mengsel van muren missen, rare </w:t>
-      </w:r>
-      <w:proofErr w:type="spellStart"/>
-      <w:r>
-        <w:rPr>
-          <w:color w:val="EE0000"/>
-          <w:sz w:val="12"/>
-          <w:szCs w:val="12"/>
-          <w:u w:val="single"/>
-        </w:rPr>
-        <w:t>waypoints</w:t>
-      </w:r>
-      <w:proofErr w:type="spellEnd"/>
-      <w:r>
-        <w:rPr>
-          <w:color w:val="EE0000"/>
-          <w:sz w:val="12"/>
-          <w:szCs w:val="12"/>
-          <w:u w:val="single"/>
-        </w:rPr>
-        <w:t xml:space="preserve"> volgen, trappetjes maken en soms proberen het pad een beetje te volgen </w:t>
+        <w:t xml:space="preserve">Pad ook gauw fout. Lijkt op een mengsel van muren missen, rare waypoints volgen, trappetjes maken en soms proberen het pad een beetje te volgen </w:t>
       </w:r>
       <w:r>
         <w:rPr>
@@ -890,7 +844,7 @@
                     <pic:cNvPicPr/>
                   </pic:nvPicPr>
                   <pic:blipFill>
-                    <a:blip r:embed="rId6"/>
+                    <a:blip r:embed="rId7"/>
                     <a:stretch>
                       <a:fillRect/>
                     </a:stretch>
@@ -961,7 +915,7 @@
                     <pic:cNvPicPr/>
                   </pic:nvPicPr>
                   <pic:blipFill>
-                    <a:blip r:embed="rId7"/>
+                    <a:blip r:embed="rId8"/>
                     <a:stretch>
                       <a:fillRect/>
                     </a:stretch>
@@ -998,6 +952,15 @@
           <w:szCs w:val="12"/>
           <w:u w:val="single"/>
         </w:rPr>
+        <w:t xml:space="preserve"> een rare kronkel die ik niet kan verklaren. Ik kan ook niet bepalen of de eerste stappen intentioneel zijn en uit begrip komen of niet.</w:t>
+      </w:r>
+      <w:r>
+        <w:rPr>
+          <w:color w:val="EE0000"/>
+          <w:sz w:val="12"/>
+          <w:szCs w:val="12"/>
+          <w:u w:val="single"/>
+        </w:rPr>
         <w:br/>
         <w:t>Run 4:</w:t>
       </w:r>
@@ -1008,6 +971,15 @@
           <w:szCs w:val="12"/>
           <w:u w:val="single"/>
         </w:rPr>
+        <w:t xml:space="preserve"> heeft alleen de start goed, niet de eerste stap. </w:t>
+      </w:r>
+      <w:r>
+        <w:rPr>
+          <w:color w:val="EE0000"/>
+          <w:sz w:val="12"/>
+          <w:szCs w:val="12"/>
+          <w:u w:val="single"/>
+        </w:rPr>
         <w:br/>
         <w:t>Run 5:</w:t>
       </w:r>
@@ -1018,8 +990,35 @@
           <w:szCs w:val="12"/>
           <w:u w:val="single"/>
         </w:rPr>
+        <w:t xml:space="preserve"> </w:t>
+      </w:r>
+      <w:r>
+        <w:rPr>
+          <w:color w:val="EE0000"/>
+          <w:sz w:val="12"/>
+          <w:szCs w:val="12"/>
+          <w:u w:val="single"/>
+        </w:rPr>
+        <w:t>heeft alleen de start goed, niet de eerste stap.</w:t>
+      </w:r>
+      <w:r>
+        <w:rPr>
+          <w:color w:val="EE0000"/>
+          <w:sz w:val="12"/>
+          <w:szCs w:val="12"/>
+          <w:u w:val="single"/>
+        </w:rPr>
         <w:br/>
         <w:t>Run 7:</w:t>
+      </w:r>
+      <w:r>
+        <w:rPr>
+          <w:color w:val="EE0000"/>
+          <w:sz w:val="12"/>
+          <w:szCs w:val="12"/>
+          <w:u w:val="single"/>
+        </w:rPr>
+        <w:t xml:space="preserve"> heeft alleen de start goed, alles erna is onzin.</w:t>
       </w:r>
     </w:p>
     <w:p>
@@ -1027,32 +1026,19 @@
         <w:rPr>
           <w:sz w:val="12"/>
           <w:szCs w:val="12"/>
-          <w:lang w:val="en-US"/>
         </w:rPr>
       </w:pPr>
-      <w:proofErr w:type="spellStart"/>
-      <w:r>
-        <w:rPr>
-          <w:sz w:val="12"/>
-          <w:szCs w:val="12"/>
-          <w:lang w:val="en-US"/>
-        </w:rPr>
-        <w:t>occupancy_json</w:t>
-      </w:r>
-      <w:proofErr w:type="spellEnd"/>
-      <w:r>
-        <w:rPr>
-          <w:sz w:val="12"/>
-          <w:szCs w:val="12"/>
-          <w:lang w:val="en-US"/>
-        </w:rPr>
-        <w:t xml:space="preserve"> = </w:t>
-      </w:r>
-      <w:r>
-        <w:rPr>
-          <w:sz w:val="12"/>
-          <w:szCs w:val="12"/>
-          <w:lang w:val="en-US"/>
+      <w:r>
+        <w:rPr>
+          <w:sz w:val="12"/>
+          <w:szCs w:val="12"/>
+        </w:rPr>
+        <w:t xml:space="preserve">occupancy_json = </w:t>
+      </w:r>
+      <w:r>
+        <w:rPr>
+          <w:sz w:val="12"/>
+          <w:szCs w:val="12"/>
         </w:rPr>
         <w:t>[</w:t>
       </w:r>
@@ -1060,7 +1046,6 @@
         <w:rPr>
           <w:sz w:val="12"/>
           <w:szCs w:val="12"/>
-          <w:lang w:val="en-US"/>
         </w:rPr>
         <w:t>11.877394636015326, 35.03649635036496, 1.8050541516245486, 15.04424778761062, 3.557312252964427, 21.393034825870647, 30.075187969924812, 15.92356687898089, 7.169811320754717, 33.33333333333333</w:t>
       </w:r>
@@ -1068,7 +1053,6 @@
         <w:rPr>
           <w:sz w:val="12"/>
           <w:szCs w:val="12"/>
-          <w:lang w:val="en-US"/>
         </w:rPr>
         <w:t>]</w:t>
       </w:r>
@@ -1081,23 +1065,13 @@
           <w:u w:val="single"/>
         </w:rPr>
       </w:pPr>
-      <w:proofErr w:type="spellStart"/>
-      <w:r>
-        <w:rPr>
-          <w:sz w:val="12"/>
-          <w:szCs w:val="12"/>
-          <w:lang w:val="en-US"/>
-        </w:rPr>
-        <w:t>occupancy_tokenized_txt</w:t>
-      </w:r>
-      <w:proofErr w:type="spellEnd"/>
-      <w:r>
-        <w:rPr>
-          <w:sz w:val="12"/>
-          <w:szCs w:val="12"/>
-          <w:lang w:val="en-US"/>
-        </w:rPr>
-        <w:t xml:space="preserve"> = </w:t>
+      <w:r>
+        <w:rPr>
+          <w:sz w:val="12"/>
+          <w:szCs w:val="12"/>
+          <w:lang w:val="en-US"/>
+        </w:rPr>
+        <w:t xml:space="preserve">occupancy_tokenized_txt = </w:t>
       </w:r>
       <w:r>
         <w:rPr>
@@ -1200,120 +1174,16 @@
           <w:u w:val="single"/>
           <w:lang w:val="en-US"/>
         </w:rPr>
-        <w:t xml:space="preserve">  </w:t>
-      </w:r>
-      <w:proofErr w:type="spellStart"/>
-      <w:r>
-        <w:rPr>
-          <w:color w:val="EE0000"/>
-          <w:sz w:val="12"/>
-          <w:szCs w:val="12"/>
-          <w:u w:val="single"/>
-          <w:lang w:val="en-US"/>
-        </w:rPr>
-        <w:t>gewoon</w:t>
-      </w:r>
-      <w:proofErr w:type="spellEnd"/>
-      <w:r>
-        <w:rPr>
-          <w:color w:val="EE0000"/>
-          <w:sz w:val="12"/>
-          <w:szCs w:val="12"/>
-          <w:u w:val="single"/>
-          <w:lang w:val="en-US"/>
-        </w:rPr>
-        <w:t xml:space="preserve"> </w:t>
-      </w:r>
-      <w:proofErr w:type="spellStart"/>
-      <w:r>
-        <w:rPr>
-          <w:color w:val="EE0000"/>
-          <w:sz w:val="12"/>
-          <w:szCs w:val="12"/>
-          <w:u w:val="single"/>
-          <w:lang w:val="en-US"/>
-        </w:rPr>
-        <w:t>goed</w:t>
-      </w:r>
-      <w:proofErr w:type="spellEnd"/>
-      <w:r>
-        <w:rPr>
-          <w:color w:val="EE0000"/>
-          <w:sz w:val="12"/>
-          <w:szCs w:val="12"/>
-          <w:u w:val="single"/>
-          <w:lang w:val="en-US"/>
-        </w:rPr>
-        <w:t xml:space="preserve">. </w:t>
-      </w:r>
-      <w:r>
-        <w:rPr>
-          <w:color w:val="EE0000"/>
-          <w:sz w:val="12"/>
-          <w:szCs w:val="12"/>
-          <w:u w:val="single"/>
-        </w:rPr>
-        <w:t xml:space="preserve">Omschrijft een </w:t>
-      </w:r>
-      <w:proofErr w:type="spellStart"/>
-      <w:r>
-        <w:rPr>
-          <w:color w:val="EE0000"/>
-          <w:sz w:val="12"/>
-          <w:szCs w:val="12"/>
-          <w:u w:val="single"/>
-        </w:rPr>
-        <w:t>iteratrief</w:t>
-      </w:r>
-      <w:proofErr w:type="spellEnd"/>
-      <w:r>
-        <w:rPr>
-          <w:color w:val="EE0000"/>
-          <w:sz w:val="12"/>
-          <w:szCs w:val="12"/>
-          <w:u w:val="single"/>
-        </w:rPr>
-        <w:t xml:space="preserve"> </w:t>
-      </w:r>
-      <w:proofErr w:type="spellStart"/>
-      <w:r>
-        <w:rPr>
-          <w:color w:val="EE0000"/>
-          <w:sz w:val="12"/>
-          <w:szCs w:val="12"/>
-          <w:u w:val="single"/>
-        </w:rPr>
-        <w:t>process</w:t>
-      </w:r>
-      <w:proofErr w:type="spellEnd"/>
-      <w:r>
-        <w:rPr>
-          <w:color w:val="EE0000"/>
-          <w:sz w:val="12"/>
-          <w:szCs w:val="12"/>
-          <w:u w:val="single"/>
-        </w:rPr>
-        <w:t xml:space="preserve"> van DFS en </w:t>
-      </w:r>
-      <w:proofErr w:type="spellStart"/>
-      <w:r>
-        <w:rPr>
-          <w:color w:val="EE0000"/>
-          <w:sz w:val="12"/>
-          <w:szCs w:val="12"/>
-          <w:u w:val="single"/>
-        </w:rPr>
-        <w:t>self</w:t>
-      </w:r>
-      <w:proofErr w:type="spellEnd"/>
-      <w:r>
-        <w:rPr>
-          <w:color w:val="EE0000"/>
-          <w:sz w:val="12"/>
-          <w:szCs w:val="12"/>
-          <w:u w:val="single"/>
-        </w:rPr>
-        <w:t xml:space="preserve">-checks. </w:t>
+        <w:t xml:space="preserve">  gewoon goed. </w:t>
+      </w:r>
+      <w:r>
+        <w:rPr>
+          <w:color w:val="EE0000"/>
+          <w:sz w:val="12"/>
+          <w:szCs w:val="12"/>
+          <w:u w:val="single"/>
+        </w:rPr>
+        <w:t xml:space="preserve">Omschrijft een iteratrief proces van DFS en self-checks. </w:t>
       </w:r>
       <w:r>
         <w:rPr>
@@ -1324,6 +1194,15 @@
         </w:rPr>
         <w:br/>
         <w:t>Run 4:</w:t>
+      </w:r>
+      <w:r>
+        <w:rPr>
+          <w:color w:val="EE0000"/>
+          <w:sz w:val="12"/>
+          <w:szCs w:val="12"/>
+          <w:u w:val="single"/>
+        </w:rPr>
+        <w:t xml:space="preserve"> gewoon goed. Omschrijft een iteratief proces. Start eerst bij begin en probeert op te lossen. Start dan bij eind en probeert andersom op te lossen om zo verschillende paden aan elkaar te maken.</w:t>
       </w:r>
       <w:r>
         <w:rPr>
@@ -1397,23 +1276,7 @@
           <w:sz w:val="12"/>
           <w:szCs w:val="12"/>
         </w:rPr>
-        <w:t xml:space="preserve">Run 1: begin/eind fout </w:t>
-      </w:r>
-      <w:proofErr w:type="spellStart"/>
-      <w:r>
-        <w:rPr>
-          <w:sz w:val="12"/>
-          <w:szCs w:val="12"/>
-        </w:rPr>
-        <w:t>geidentificeerd</w:t>
-      </w:r>
-      <w:proofErr w:type="spellEnd"/>
-      <w:r>
-        <w:rPr>
-          <w:sz w:val="12"/>
-          <w:szCs w:val="12"/>
-        </w:rPr>
-        <w:t>. Loopt in allemaal trappetjes maar het is best wel random.</w:t>
+        <w:t>Run 1: begin/eind fout geidentificeerd. Loopt in allemaal trappetjes maar het is best wel random.</w:t>
       </w:r>
       <w:r>
         <w:rPr>
@@ -1428,23 +1291,7 @@
           <w:sz w:val="12"/>
           <w:szCs w:val="12"/>
         </w:rPr>
-        <w:t xml:space="preserve"> begin/eind fout </w:t>
-      </w:r>
-      <w:proofErr w:type="spellStart"/>
-      <w:r>
-        <w:rPr>
-          <w:sz w:val="12"/>
-          <w:szCs w:val="12"/>
-        </w:rPr>
-        <w:t>geidentificeerd</w:t>
-      </w:r>
-      <w:proofErr w:type="spellEnd"/>
-      <w:r>
-        <w:rPr>
-          <w:sz w:val="12"/>
-          <w:szCs w:val="12"/>
-        </w:rPr>
-        <w:t>. Loopt in allemaal trappetjes maar het is best wel random.</w:t>
+        <w:t xml:space="preserve"> begin/eind fout geidentificeerd. Loopt in allemaal trappetjes maar het is best wel random.</w:t>
       </w:r>
       <w:r>
         <w:rPr>
@@ -1452,39 +1299,7 @@
           <w:szCs w:val="12"/>
         </w:rPr>
         <w:br/>
-        <w:t xml:space="preserve">Run 3: begin/eind fout </w:t>
-      </w:r>
-      <w:proofErr w:type="spellStart"/>
-      <w:r>
-        <w:rPr>
-          <w:sz w:val="12"/>
-          <w:szCs w:val="12"/>
-        </w:rPr>
-        <w:t>geidentificeerd</w:t>
-      </w:r>
-      <w:proofErr w:type="spellEnd"/>
-      <w:r>
-        <w:rPr>
-          <w:sz w:val="12"/>
-          <w:szCs w:val="12"/>
-        </w:rPr>
-        <w:t xml:space="preserve">. Loopt in allemaal trappetjes maar het is best wel random. Zegt dat 14,13 eind is, maar loopt </w:t>
-      </w:r>
-      <w:proofErr w:type="spellStart"/>
-      <w:r>
-        <w:rPr>
-          <w:sz w:val="12"/>
-          <w:szCs w:val="12"/>
-        </w:rPr>
-        <w:t>tm</w:t>
-      </w:r>
-      <w:proofErr w:type="spellEnd"/>
-      <w:r>
-        <w:rPr>
-          <w:sz w:val="12"/>
-          <w:szCs w:val="12"/>
-        </w:rPr>
-        <w:t xml:space="preserve"> 14,14 (via 14,13).</w:t>
+        <w:t>Run 3: begin/eind fout geidentificeerd. Loopt in allemaal trappetjes maar het is best wel random. Zegt dat 14,13 eind is, maar loopt tm 14,14 (via 14,13).</w:t>
       </w:r>
     </w:p>
     <w:p>
@@ -1502,21 +1317,12 @@
           <w:szCs w:val="12"/>
         </w:rPr>
       </w:pPr>
-      <w:proofErr w:type="spellStart"/>
-      <w:r>
-        <w:rPr>
-          <w:sz w:val="12"/>
-          <w:szCs w:val="12"/>
-        </w:rPr>
-        <w:t>Json</w:t>
-      </w:r>
-      <w:proofErr w:type="spellEnd"/>
-      <w:r>
-        <w:rPr>
-          <w:sz w:val="12"/>
-          <w:szCs w:val="12"/>
-        </w:rPr>
-        <w:t xml:space="preserve"> line: </w:t>
+      <w:r>
+        <w:rPr>
+          <w:sz w:val="12"/>
+          <w:szCs w:val="12"/>
+        </w:rPr>
+        <w:t xml:space="preserve">Json line: </w:t>
       </w:r>
     </w:p>
     <w:p>
@@ -1531,23 +1337,7 @@
           <w:sz w:val="12"/>
           <w:szCs w:val="12"/>
         </w:rPr>
-        <w:t xml:space="preserve">Run 1: doet het begin goed, en pakt een punt ergens rond het eind als </w:t>
-      </w:r>
-      <w:proofErr w:type="spellStart"/>
-      <w:r>
-        <w:rPr>
-          <w:sz w:val="12"/>
-          <w:szCs w:val="12"/>
-        </w:rPr>
-        <w:t>waypoint</w:t>
-      </w:r>
-      <w:proofErr w:type="spellEnd"/>
-      <w:r>
-        <w:rPr>
-          <w:sz w:val="12"/>
-          <w:szCs w:val="12"/>
-        </w:rPr>
-        <w:t>. Gaat mis in proberen daar op uit te komen.</w:t>
+        <w:t>Run 1: doet het begin goed, en pakt een punt ergens rond het eind als waypoint. Gaat mis in proberen daar op uit te komen.</w:t>
       </w:r>
       <w:r>
         <w:rPr>
@@ -1563,23 +1353,7 @@
           <w:szCs w:val="12"/>
         </w:rPr>
         <w:br/>
-        <w:t xml:space="preserve">Run 3: </w:t>
-      </w:r>
-      <w:proofErr w:type="spellStart"/>
-      <w:r>
-        <w:rPr>
-          <w:sz w:val="12"/>
-          <w:szCs w:val="12"/>
-        </w:rPr>
-        <w:t>reasoning</w:t>
-      </w:r>
-      <w:proofErr w:type="spellEnd"/>
-      <w:r>
-        <w:rPr>
-          <w:sz w:val="12"/>
-          <w:szCs w:val="12"/>
-        </w:rPr>
-        <w:t xml:space="preserve"> gaat goed maar</w:t>
+        <w:t>Run 3: reasoning gaat goed maar</w:t>
       </w:r>
       <w:r>
         <w:rPr>
@@ -1593,23 +1367,7 @@
           <w:sz w:val="12"/>
           <w:szCs w:val="12"/>
         </w:rPr>
-        <w:t xml:space="preserve"> stopt plots. Loopt in eindantwoord een ander pad dan omschreven in </w:t>
-      </w:r>
-      <w:proofErr w:type="spellStart"/>
-      <w:r>
-        <w:rPr>
-          <w:sz w:val="12"/>
-          <w:szCs w:val="12"/>
-        </w:rPr>
-        <w:t>reasoning</w:t>
-      </w:r>
-      <w:proofErr w:type="spellEnd"/>
-      <w:r>
-        <w:rPr>
-          <w:sz w:val="12"/>
-          <w:szCs w:val="12"/>
-        </w:rPr>
-        <w:t xml:space="preserve">. </w:t>
+        <w:t xml:space="preserve"> stopt plots. Loopt in eindantwoord een ander pad dan omschreven in reasoning. </w:t>
       </w:r>
     </w:p>
     <w:p>
@@ -1627,23 +1385,13 @@
           <w:szCs w:val="12"/>
         </w:rPr>
       </w:pPr>
-      <w:proofErr w:type="spellStart"/>
-      <w:r>
-        <w:rPr>
-          <w:sz w:val="12"/>
-          <w:szCs w:val="12"/>
-          <w:lang w:val="en-US"/>
-        </w:rPr>
-        <w:t>Adjaceny</w:t>
-      </w:r>
-      <w:proofErr w:type="spellEnd"/>
-      <w:r>
-        <w:rPr>
-          <w:sz w:val="12"/>
-          <w:szCs w:val="12"/>
-          <w:lang w:val="en-US"/>
-        </w:rPr>
-        <w:t xml:space="preserve"> JSON line:</w:t>
+      <w:r>
+        <w:rPr>
+          <w:sz w:val="12"/>
+          <w:szCs w:val="12"/>
+          <w:lang w:val="en-US"/>
+        </w:rPr>
+        <w:t>Adjaceny JSON line:</w:t>
       </w:r>
       <w:r>
         <w:rPr>
@@ -1652,25 +1400,7 @@
           <w:lang w:val="en-US"/>
         </w:rPr>
         <w:br/>
-        <w:t xml:space="preserve">Run 1: </w:t>
-      </w:r>
-      <w:proofErr w:type="spellStart"/>
-      <w:r>
-        <w:rPr>
-          <w:sz w:val="12"/>
-          <w:szCs w:val="12"/>
-          <w:lang w:val="en-US"/>
-        </w:rPr>
-        <w:t>doet</w:t>
-      </w:r>
-      <w:proofErr w:type="spellEnd"/>
-      <w:r>
-        <w:rPr>
-          <w:sz w:val="12"/>
-          <w:szCs w:val="12"/>
-          <w:lang w:val="en-US"/>
-        </w:rPr>
-        <w:t xml:space="preserve"> BFS ‘mentally’</w:t>
+        <w:t>Run 1: doet BFS ‘mentally’</w:t>
       </w:r>
       <w:r>
         <w:rPr>
@@ -1680,21 +1410,12 @@
         </w:rPr>
         <w:t xml:space="preserve">. </w:t>
       </w:r>
-      <w:proofErr w:type="spellStart"/>
-      <w:r>
-        <w:rPr>
-          <w:sz w:val="12"/>
-          <w:szCs w:val="12"/>
-        </w:rPr>
-        <w:t>Reasoning</w:t>
-      </w:r>
-      <w:proofErr w:type="spellEnd"/>
-      <w:r>
-        <w:rPr>
-          <w:sz w:val="12"/>
-          <w:szCs w:val="12"/>
-        </w:rPr>
-        <w:t xml:space="preserve"> summary stopt plots.</w:t>
+      <w:r>
+        <w:rPr>
+          <w:sz w:val="12"/>
+          <w:szCs w:val="12"/>
+        </w:rPr>
+        <w:t>Reasoning summary stopt plots.</w:t>
       </w:r>
       <w:r>
         <w:rPr>
@@ -1732,38 +1453,7 @@
           <w:szCs w:val="12"/>
         </w:rPr>
         <w:br/>
-      </w:r>
-      <w:proofErr w:type="spellStart"/>
-      <w:r>
-        <w:rPr>
-          <w:sz w:val="12"/>
-          <w:szCs w:val="12"/>
-        </w:rPr>
-        <w:t>Adjacency</w:t>
-      </w:r>
-      <w:proofErr w:type="spellEnd"/>
-      <w:r>
-        <w:rPr>
-          <w:sz w:val="12"/>
-          <w:szCs w:val="12"/>
-        </w:rPr>
-        <w:t xml:space="preserve"> </w:t>
-      </w:r>
-      <w:proofErr w:type="spellStart"/>
-      <w:r>
-        <w:rPr>
-          <w:sz w:val="12"/>
-          <w:szCs w:val="12"/>
-        </w:rPr>
-        <w:t>text</w:t>
-      </w:r>
-      <w:proofErr w:type="spellEnd"/>
-      <w:r>
-        <w:rPr>
-          <w:sz w:val="12"/>
-          <w:szCs w:val="12"/>
-        </w:rPr>
-        <w:t xml:space="preserve"> line: </w:t>
+        <w:t xml:space="preserve">Adjacency text line: </w:t>
       </w:r>
       <w:r>
         <w:rPr>
@@ -1796,7 +1486,7 @@
                     <pic:cNvPicPr/>
                   </pic:nvPicPr>
                   <pic:blipFill>
-                    <a:blip r:embed="rId8"/>
+                    <a:blip r:embed="rId9"/>
                     <a:stretch>
                       <a:fillRect/>
                     </a:stretch>
@@ -1853,22 +1543,13 @@
         </w:rPr>
         <w:br/>
       </w:r>
-      <w:proofErr w:type="spellStart"/>
       <w:r>
         <w:rPr>
           <w:sz w:val="12"/>
           <w:szCs w:val="12"/>
         </w:rPr>
         <w:lastRenderedPageBreak/>
-        <w:t>Tokenized</w:t>
-      </w:r>
-      <w:proofErr w:type="spellEnd"/>
-      <w:r>
-        <w:rPr>
-          <w:sz w:val="12"/>
-          <w:szCs w:val="12"/>
-        </w:rPr>
-        <w:t xml:space="preserve"> line: </w:t>
+        <w:t xml:space="preserve">Tokenized line: </w:t>
       </w:r>
       <w:r>
         <w:rPr>

</xml_diff>

<commit_message>
finished reasoning tests 15x15 1-10
</commit_message>
<xml_diff>
--- a/15x15_score_investigation.docx
+++ b/15x15_score_investigation.docx
@@ -500,6 +500,7 @@
           <w:sz w:val="12"/>
           <w:szCs w:val="12"/>
           <w:u w:val="single"/>
+          <w:lang w:val="en-US"/>
         </w:rPr>
       </w:pPr>
       <w:r>
@@ -595,7 +596,17 @@
           <w:szCs w:val="12"/>
           <w:u w:val="single"/>
         </w:rPr>
-        <w:t>at zelfs een ronde backtracking zien in zijn antwoord!!! Maar lost hem helaas niet op</w:t>
+        <w:t xml:space="preserve">at zelfs een ronde backtracking zien in zijn antwoord!!! </w:t>
+      </w:r>
+      <w:r>
+        <w:rPr>
+          <w:color w:val="EE0000"/>
+          <w:sz w:val="12"/>
+          <w:szCs w:val="12"/>
+          <w:u w:val="single"/>
+          <w:lang w:val="en-US"/>
+        </w:rPr>
+        <w:t>Maar lost hem helaas niet op</w:t>
       </w:r>
       <w:r>
         <w:rPr>
@@ -646,12 +657,14 @@
         <w:rPr>
           <w:sz w:val="12"/>
           <w:szCs w:val="12"/>
+          <w:lang w:val="en-US"/>
         </w:rPr>
       </w:pPr>
       <w:r>
         <w:rPr>
           <w:sz w:val="12"/>
           <w:szCs w:val="12"/>
+          <w:lang w:val="en-US"/>
         </w:rPr>
         <w:t xml:space="preserve">occupancy_adj_txt = </w:t>
       </w:r>
@@ -659,6 +672,7 @@
         <w:rPr>
           <w:sz w:val="12"/>
           <w:szCs w:val="12"/>
+          <w:lang w:val="en-US"/>
         </w:rPr>
         <w:t>[</w:t>
       </w:r>
@@ -666,6 +680,7 @@
         <w:rPr>
           <w:sz w:val="12"/>
           <w:szCs w:val="12"/>
+          <w:lang w:val="en-US"/>
         </w:rPr>
         <w:t>34.099616858237546, 15.328467153284672, 24.90974729241877, 29.20353982300885, 12.25296442687747, 42.28855721393035, 3.7593984962406015, 57.961783439490446, 46.41509433962264, 95.6989247311828</w:t>
       </w:r>
@@ -673,6 +688,7 @@
         <w:rPr>
           <w:sz w:val="12"/>
           <w:szCs w:val="12"/>
+          <w:lang w:val="en-US"/>
         </w:rPr>
         <w:t>]</w:t>
       </w:r>
@@ -682,7 +698,6 @@
         <w:rPr>
           <w:sz w:val="12"/>
           <w:szCs w:val="12"/>
-          <w:lang w:val="en-US"/>
         </w:rPr>
       </w:pPr>
       <w:r>
@@ -725,6 +740,72 @@
           <w:lang w:val="en-US"/>
         </w:rPr>
         <w:t>]</w:t>
+      </w:r>
+      <w:r>
+        <w:rPr>
+          <w:sz w:val="12"/>
+          <w:szCs w:val="12"/>
+          <w:lang w:val="en-US"/>
+        </w:rPr>
+        <w:br/>
+      </w:r>
+      <w:r>
+        <w:rPr>
+          <w:color w:val="EE0000"/>
+          <w:sz w:val="12"/>
+          <w:szCs w:val="12"/>
+          <w:u w:val="single"/>
+          <w:lang w:val="en-US"/>
+        </w:rPr>
+        <w:t>“</w:t>
+      </w:r>
+      <w:r>
+        <w:rPr>
+          <w:color w:val="EE0000"/>
+          <w:sz w:val="12"/>
+          <w:szCs w:val="12"/>
+          <w:u w:val="single"/>
+          <w:lang w:val="en-US"/>
+        </w:rPr>
+        <w:t>At first, I made some missteps. I kept misreading the grid – thinking I was at (0,0) or (0,1) when I was actually at (1,1). Also, I initially mistook spaces for walls, which threw me off. After re-reading the maze carefully and realizing my errors, I started fresh.</w:t>
+      </w:r>
+      <w:r>
+        <w:rPr>
+          <w:color w:val="EE0000"/>
+          <w:sz w:val="12"/>
+          <w:szCs w:val="12"/>
+          <w:u w:val="single"/>
+          <w:lang w:val="en-US"/>
+        </w:rPr>
+        <w:t>”</w:t>
+      </w:r>
+      <w:r>
+        <w:rPr>
+          <w:color w:val="EE0000"/>
+          <w:sz w:val="12"/>
+          <w:szCs w:val="12"/>
+          <w:u w:val="single"/>
+          <w:lang w:val="en-US"/>
+        </w:rPr>
+        <w:t xml:space="preserve"> </w:t>
+      </w:r>
+      <w:r>
+        <w:rPr>
+          <w:color w:val="EE0000"/>
+          <w:sz w:val="12"/>
+          <w:szCs w:val="12"/>
+          <w:u w:val="single"/>
+        </w:rPr>
+        <w:t>Lijkt wel intentioneel het begin goed te doen, maar b</w:t>
+      </w:r>
+      <w:r>
+        <w:rPr>
+          <w:color w:val="EE0000"/>
+          <w:sz w:val="12"/>
+          <w:szCs w:val="12"/>
+          <w:u w:val="single"/>
+        </w:rPr>
+        <w:t xml:space="preserve">akt er weinig van. Omschrijft dat hij probeert vanaf begin en eind naar elkaar toe te werken, en de laatste 3 stappen zijn ook correct. Alles daartussen is fout. </w:t>
       </w:r>
     </w:p>
     <w:p>
@@ -1223,6 +1304,25 @@
         </w:rPr>
         <w:t xml:space="preserve"> </w:t>
       </w:r>
+      <w:r>
+        <w:rPr>
+          <w:color w:val="EE0000"/>
+          <w:sz w:val="12"/>
+          <w:szCs w:val="12"/>
+          <w:u w:val="single"/>
+        </w:rPr>
+        <w:t xml:space="preserve">goed. Omschrijft een iteratief proces waar eigen fouten worden opgelost </w:t>
+      </w:r>
+      <w:r>
+        <w:rPr>
+          <w:color w:val="EE0000"/>
+          <w:sz w:val="12"/>
+          <w:szCs w:val="12"/>
+          <w:highlight w:val="cyan"/>
+          <w:u w:val="single"/>
+        </w:rPr>
+        <w:t>-&gt;&gt; wat is dan de reden dat hij bij dit soort momenten niet met de vinger gaat wijzen??</w:t>
+      </w:r>
     </w:p>
     <w:p>
       <w:pPr>
@@ -1625,6 +1725,7 @@
           <w:bCs/>
           <w:sz w:val="12"/>
           <w:szCs w:val="12"/>
+          <w:lang w:val="en-US"/>
         </w:rPr>
       </w:pPr>
       <w:r>
@@ -1633,6 +1734,7 @@
           <w:bCs/>
           <w:sz w:val="12"/>
           <w:szCs w:val="12"/>
+          <w:lang w:val="en-US"/>
         </w:rPr>
         <w:t xml:space="preserve">R </w:t>
       </w:r>
@@ -1642,8 +1744,2054 @@
           <w:bCs/>
           <w:sz w:val="12"/>
           <w:szCs w:val="12"/>
+          <w:lang w:val="en-US"/>
         </w:rPr>
         <w:t>– Allo</w:t>
+      </w:r>
+    </w:p>
+    <w:p>
+      <w:pPr>
+        <w:rPr>
+          <w:color w:val="EE0000"/>
+          <w:sz w:val="12"/>
+          <w:szCs w:val="12"/>
+          <w:u w:val="single"/>
+        </w:rPr>
+      </w:pPr>
+      <w:r>
+        <w:rPr>
+          <w:sz w:val="12"/>
+          <w:szCs w:val="12"/>
+          <w:lang w:val="en-US"/>
+        </w:rPr>
+        <w:t xml:space="preserve">line_adj_json = </w:t>
+      </w:r>
+      <w:r>
+        <w:rPr>
+          <w:color w:val="EE0000"/>
+          <w:sz w:val="12"/>
+          <w:szCs w:val="12"/>
+          <w:lang w:val="en-US"/>
+        </w:rPr>
+        <w:t>[</w:t>
+      </w:r>
+      <w:r>
+        <w:rPr>
+          <w:color w:val="EE0000"/>
+          <w:sz w:val="12"/>
+          <w:szCs w:val="12"/>
+          <w:lang w:val="en-US"/>
+        </w:rPr>
+        <w:t>46.92307692307692</w:t>
+      </w:r>
+      <w:r>
+        <w:rPr>
+          <w:sz w:val="12"/>
+          <w:szCs w:val="12"/>
+          <w:lang w:val="en-US"/>
+        </w:rPr>
+        <w:t>, 100.0, 100.0, 100.0, 100.0, 100.0, 100.0, 100.0, 100.0, 100.0</w:t>
+      </w:r>
+      <w:r>
+        <w:rPr>
+          <w:sz w:val="12"/>
+          <w:szCs w:val="12"/>
+          <w:lang w:val="en-US"/>
+        </w:rPr>
+        <w:t>]</w:t>
+      </w:r>
+      <w:r>
+        <w:rPr>
+          <w:sz w:val="12"/>
+          <w:szCs w:val="12"/>
+          <w:lang w:val="en-US"/>
+        </w:rPr>
+        <w:br/>
+      </w:r>
+      <w:r>
+        <w:rPr>
+          <w:color w:val="EE0000"/>
+          <w:sz w:val="12"/>
+          <w:szCs w:val="12"/>
+          <w:u w:val="single"/>
+          <w:lang w:val="en-US"/>
+        </w:rPr>
+        <w:t>Run 1: “First, I'll take that JSON data and turn it into something usable. An adjacency list is what I need. Each node (a coordinate on the grid) will point to its neighbors. I'll convert it to a dictionary for easy lookups: `(row, col) -&gt; [[neighbor_row, neighbor_col], ...]`.”</w:t>
+      </w:r>
+      <w:r>
+        <w:rPr>
+          <w:color w:val="EE0000"/>
+          <w:sz w:val="12"/>
+          <w:szCs w:val="12"/>
+          <w:u w:val="single"/>
+          <w:lang w:val="en-US"/>
+        </w:rPr>
+        <w:t xml:space="preserve"> “</w:t>
+      </w:r>
+      <w:r>
+        <w:rPr>
+          <w:color w:val="EE0000"/>
+          <w:sz w:val="12"/>
+          <w:szCs w:val="12"/>
+          <w:u w:val="single"/>
+          <w:lang w:val="en-US"/>
+        </w:rPr>
+        <w:t>I'll read the data from JSON, create a graph dictionary where the key is a tuple for the node coordinate and the value is a list of its neighbor coordinates.</w:t>
+      </w:r>
+      <w:r>
+        <w:rPr>
+          <w:color w:val="EE0000"/>
+          <w:sz w:val="12"/>
+          <w:szCs w:val="12"/>
+          <w:u w:val="single"/>
+          <w:lang w:val="en-US"/>
+        </w:rPr>
+        <w:t xml:space="preserve">” </w:t>
+      </w:r>
+      <w:r>
+        <w:rPr>
+          <w:color w:val="EE0000"/>
+          <w:sz w:val="12"/>
+          <w:szCs w:val="12"/>
+          <w:u w:val="single"/>
+        </w:rPr>
+        <w:t>Omschrijft een algoritme, ik vermoed dat dit met code is gedaan maar weet het niet zeker</w:t>
+      </w:r>
+      <w:r>
+        <w:rPr>
+          <w:color w:val="EE0000"/>
+          <w:sz w:val="12"/>
+          <w:szCs w:val="12"/>
+          <w:u w:val="single"/>
+        </w:rPr>
+        <w:t>.</w:t>
+      </w:r>
+      <w:r>
+        <w:rPr>
+          <w:color w:val="EE0000"/>
+          <w:sz w:val="12"/>
+          <w:szCs w:val="12"/>
+          <w:u w:val="single"/>
+        </w:rPr>
+        <w:t xml:space="preserve"> </w:t>
+      </w:r>
+      <w:r>
+        <w:rPr>
+          <w:color w:val="EE0000"/>
+          <w:sz w:val="12"/>
+          <w:szCs w:val="12"/>
+          <w:u w:val="single"/>
+        </w:rPr>
+        <w:t xml:space="preserve">begint supergoed, tot de eerste rule-break dan barst het los en gaat hij kriskras rondlopen. Eindigt buiten het vierkant. </w:t>
+      </w:r>
+      <w:r>
+        <w:rPr>
+          <w:color w:val="EE0000"/>
+          <w:sz w:val="12"/>
+          <w:szCs w:val="12"/>
+          <w:u w:val="single"/>
+        </w:rPr>
+        <w:drawing>
+          <wp:inline distT="0" distB="0" distL="0" distR="0" wp14:anchorId="46E33082" wp14:editId="14C8D388">
+            <wp:extent cx="130628" cy="127000"/>
+            <wp:effectExtent l="0" t="0" r="3175" b="6350"/>
+            <wp:docPr id="32378135" name="Picture 1" descr="A maze with a blue line&#10;&#10;AI-generated content may be incorrect."/>
+            <wp:cNvGraphicFramePr>
+              <a:graphicFrameLocks xmlns:a="http://schemas.openxmlformats.org/drawingml/2006/main" noChangeAspect="1"/>
+            </wp:cNvGraphicFramePr>
+            <a:graphic xmlns:a="http://schemas.openxmlformats.org/drawingml/2006/main">
+              <a:graphicData uri="http://schemas.openxmlformats.org/drawingml/2006/picture">
+                <pic:pic xmlns:pic="http://schemas.openxmlformats.org/drawingml/2006/picture">
+                  <pic:nvPicPr>
+                    <pic:cNvPr id="32378135" name="Picture 1" descr="A maze with a blue line&#10;&#10;AI-generated content may be incorrect."/>
+                    <pic:cNvPicPr/>
+                  </pic:nvPicPr>
+                  <pic:blipFill>
+                    <a:blip r:embed="rId10"/>
+                    <a:stretch>
+                      <a:fillRect/>
+                    </a:stretch>
+                  </pic:blipFill>
+                  <pic:spPr>
+                    <a:xfrm>
+                      <a:off x="0" y="0"/>
+                      <a:ext cx="140526" cy="136623"/>
+                    </a:xfrm>
+                    <a:prstGeom prst="rect">
+                      <a:avLst/>
+                    </a:prstGeom>
+                  </pic:spPr>
+                </pic:pic>
+              </a:graphicData>
+            </a:graphic>
+          </wp:inline>
+        </w:drawing>
+      </w:r>
+    </w:p>
+    <w:p>
+      <w:pPr>
+        <w:rPr>
+          <w:color w:val="EE0000"/>
+          <w:sz w:val="12"/>
+          <w:szCs w:val="12"/>
+          <w:u w:val="single"/>
+        </w:rPr>
+      </w:pPr>
+      <w:r>
+        <w:rPr>
+          <w:sz w:val="12"/>
+          <w:szCs w:val="12"/>
+        </w:rPr>
+        <w:t xml:space="preserve">line_adj_txt = </w:t>
+      </w:r>
+      <w:r>
+        <w:rPr>
+          <w:sz w:val="12"/>
+          <w:szCs w:val="12"/>
+        </w:rPr>
+        <w:t>[</w:t>
+      </w:r>
+      <w:r>
+        <w:rPr>
+          <w:color w:val="EE0000"/>
+          <w:sz w:val="12"/>
+          <w:szCs w:val="12"/>
+        </w:rPr>
+        <w:t>7.6923076923076925</w:t>
+      </w:r>
+      <w:r>
+        <w:rPr>
+          <w:sz w:val="12"/>
+          <w:szCs w:val="12"/>
+        </w:rPr>
+        <w:t xml:space="preserve">, 100.0, </w:t>
+      </w:r>
+      <w:r>
+        <w:rPr>
+          <w:color w:val="EE0000"/>
+          <w:sz w:val="12"/>
+          <w:szCs w:val="12"/>
+        </w:rPr>
+        <w:t>53.62318840579711</w:t>
+      </w:r>
+      <w:r>
+        <w:rPr>
+          <w:sz w:val="12"/>
+          <w:szCs w:val="12"/>
+        </w:rPr>
+        <w:t xml:space="preserve">, 100.0, </w:t>
+      </w:r>
+      <w:r>
+        <w:rPr>
+          <w:color w:val="EE0000"/>
+          <w:sz w:val="12"/>
+          <w:szCs w:val="12"/>
+        </w:rPr>
+        <w:t>0.7936507936507936</w:t>
+      </w:r>
+      <w:r>
+        <w:rPr>
+          <w:sz w:val="12"/>
+          <w:szCs w:val="12"/>
+        </w:rPr>
+        <w:t xml:space="preserve">, </w:t>
+      </w:r>
+      <w:r>
+        <w:rPr>
+          <w:color w:val="EE0000"/>
+          <w:sz w:val="12"/>
+          <w:szCs w:val="12"/>
+        </w:rPr>
+        <w:t>98.0</w:t>
+      </w:r>
+      <w:r>
+        <w:rPr>
+          <w:sz w:val="12"/>
+          <w:szCs w:val="12"/>
+        </w:rPr>
+        <w:t xml:space="preserve">, 100.0, </w:t>
+      </w:r>
+      <w:r>
+        <w:rPr>
+          <w:color w:val="EE0000"/>
+          <w:sz w:val="12"/>
+          <w:szCs w:val="12"/>
+        </w:rPr>
+        <w:t>2.564102564102564, 58.333333333333336,</w:t>
+      </w:r>
+      <w:r>
+        <w:rPr>
+          <w:sz w:val="12"/>
+          <w:szCs w:val="12"/>
+        </w:rPr>
+        <w:t xml:space="preserve"> 100.0</w:t>
+      </w:r>
+      <w:r>
+        <w:rPr>
+          <w:sz w:val="12"/>
+          <w:szCs w:val="12"/>
+        </w:rPr>
+        <w:t>]</w:t>
+      </w:r>
+      <w:r>
+        <w:rPr>
+          <w:sz w:val="12"/>
+          <w:szCs w:val="12"/>
+        </w:rPr>
+        <w:br/>
+      </w:r>
+      <w:r>
+        <w:rPr>
+          <w:color w:val="EE0000"/>
+          <w:sz w:val="12"/>
+          <w:szCs w:val="12"/>
+          <w:u w:val="single"/>
+        </w:rPr>
+        <w:t>Run 1:</w:t>
+      </w:r>
+      <w:r>
+        <w:rPr>
+          <w:color w:val="EE0000"/>
+          <w:sz w:val="12"/>
+          <w:szCs w:val="12"/>
+          <w:u w:val="single"/>
+        </w:rPr>
+        <w:t xml:space="preserve">  </w:t>
+      </w:r>
+      <w:r>
+        <w:rPr>
+          <w:color w:val="EE0000"/>
+          <w:sz w:val="12"/>
+          <w:szCs w:val="12"/>
+          <w:u w:val="single"/>
+        </w:rPr>
+        <w:t>Omschrijft een algoritme, ik vermoed dat dit met code is gedaan maar weet het niet zeker.</w:t>
+      </w:r>
+      <w:r>
+        <w:rPr>
+          <w:color w:val="EE0000"/>
+          <w:sz w:val="12"/>
+          <w:szCs w:val="12"/>
+          <w:u w:val="single"/>
+        </w:rPr>
+        <w:t xml:space="preserve"> </w:t>
+      </w:r>
+      <w:r>
+        <w:rPr>
+          <w:color w:val="EE0000"/>
+          <w:sz w:val="12"/>
+          <w:szCs w:val="12"/>
+          <w:u w:val="single"/>
+          <w:lang w:val="en-US"/>
+        </w:rPr>
+        <w:t xml:space="preserve">Geen coherent verhaal. Pad is helemaal niet goed. </w:t>
+      </w:r>
+      <w:r>
+        <w:rPr>
+          <w:color w:val="EE0000"/>
+          <w:sz w:val="12"/>
+          <w:szCs w:val="12"/>
+          <w:u w:val="single"/>
+          <w:lang w:val="en-US"/>
+        </w:rPr>
+        <w:drawing>
+          <wp:inline distT="0" distB="0" distL="0" distR="0" wp14:anchorId="60DCE780" wp14:editId="2917A0FE">
+            <wp:extent cx="94604" cy="95250"/>
+            <wp:effectExtent l="0" t="0" r="1270" b="0"/>
+            <wp:docPr id="418493284" name="Picture 1" descr="A maze with a blue line&#10;&#10;AI-generated content may be incorrect."/>
+            <wp:cNvGraphicFramePr>
+              <a:graphicFrameLocks xmlns:a="http://schemas.openxmlformats.org/drawingml/2006/main" noChangeAspect="1"/>
+            </wp:cNvGraphicFramePr>
+            <a:graphic xmlns:a="http://schemas.openxmlformats.org/drawingml/2006/main">
+              <a:graphicData uri="http://schemas.openxmlformats.org/drawingml/2006/picture">
+                <pic:pic xmlns:pic="http://schemas.openxmlformats.org/drawingml/2006/picture">
+                  <pic:nvPicPr>
+                    <pic:cNvPr id="418493284" name="Picture 1" descr="A maze with a blue line&#10;&#10;AI-generated content may be incorrect."/>
+                    <pic:cNvPicPr/>
+                  </pic:nvPicPr>
+                  <pic:blipFill>
+                    <a:blip r:embed="rId11"/>
+                    <a:stretch>
+                      <a:fillRect/>
+                    </a:stretch>
+                  </pic:blipFill>
+                  <pic:spPr>
+                    <a:xfrm flipH="1">
+                      <a:off x="0" y="0"/>
+                      <a:ext cx="106852" cy="107581"/>
+                    </a:xfrm>
+                    <a:prstGeom prst="rect">
+                      <a:avLst/>
+                    </a:prstGeom>
+                  </pic:spPr>
+                </pic:pic>
+              </a:graphicData>
+            </a:graphic>
+          </wp:inline>
+        </w:drawing>
+      </w:r>
+      <w:r>
+        <w:rPr>
+          <w:color w:val="EE0000"/>
+          <w:sz w:val="12"/>
+          <w:szCs w:val="12"/>
+          <w:u w:val="single"/>
+          <w:lang w:val="en-US"/>
+        </w:rPr>
+        <w:br/>
+        <w:t>Run 3:</w:t>
+      </w:r>
+      <w:r>
+        <w:rPr>
+          <w:color w:val="EE0000"/>
+          <w:sz w:val="12"/>
+          <w:szCs w:val="12"/>
+          <w:u w:val="single"/>
+          <w:lang w:val="en-US"/>
+        </w:rPr>
+        <w:t xml:space="preserve"> “</w:t>
+      </w:r>
+      <w:r>
+        <w:rPr>
+          <w:color w:val="EE0000"/>
+          <w:sz w:val="12"/>
+          <w:szCs w:val="12"/>
+          <w:u w:val="single"/>
+          <w:lang w:val="en-US"/>
+        </w:rPr>
+        <w:t>performing a depth-first search while trying to move "down and right" as much as possible to reach the target quicke</w:t>
+      </w:r>
+      <w:r>
+        <w:rPr>
+          <w:color w:val="EE0000"/>
+          <w:sz w:val="12"/>
+          <w:szCs w:val="12"/>
+          <w:u w:val="single"/>
+          <w:lang w:val="en-US"/>
+        </w:rPr>
+        <w:t>r”.</w:t>
+      </w:r>
+      <w:r>
+        <w:rPr>
+          <w:color w:val="EE0000"/>
+          <w:sz w:val="12"/>
+          <w:szCs w:val="12"/>
+          <w:u w:val="single"/>
+          <w:lang w:val="en-US"/>
+        </w:rPr>
+        <w:t xml:space="preserve"> </w:t>
+      </w:r>
+      <w:r>
+        <w:rPr>
+          <w:color w:val="EE0000"/>
+          <w:sz w:val="12"/>
+          <w:szCs w:val="12"/>
+          <w:u w:val="single"/>
+        </w:rPr>
+        <w:t>Loopt helemaal goed, snijdt opeens af</w:t>
+      </w:r>
+      <w:r>
+        <w:rPr>
+          <w:color w:val="EE0000"/>
+          <w:sz w:val="12"/>
+          <w:szCs w:val="12"/>
+          <w:u w:val="single"/>
+        </w:rPr>
+        <w:t xml:space="preserve"> en loopt daarna weer goed door. </w:t>
+      </w:r>
+      <w:r>
+        <w:rPr>
+          <w:color w:val="EE0000"/>
+          <w:sz w:val="12"/>
+          <w:szCs w:val="12"/>
+          <w:u w:val="single"/>
+        </w:rPr>
+        <w:drawing>
+          <wp:inline distT="0" distB="0" distL="0" distR="0" wp14:anchorId="38281D42" wp14:editId="18A7BE80">
+            <wp:extent cx="65853" cy="65943"/>
+            <wp:effectExtent l="0" t="0" r="0" b="0"/>
+            <wp:docPr id="1198315564" name="Picture 1" descr="A maze with a blue line&#10;&#10;AI-generated content may be incorrect."/>
+            <wp:cNvGraphicFramePr>
+              <a:graphicFrameLocks xmlns:a="http://schemas.openxmlformats.org/drawingml/2006/main" noChangeAspect="1"/>
+            </wp:cNvGraphicFramePr>
+            <a:graphic xmlns:a="http://schemas.openxmlformats.org/drawingml/2006/main">
+              <a:graphicData uri="http://schemas.openxmlformats.org/drawingml/2006/picture">
+                <pic:pic xmlns:pic="http://schemas.openxmlformats.org/drawingml/2006/picture">
+                  <pic:nvPicPr>
+                    <pic:cNvPr id="1198315564" name="Picture 1" descr="A maze with a blue line&#10;&#10;AI-generated content may be incorrect."/>
+                    <pic:cNvPicPr/>
+                  </pic:nvPicPr>
+                  <pic:blipFill>
+                    <a:blip r:embed="rId12"/>
+                    <a:stretch>
+                      <a:fillRect/>
+                    </a:stretch>
+                  </pic:blipFill>
+                  <pic:spPr>
+                    <a:xfrm>
+                      <a:off x="0" y="0"/>
+                      <a:ext cx="71262" cy="71359"/>
+                    </a:xfrm>
+                    <a:prstGeom prst="rect">
+                      <a:avLst/>
+                    </a:prstGeom>
+                  </pic:spPr>
+                </pic:pic>
+              </a:graphicData>
+            </a:graphic>
+          </wp:inline>
+        </w:drawing>
+      </w:r>
+      <w:r>
+        <w:rPr>
+          <w:color w:val="EE0000"/>
+          <w:sz w:val="12"/>
+          <w:szCs w:val="12"/>
+          <w:u w:val="single"/>
+        </w:rPr>
+        <w:br/>
+        <w:t>Run 5:</w:t>
+      </w:r>
+      <w:r>
+        <w:rPr>
+          <w:color w:val="EE0000"/>
+          <w:sz w:val="12"/>
+          <w:szCs w:val="12"/>
+          <w:u w:val="single"/>
+        </w:rPr>
+        <w:br/>
+        <w:t>Run 6:</w:t>
+      </w:r>
+      <w:r>
+        <w:rPr>
+          <w:color w:val="EE0000"/>
+          <w:sz w:val="12"/>
+          <w:szCs w:val="12"/>
+          <w:u w:val="single"/>
+        </w:rPr>
+        <w:br/>
+        <w:t>Run 8:</w:t>
+      </w:r>
+      <w:r>
+        <w:rPr>
+          <w:color w:val="EE0000"/>
+          <w:sz w:val="12"/>
+          <w:szCs w:val="12"/>
+          <w:u w:val="single"/>
+        </w:rPr>
+        <w:br/>
+        <w:t>Run 9:</w:t>
+      </w:r>
+    </w:p>
+    <w:p>
+      <w:pPr>
+        <w:rPr>
+          <w:sz w:val="12"/>
+          <w:szCs w:val="12"/>
+          <w:u w:val="single"/>
+        </w:rPr>
+      </w:pPr>
+      <w:r>
+        <w:rPr>
+          <w:sz w:val="12"/>
+          <w:szCs w:val="12"/>
+        </w:rPr>
+        <w:t xml:space="preserve">line_jpg = </w:t>
+      </w:r>
+      <w:r>
+        <w:rPr>
+          <w:sz w:val="12"/>
+          <w:szCs w:val="12"/>
+        </w:rPr>
+        <w:t>[</w:t>
+      </w:r>
+      <w:r>
+        <w:rPr>
+          <w:color w:val="EE0000"/>
+          <w:sz w:val="12"/>
+          <w:szCs w:val="12"/>
+        </w:rPr>
+        <w:t xml:space="preserve">0.7692307692307693, 1.4705882352941175, 1.4492753623188406, </w:t>
+      </w:r>
+      <w:r>
+        <w:rPr>
+          <w:sz w:val="12"/>
+          <w:szCs w:val="12"/>
+        </w:rPr>
+        <w:t xml:space="preserve">0.0, 0.0, 0.0, 0.0, 0.0, </w:t>
+      </w:r>
+      <w:r>
+        <w:rPr>
+          <w:color w:val="EE0000"/>
+          <w:sz w:val="12"/>
+          <w:szCs w:val="12"/>
+        </w:rPr>
+        <w:t>0.7575757575757576</w:t>
+      </w:r>
+      <w:r>
+        <w:rPr>
+          <w:sz w:val="12"/>
+          <w:szCs w:val="12"/>
+        </w:rPr>
+        <w:t>, 0.0</w:t>
+      </w:r>
+      <w:r>
+        <w:rPr>
+          <w:sz w:val="12"/>
+          <w:szCs w:val="12"/>
+        </w:rPr>
+        <w:t>]</w:t>
+      </w:r>
+      <w:r>
+        <w:rPr>
+          <w:sz w:val="12"/>
+          <w:szCs w:val="12"/>
+        </w:rPr>
+        <w:br/>
+      </w:r>
+      <w:r>
+        <w:rPr>
+          <w:color w:val="EE0000"/>
+          <w:sz w:val="12"/>
+          <w:szCs w:val="12"/>
+          <w:u w:val="single"/>
+        </w:rPr>
+        <w:t>Run 1:</w:t>
+      </w:r>
+      <w:r>
+        <w:rPr>
+          <w:color w:val="EE0000"/>
+          <w:sz w:val="12"/>
+          <w:szCs w:val="12"/>
+          <w:u w:val="single"/>
+        </w:rPr>
+        <w:t xml:space="preserve"> het begin heeft qua vorm een gelijkenis met wat het moet zijn (paars), maar op de verkeerde plek dus ik kan niet helemaal opmaken of dit opzettelijk is of niet. Verder klinkklare onzin, summary beschrijft wel iteratief proces. </w:t>
+      </w:r>
+      <w:r>
+        <w:rPr>
+          <w:color w:val="EE0000"/>
+          <w:sz w:val="12"/>
+          <w:szCs w:val="12"/>
+          <w:u w:val="single"/>
+        </w:rPr>
+        <w:drawing>
+          <wp:inline distT="0" distB="0" distL="0" distR="0" wp14:anchorId="5AD2AFBA" wp14:editId="63D3D4FC">
+            <wp:extent cx="93457" cy="93457"/>
+            <wp:effectExtent l="0" t="0" r="1905" b="1905"/>
+            <wp:docPr id="338672207" name="Picture 1" descr="A maze with a blue line&#10;&#10;AI-generated content may be incorrect."/>
+            <wp:cNvGraphicFramePr>
+              <a:graphicFrameLocks xmlns:a="http://schemas.openxmlformats.org/drawingml/2006/main" noChangeAspect="1"/>
+            </wp:cNvGraphicFramePr>
+            <a:graphic xmlns:a="http://schemas.openxmlformats.org/drawingml/2006/main">
+              <a:graphicData uri="http://schemas.openxmlformats.org/drawingml/2006/picture">
+                <pic:pic xmlns:pic="http://schemas.openxmlformats.org/drawingml/2006/picture">
+                  <pic:nvPicPr>
+                    <pic:cNvPr id="338672207" name="Picture 1" descr="A maze with a blue line&#10;&#10;AI-generated content may be incorrect."/>
+                    <pic:cNvPicPr/>
+                  </pic:nvPicPr>
+                  <pic:blipFill>
+                    <a:blip r:embed="rId13"/>
+                    <a:stretch>
+                      <a:fillRect/>
+                    </a:stretch>
+                  </pic:blipFill>
+                  <pic:spPr>
+                    <a:xfrm>
+                      <a:off x="0" y="0"/>
+                      <a:ext cx="99787" cy="99787"/>
+                    </a:xfrm>
+                    <a:prstGeom prst="rect">
+                      <a:avLst/>
+                    </a:prstGeom>
+                  </pic:spPr>
+                </pic:pic>
+              </a:graphicData>
+            </a:graphic>
+          </wp:inline>
+        </w:drawing>
+      </w:r>
+      <w:r>
+        <w:rPr>
+          <w:color w:val="EE0000"/>
+          <w:sz w:val="12"/>
+          <w:szCs w:val="12"/>
+          <w:u w:val="single"/>
+        </w:rPr>
+        <w:br/>
+        <w:t>Run 2:</w:t>
+      </w:r>
+      <w:r>
+        <w:rPr>
+          <w:color w:val="EE0000"/>
+          <w:sz w:val="12"/>
+          <w:szCs w:val="12"/>
+          <w:u w:val="single"/>
+        </w:rPr>
+        <w:t xml:space="preserve"> beginpunt verkeerd. Omschrijft ‘fork in the road’ op 2 plekken waar gewoon alleen een bocht is. Ik denk vertaalfout van img -&gt; txt. Pad is onzin. </w:t>
+      </w:r>
+      <w:r>
+        <w:rPr>
+          <w:color w:val="EE0000"/>
+          <w:sz w:val="12"/>
+          <w:szCs w:val="12"/>
+          <w:u w:val="single"/>
+        </w:rPr>
+        <w:br/>
+        <w:t>Run 3:</w:t>
+      </w:r>
+      <w:r>
+        <w:rPr>
+          <w:color w:val="EE0000"/>
+          <w:sz w:val="12"/>
+          <w:szCs w:val="12"/>
+          <w:u w:val="single"/>
+        </w:rPr>
+        <w:t xml:space="preserve"> begin/eind fout. Omschrijft een ‘T-junction’ waar gewoon een bocht is. Pad is onzinnig maar ik kan niet bepalen of de eerste 2 stappen intentioneel zijn of niet.  </w:t>
+      </w:r>
+      <w:r>
+        <w:rPr>
+          <w:color w:val="EE0000"/>
+          <w:sz w:val="12"/>
+          <w:szCs w:val="12"/>
+          <w:u w:val="single"/>
+        </w:rPr>
+        <w:drawing>
+          <wp:inline distT="0" distB="0" distL="0" distR="0" wp14:anchorId="4536C12D" wp14:editId="0B2B8C56">
+            <wp:extent cx="116541" cy="116383"/>
+            <wp:effectExtent l="0" t="0" r="0" b="0"/>
+            <wp:docPr id="292888247" name="Picture 1" descr="A maze with a blue line&#10;&#10;AI-generated content may be incorrect."/>
+            <wp:cNvGraphicFramePr>
+              <a:graphicFrameLocks xmlns:a="http://schemas.openxmlformats.org/drawingml/2006/main" noChangeAspect="1"/>
+            </wp:cNvGraphicFramePr>
+            <a:graphic xmlns:a="http://schemas.openxmlformats.org/drawingml/2006/main">
+              <a:graphicData uri="http://schemas.openxmlformats.org/drawingml/2006/picture">
+                <pic:pic xmlns:pic="http://schemas.openxmlformats.org/drawingml/2006/picture">
+                  <pic:nvPicPr>
+                    <pic:cNvPr id="292888247" name="Picture 1" descr="A maze with a blue line&#10;&#10;AI-generated content may be incorrect."/>
+                    <pic:cNvPicPr/>
+                  </pic:nvPicPr>
+                  <pic:blipFill>
+                    <a:blip r:embed="rId14"/>
+                    <a:stretch>
+                      <a:fillRect/>
+                    </a:stretch>
+                  </pic:blipFill>
+                  <pic:spPr>
+                    <a:xfrm flipV="1">
+                      <a:off x="0" y="0"/>
+                      <a:ext cx="124683" cy="124514"/>
+                    </a:xfrm>
+                    <a:prstGeom prst="rect">
+                      <a:avLst/>
+                    </a:prstGeom>
+                  </pic:spPr>
+                </pic:pic>
+              </a:graphicData>
+            </a:graphic>
+          </wp:inline>
+        </w:drawing>
+      </w:r>
+      <w:r>
+        <w:rPr>
+          <w:color w:val="EE0000"/>
+          <w:sz w:val="12"/>
+          <w:szCs w:val="12"/>
+          <w:u w:val="single"/>
+        </w:rPr>
+        <w:br/>
+        <w:t>Run 9:</w:t>
+      </w:r>
+    </w:p>
+    <w:p>
+      <w:pPr>
+        <w:rPr>
+          <w:sz w:val="12"/>
+          <w:szCs w:val="12"/>
+          <w:u w:val="single"/>
+          <w:lang w:val="en-US"/>
+        </w:rPr>
+      </w:pPr>
+      <w:r>
+        <w:rPr>
+          <w:sz w:val="12"/>
+          <w:szCs w:val="12"/>
+          <w:lang w:val="en-US"/>
+        </w:rPr>
+        <w:t xml:space="preserve">line_json = </w:t>
+      </w:r>
+      <w:r>
+        <w:rPr>
+          <w:sz w:val="12"/>
+          <w:szCs w:val="12"/>
+          <w:lang w:val="en-US"/>
+        </w:rPr>
+        <w:t>[</w:t>
+      </w:r>
+      <w:r>
+        <w:rPr>
+          <w:sz w:val="12"/>
+          <w:szCs w:val="12"/>
+          <w:lang w:val="en-US"/>
+        </w:rPr>
+        <w:t>27.692307692307693, 14.705882352941178, 10.144927536231885, 12.5, 9.523809523809524, 26.0, 19.696969696969695, 29.48717948717949, 1.5151515151515151, 32.608695652173914</w:t>
+      </w:r>
+      <w:r>
+        <w:rPr>
+          <w:sz w:val="12"/>
+          <w:szCs w:val="12"/>
+          <w:lang w:val="en-US"/>
+        </w:rPr>
+        <w:t>]</w:t>
+      </w:r>
+      <w:r>
+        <w:rPr>
+          <w:sz w:val="12"/>
+          <w:szCs w:val="12"/>
+          <w:lang w:val="en-US"/>
+        </w:rPr>
+        <w:br/>
+      </w:r>
+    </w:p>
+    <w:p>
+      <w:pPr>
+        <w:rPr>
+          <w:sz w:val="12"/>
+          <w:szCs w:val="12"/>
+          <w:u w:val="single"/>
+        </w:rPr>
+      </w:pPr>
+      <w:r>
+        <w:rPr>
+          <w:sz w:val="12"/>
+          <w:szCs w:val="12"/>
+          <w:lang w:val="en-US"/>
+        </w:rPr>
+        <w:t xml:space="preserve">line_tokenized_txt = </w:t>
+      </w:r>
+      <w:r>
+        <w:rPr>
+          <w:sz w:val="12"/>
+          <w:szCs w:val="12"/>
+          <w:lang w:val="en-US"/>
+        </w:rPr>
+        <w:t>[</w:t>
+      </w:r>
+      <w:r>
+        <w:rPr>
+          <w:color w:val="EE0000"/>
+          <w:sz w:val="12"/>
+          <w:szCs w:val="12"/>
+          <w:lang w:val="en-US"/>
+        </w:rPr>
+        <w:t>33.07692307692307, 39.705882352941174, 7.971014492753622, 5.357142857142857, 39.682539682539684, 100.0, 100.0, 50.0, 60.60606060606061, 100.0</w:t>
+      </w:r>
+      <w:r>
+        <w:rPr>
+          <w:sz w:val="12"/>
+          <w:szCs w:val="12"/>
+          <w:lang w:val="en-US"/>
+        </w:rPr>
+        <w:t>]</w:t>
+      </w:r>
+      <w:r>
+        <w:rPr>
+          <w:sz w:val="12"/>
+          <w:szCs w:val="12"/>
+          <w:lang w:val="en-US"/>
+        </w:rPr>
+        <w:br/>
+      </w:r>
+      <w:r>
+        <w:rPr>
+          <w:color w:val="EE0000"/>
+          <w:sz w:val="12"/>
+          <w:szCs w:val="12"/>
+          <w:u w:val="single"/>
+          <w:lang w:val="en-US"/>
+        </w:rPr>
+        <w:t>Run 1:</w:t>
+      </w:r>
+      <w:r>
+        <w:rPr>
+          <w:color w:val="EE0000"/>
+          <w:sz w:val="12"/>
+          <w:szCs w:val="12"/>
+          <w:u w:val="single"/>
+          <w:lang w:val="en-US"/>
+        </w:rPr>
+        <w:t xml:space="preserve"> uitleg licht het Antwoord niet echt toe. Omschrijft het process maar niet met specifieke omschrijvingen.</w:t>
+      </w:r>
+      <w:r>
+        <w:rPr>
+          <w:color w:val="EE0000"/>
+          <w:sz w:val="12"/>
+          <w:szCs w:val="12"/>
+          <w:u w:val="single"/>
+          <w:lang w:val="en-US"/>
+        </w:rPr>
+        <w:br/>
+      </w:r>
+      <w:r>
+        <w:rPr>
+          <w:color w:val="EE0000"/>
+          <w:sz w:val="12"/>
+          <w:szCs w:val="12"/>
+          <w:u w:val="single"/>
+        </w:rPr>
+        <w:t>Run 2:</w:t>
+      </w:r>
+      <w:r>
+        <w:rPr>
+          <w:color w:val="EE0000"/>
+          <w:sz w:val="12"/>
+          <w:szCs w:val="12"/>
+          <w:u w:val="single"/>
+        </w:rPr>
+        <w:t xml:space="preserve"> snijdt een stuk in het midden opeens af, maar doe</w:t>
+      </w:r>
+      <w:r>
+        <w:rPr>
+          <w:color w:val="EE0000"/>
+          <w:sz w:val="12"/>
+          <w:szCs w:val="12"/>
+          <w:u w:val="single"/>
+        </w:rPr>
+        <w:t xml:space="preserve">t de rest van de oplossing weer goed. </w:t>
+      </w:r>
+      <w:r>
+        <w:rPr>
+          <w:color w:val="EE0000"/>
+          <w:sz w:val="12"/>
+          <w:szCs w:val="12"/>
+          <w:u w:val="single"/>
+        </w:rPr>
+        <w:drawing>
+          <wp:inline distT="0" distB="0" distL="0" distR="0" wp14:anchorId="42058947" wp14:editId="072264A4">
+            <wp:extent cx="181469" cy="180975"/>
+            <wp:effectExtent l="0" t="0" r="9525" b="0"/>
+            <wp:docPr id="868108901" name="Picture 1" descr="A maze with a blue line&#10;&#10;AI-generated content may be incorrect."/>
+            <wp:cNvGraphicFramePr>
+              <a:graphicFrameLocks xmlns:a="http://schemas.openxmlformats.org/drawingml/2006/main" noChangeAspect="1"/>
+            </wp:cNvGraphicFramePr>
+            <a:graphic xmlns:a="http://schemas.openxmlformats.org/drawingml/2006/main">
+              <a:graphicData uri="http://schemas.openxmlformats.org/drawingml/2006/picture">
+                <pic:pic xmlns:pic="http://schemas.openxmlformats.org/drawingml/2006/picture">
+                  <pic:nvPicPr>
+                    <pic:cNvPr id="868108901" name="Picture 1" descr="A maze with a blue line&#10;&#10;AI-generated content may be incorrect."/>
+                    <pic:cNvPicPr/>
+                  </pic:nvPicPr>
+                  <pic:blipFill>
+                    <a:blip r:embed="rId15"/>
+                    <a:stretch>
+                      <a:fillRect/>
+                    </a:stretch>
+                  </pic:blipFill>
+                  <pic:spPr>
+                    <a:xfrm flipH="1">
+                      <a:off x="0" y="0"/>
+                      <a:ext cx="198006" cy="197467"/>
+                    </a:xfrm>
+                    <a:prstGeom prst="rect">
+                      <a:avLst/>
+                    </a:prstGeom>
+                  </pic:spPr>
+                </pic:pic>
+              </a:graphicData>
+            </a:graphic>
+          </wp:inline>
+        </w:drawing>
+      </w:r>
+      <w:r>
+        <w:rPr>
+          <w:color w:val="EE0000"/>
+          <w:sz w:val="12"/>
+          <w:szCs w:val="12"/>
+          <w:u w:val="single"/>
+        </w:rPr>
+        <w:br/>
+      </w:r>
+      <w:r>
+        <w:rPr>
+          <w:color w:val="EE0000"/>
+          <w:sz w:val="12"/>
+          <w:szCs w:val="12"/>
+          <w:u w:val="single"/>
+          <w:lang w:val="en-US"/>
+        </w:rPr>
+        <w:t>Run 3:</w:t>
+      </w:r>
+      <w:r>
+        <w:rPr>
+          <w:color w:val="EE0000"/>
+          <w:sz w:val="12"/>
+          <w:szCs w:val="12"/>
+          <w:u w:val="single"/>
+          <w:lang w:val="en-US"/>
+        </w:rPr>
+        <w:t xml:space="preserve"> beginstapjes g</w:t>
+      </w:r>
+      <w:r>
+        <w:rPr>
+          <w:color w:val="EE0000"/>
+          <w:sz w:val="12"/>
+          <w:szCs w:val="12"/>
+          <w:u w:val="single"/>
+          <w:lang w:val="en-US"/>
+        </w:rPr>
+        <w:t xml:space="preserve">oed, daarna chaos. </w:t>
+      </w:r>
+      <w:r>
+        <w:rPr>
+          <w:color w:val="EE0000"/>
+          <w:sz w:val="12"/>
+          <w:szCs w:val="12"/>
+          <w:u w:val="single"/>
+          <w:lang w:val="en-US"/>
+        </w:rPr>
+        <w:t xml:space="preserve">Loopt veel loops door zichzelf met “right up left up” en trappetjes. </w:t>
+      </w:r>
+      <w:r>
+        <w:rPr>
+          <w:color w:val="EE0000"/>
+          <w:sz w:val="12"/>
+          <w:szCs w:val="12"/>
+          <w:u w:val="single"/>
+        </w:rPr>
+        <w:t>Summary legt uit dat hij de maze moeilijk vin</w:t>
+      </w:r>
+      <w:r>
+        <w:rPr>
+          <w:color w:val="EE0000"/>
+          <w:sz w:val="12"/>
+          <w:szCs w:val="12"/>
+          <w:u w:val="single"/>
+        </w:rPr>
+        <w:t xml:space="preserve">dt. </w:t>
+      </w:r>
+      <w:r>
+        <w:rPr>
+          <w:color w:val="EE0000"/>
+          <w:sz w:val="12"/>
+          <w:szCs w:val="12"/>
+          <w:u w:val="single"/>
+        </w:rPr>
+        <w:br/>
+        <w:t>Run 4:</w:t>
+      </w:r>
+      <w:r>
+        <w:rPr>
+          <w:color w:val="EE0000"/>
+          <w:sz w:val="12"/>
+          <w:szCs w:val="12"/>
+          <w:u w:val="single"/>
+        </w:rPr>
+        <w:br/>
+        <w:t>Run 5:</w:t>
+      </w:r>
+      <w:r>
+        <w:rPr>
+          <w:color w:val="EE0000"/>
+          <w:sz w:val="12"/>
+          <w:szCs w:val="12"/>
+          <w:u w:val="single"/>
+        </w:rPr>
+        <w:br/>
+        <w:t>Run 6:</w:t>
+      </w:r>
+      <w:r>
+        <w:rPr>
+          <w:color w:val="EE0000"/>
+          <w:sz w:val="12"/>
+          <w:szCs w:val="12"/>
+          <w:u w:val="single"/>
+        </w:rPr>
+        <w:br/>
+        <w:t>Run 7:</w:t>
+      </w:r>
+      <w:r>
+        <w:rPr>
+          <w:color w:val="EE0000"/>
+          <w:sz w:val="12"/>
+          <w:szCs w:val="12"/>
+          <w:u w:val="single"/>
+        </w:rPr>
+        <w:br/>
+        <w:t>Run 8:</w:t>
+      </w:r>
+      <w:r>
+        <w:rPr>
+          <w:color w:val="EE0000"/>
+          <w:sz w:val="12"/>
+          <w:szCs w:val="12"/>
+          <w:u w:val="single"/>
+        </w:rPr>
+        <w:br/>
+        <w:t>Run 9:</w:t>
+      </w:r>
+      <w:r>
+        <w:rPr>
+          <w:color w:val="EE0000"/>
+          <w:sz w:val="12"/>
+          <w:szCs w:val="12"/>
+          <w:u w:val="single"/>
+        </w:rPr>
+        <w:br/>
+        <w:t>Run 10:</w:t>
+      </w:r>
+    </w:p>
+    <w:p>
+      <w:pPr>
+        <w:rPr>
+          <w:sz w:val="12"/>
+          <w:szCs w:val="12"/>
+          <w:u w:val="single"/>
+        </w:rPr>
+      </w:pPr>
+      <w:r>
+        <w:rPr>
+          <w:sz w:val="12"/>
+          <w:szCs w:val="12"/>
+          <w:lang w:val="en-US"/>
+        </w:rPr>
+        <w:t xml:space="preserve">occupancy_adj_json = </w:t>
+      </w:r>
+      <w:r>
+        <w:rPr>
+          <w:sz w:val="12"/>
+          <w:szCs w:val="12"/>
+          <w:lang w:val="en-US"/>
+        </w:rPr>
+        <w:t>[</w:t>
+      </w:r>
+      <w:r>
+        <w:rPr>
+          <w:color w:val="EE0000"/>
+          <w:sz w:val="12"/>
+          <w:szCs w:val="12"/>
+          <w:lang w:val="en-US"/>
+        </w:rPr>
+        <w:t xml:space="preserve">46.15384615384615, </w:t>
+      </w:r>
+      <w:r>
+        <w:rPr>
+          <w:color w:val="0D0D0D" w:themeColor="text1" w:themeTint="F2"/>
+          <w:sz w:val="12"/>
+          <w:szCs w:val="12"/>
+          <w:lang w:val="en-US"/>
+        </w:rPr>
+        <w:t xml:space="preserve">100.0, </w:t>
+      </w:r>
+      <w:r>
+        <w:rPr>
+          <w:color w:val="EE0000"/>
+          <w:sz w:val="12"/>
+          <w:szCs w:val="12"/>
+          <w:lang w:val="en-US"/>
+        </w:rPr>
+        <w:t xml:space="preserve">38.405797101449274, </w:t>
+      </w:r>
+      <w:r>
+        <w:rPr>
+          <w:color w:val="0D0D0D" w:themeColor="text1" w:themeTint="F2"/>
+          <w:sz w:val="12"/>
+          <w:szCs w:val="12"/>
+          <w:lang w:val="en-US"/>
+        </w:rPr>
+        <w:t xml:space="preserve">100.0, </w:t>
+      </w:r>
+      <w:r>
+        <w:rPr>
+          <w:color w:val="EE0000"/>
+          <w:sz w:val="12"/>
+          <w:szCs w:val="12"/>
+          <w:lang w:val="en-US"/>
+        </w:rPr>
+        <w:t xml:space="preserve">34.523809523809526, </w:t>
+      </w:r>
+      <w:r>
+        <w:rPr>
+          <w:color w:val="0D0D0D" w:themeColor="text1" w:themeTint="F2"/>
+          <w:sz w:val="12"/>
+          <w:szCs w:val="12"/>
+          <w:lang w:val="en-US"/>
+        </w:rPr>
+        <w:t xml:space="preserve">100.0, 100.0, 100.0, </w:t>
+      </w:r>
+      <w:r>
+        <w:rPr>
+          <w:color w:val="EE0000"/>
+          <w:sz w:val="12"/>
+          <w:szCs w:val="12"/>
+          <w:lang w:val="en-US"/>
+        </w:rPr>
+        <w:t>71.21212121212122</w:t>
+      </w:r>
+      <w:r>
+        <w:rPr>
+          <w:sz w:val="12"/>
+          <w:szCs w:val="12"/>
+          <w:lang w:val="en-US"/>
+        </w:rPr>
+        <w:t>, 100.0</w:t>
+      </w:r>
+      <w:r>
+        <w:rPr>
+          <w:sz w:val="12"/>
+          <w:szCs w:val="12"/>
+          <w:lang w:val="en-US"/>
+        </w:rPr>
+        <w:t>]</w:t>
+      </w:r>
+      <w:r>
+        <w:rPr>
+          <w:sz w:val="12"/>
+          <w:szCs w:val="12"/>
+          <w:lang w:val="en-US"/>
+        </w:rPr>
+        <w:br/>
+      </w:r>
+      <w:r>
+        <w:rPr>
+          <w:color w:val="EE0000"/>
+          <w:sz w:val="12"/>
+          <w:szCs w:val="12"/>
+          <w:u w:val="single"/>
+          <w:lang w:val="en-US"/>
+        </w:rPr>
+        <w:t>Run 1:</w:t>
+      </w:r>
+      <w:r>
+        <w:rPr>
+          <w:color w:val="EE0000"/>
+          <w:sz w:val="12"/>
+          <w:szCs w:val="12"/>
+          <w:u w:val="single"/>
+          <w:lang w:val="en-US"/>
+        </w:rPr>
+        <w:t xml:space="preserve"> </w:t>
+      </w:r>
+      <w:r>
+        <w:rPr>
+          <w:color w:val="EE0000"/>
+          <w:sz w:val="12"/>
+          <w:szCs w:val="12"/>
+          <w:u w:val="single"/>
+          <w:lang w:val="en-US"/>
+        </w:rPr>
+        <w:t xml:space="preserve">gebruikt een script. </w:t>
+      </w:r>
+      <w:r>
+        <w:rPr>
+          <w:color w:val="EE0000"/>
+          <w:sz w:val="12"/>
+          <w:szCs w:val="12"/>
+          <w:u w:val="single"/>
+          <w:lang w:val="en-US"/>
+        </w:rPr>
+        <w:t>“</w:t>
+      </w:r>
+      <w:r>
+        <w:rPr>
+          <w:color w:val="EE0000"/>
+          <w:sz w:val="12"/>
+          <w:szCs w:val="12"/>
+          <w:u w:val="single"/>
+          <w:lang w:val="en-US"/>
+        </w:rPr>
+        <w:t> I started by building the adjacency map which made it easier to lookup neighbors, making the BFS faste</w:t>
+      </w:r>
+      <w:r>
+        <w:rPr>
+          <w:color w:val="EE0000"/>
+          <w:sz w:val="12"/>
+          <w:szCs w:val="12"/>
+          <w:u w:val="single"/>
+          <w:lang w:val="en-US"/>
+        </w:rPr>
+        <w:t>r</w:t>
+      </w:r>
+      <w:r>
+        <w:rPr>
+          <w:color w:val="EE0000"/>
+          <w:sz w:val="12"/>
+          <w:szCs w:val="12"/>
+          <w:highlight w:val="cyan"/>
+          <w:u w:val="single"/>
+          <w:lang w:val="en-US"/>
+        </w:rPr>
+        <w:t xml:space="preserve">”. -&gt; doen de adj’s het beter? </w:t>
+      </w:r>
+      <w:r>
+        <w:rPr>
+          <w:color w:val="EE0000"/>
+          <w:sz w:val="12"/>
+          <w:szCs w:val="12"/>
+          <w:highlight w:val="cyan"/>
+          <w:u w:val="single"/>
+        </w:rPr>
+        <w:t>Is dit dan omdat hij daar overal code gebruikt? Doen de non-adj’s het slechter omdat de omzetting naar adj niet goed lukt en dus foute BFS gebeurt?</w:t>
+      </w:r>
+      <w:r>
+        <w:rPr>
+          <w:color w:val="EE0000"/>
+          <w:sz w:val="12"/>
+          <w:szCs w:val="12"/>
+          <w:u w:val="single"/>
+        </w:rPr>
+        <w:br/>
+        <w:t>Run 3:</w:t>
+      </w:r>
+      <w:r>
+        <w:rPr>
+          <w:color w:val="EE0000"/>
+          <w:sz w:val="12"/>
+          <w:szCs w:val="12"/>
+          <w:u w:val="single"/>
+        </w:rPr>
+        <w:t xml:space="preserve"> gaat heel lang goed tot hij opeens in zichzelf gaat kringelen. Summary is niet behulpzaam.</w:t>
+      </w:r>
+      <w:r>
+        <w:rPr>
+          <w:color w:val="EE0000"/>
+          <w:sz w:val="12"/>
+          <w:szCs w:val="12"/>
+          <w:u w:val="single"/>
+        </w:rPr>
+        <w:br/>
+        <w:t>Run 5:</w:t>
+      </w:r>
+      <w:r>
+        <w:rPr>
+          <w:color w:val="EE0000"/>
+          <w:sz w:val="12"/>
+          <w:szCs w:val="12"/>
+          <w:u w:val="single"/>
+        </w:rPr>
+        <w:br/>
+        <w:t>Run 9:</w:t>
+      </w:r>
+    </w:p>
+    <w:p>
+      <w:pPr>
+        <w:rPr>
+          <w:sz w:val="12"/>
+          <w:szCs w:val="12"/>
+          <w:lang w:val="en-US"/>
+        </w:rPr>
+      </w:pPr>
+      <w:r>
+        <w:rPr>
+          <w:sz w:val="12"/>
+          <w:szCs w:val="12"/>
+          <w:lang w:val="en-US"/>
+        </w:rPr>
+        <w:t xml:space="preserve">occupancy_adj_txt = </w:t>
+      </w:r>
+      <w:r>
+        <w:rPr>
+          <w:sz w:val="12"/>
+          <w:szCs w:val="12"/>
+          <w:lang w:val="en-US"/>
+        </w:rPr>
+        <w:t>[</w:t>
+      </w:r>
+      <w:r>
+        <w:rPr>
+          <w:sz w:val="12"/>
+          <w:szCs w:val="12"/>
+          <w:lang w:val="en-US"/>
+        </w:rPr>
+        <w:t>27.692307692307693, 100.0, 7.246376811594203, 14.285714285714285, 9.126984126984127, 77.0, 25.757575757575758, 67.94871794871796, 39.39393939393939, 100.0</w:t>
+      </w:r>
+      <w:r>
+        <w:rPr>
+          <w:sz w:val="12"/>
+          <w:szCs w:val="12"/>
+          <w:lang w:val="en-US"/>
+        </w:rPr>
+        <w:t>]</w:t>
+      </w:r>
+    </w:p>
+    <w:p>
+      <w:pPr>
+        <w:rPr>
+          <w:sz w:val="12"/>
+          <w:szCs w:val="12"/>
+        </w:rPr>
+      </w:pPr>
+      <w:r>
+        <w:rPr>
+          <w:sz w:val="12"/>
+          <w:szCs w:val="12"/>
+          <w:lang w:val="en-US"/>
+        </w:rPr>
+        <w:t xml:space="preserve">occupancy_ascii_txt = </w:t>
+      </w:r>
+      <w:r>
+        <w:rPr>
+          <w:sz w:val="12"/>
+          <w:szCs w:val="12"/>
+          <w:lang w:val="en-US"/>
+        </w:rPr>
+        <w:t>[</w:t>
+      </w:r>
+      <w:r>
+        <w:rPr>
+          <w:color w:val="EE0000"/>
+          <w:sz w:val="12"/>
+          <w:szCs w:val="12"/>
+          <w:lang w:val="en-US"/>
+        </w:rPr>
+        <w:t xml:space="preserve">1.5384615384615385, 5.88235294117647, </w:t>
+      </w:r>
+      <w:r>
+        <w:rPr>
+          <w:sz w:val="12"/>
+          <w:szCs w:val="12"/>
+          <w:lang w:val="en-US"/>
+        </w:rPr>
+        <w:t>0.0, 0.0, 0.0, 0.0, 3</w:t>
+      </w:r>
+      <w:r>
+        <w:rPr>
+          <w:color w:val="EE0000"/>
+          <w:sz w:val="12"/>
+          <w:szCs w:val="12"/>
+          <w:lang w:val="en-US"/>
+        </w:rPr>
+        <w:t>.0303030303030303, 1.282051282051282, 1.5151515151515151</w:t>
+      </w:r>
+      <w:r>
+        <w:rPr>
+          <w:sz w:val="12"/>
+          <w:szCs w:val="12"/>
+          <w:lang w:val="en-US"/>
+        </w:rPr>
+        <w:t>, 0.0</w:t>
+      </w:r>
+      <w:r>
+        <w:rPr>
+          <w:sz w:val="12"/>
+          <w:szCs w:val="12"/>
+          <w:lang w:val="en-US"/>
+        </w:rPr>
+        <w:t>]</w:t>
+      </w:r>
+      <w:r>
+        <w:rPr>
+          <w:sz w:val="12"/>
+          <w:szCs w:val="12"/>
+          <w:lang w:val="en-US"/>
+        </w:rPr>
+        <w:br/>
+      </w:r>
+      <w:r>
+        <w:rPr>
+          <w:color w:val="EE0000"/>
+          <w:sz w:val="12"/>
+          <w:szCs w:val="12"/>
+          <w:u w:val="single"/>
+          <w:lang w:val="en-US"/>
+        </w:rPr>
+        <w:t>Run 1:</w:t>
+      </w:r>
+      <w:r>
+        <w:rPr>
+          <w:color w:val="EE0000"/>
+          <w:sz w:val="12"/>
+          <w:szCs w:val="12"/>
+          <w:u w:val="single"/>
+          <w:lang w:val="en-US"/>
+        </w:rPr>
+        <w:t xml:space="preserve"> begin/eind fout. </w:t>
+      </w:r>
+      <w:r>
+        <w:rPr>
+          <w:color w:val="EE0000"/>
+          <w:sz w:val="12"/>
+          <w:szCs w:val="12"/>
+          <w:u w:val="single"/>
+        </w:rPr>
+        <w:t>Lijkt de hele layout niet te snappen, en hoe de cellen en muren werken. Kan dit voor enkele stapjes en dan helemaal niet meer.</w:t>
+      </w:r>
+      <w:r>
+        <w:rPr>
+          <w:color w:val="EE0000"/>
+          <w:sz w:val="12"/>
+          <w:szCs w:val="12"/>
+          <w:u w:val="single"/>
+        </w:rPr>
+        <w:br/>
+        <w:t xml:space="preserve">Run </w:t>
+      </w:r>
+      <w:r>
+        <w:rPr>
+          <w:color w:val="EE0000"/>
+          <w:sz w:val="12"/>
+          <w:szCs w:val="12"/>
+          <w:u w:val="single"/>
+        </w:rPr>
+        <w:t>2</w:t>
+      </w:r>
+      <w:r>
+        <w:rPr>
+          <w:color w:val="EE0000"/>
+          <w:sz w:val="12"/>
+          <w:szCs w:val="12"/>
+          <w:u w:val="single"/>
+        </w:rPr>
+        <w:t>:</w:t>
+      </w:r>
+      <w:r>
+        <w:rPr>
+          <w:color w:val="EE0000"/>
+          <w:sz w:val="12"/>
+          <w:szCs w:val="12"/>
+          <w:u w:val="single"/>
+        </w:rPr>
+        <w:t xml:space="preserve"> begin fout. Ik denk dat hij het begin echt probeert en daarna de tel/weg/regels kwijt raakt. </w:t>
+      </w:r>
+      <w:r>
+        <w:rPr>
+          <w:color w:val="EE0000"/>
+          <w:sz w:val="12"/>
+          <w:szCs w:val="12"/>
+          <w:u w:val="single"/>
+        </w:rPr>
+        <w:drawing>
+          <wp:inline distT="0" distB="0" distL="0" distR="0" wp14:anchorId="5261B4DB" wp14:editId="5AA74B2A">
+            <wp:extent cx="76200" cy="75783"/>
+            <wp:effectExtent l="0" t="0" r="0" b="635"/>
+            <wp:docPr id="1713636101" name="Picture 1" descr="A maze with a blue line&#10;&#10;AI-generated content may be incorrect."/>
+            <wp:cNvGraphicFramePr>
+              <a:graphicFrameLocks xmlns:a="http://schemas.openxmlformats.org/drawingml/2006/main" noChangeAspect="1"/>
+            </wp:cNvGraphicFramePr>
+            <a:graphic xmlns:a="http://schemas.openxmlformats.org/drawingml/2006/main">
+              <a:graphicData uri="http://schemas.openxmlformats.org/drawingml/2006/picture">
+                <pic:pic xmlns:pic="http://schemas.openxmlformats.org/drawingml/2006/picture">
+                  <pic:nvPicPr>
+                    <pic:cNvPr id="1713636101" name="Picture 1" descr="A maze with a blue line&#10;&#10;AI-generated content may be incorrect."/>
+                    <pic:cNvPicPr/>
+                  </pic:nvPicPr>
+                  <pic:blipFill>
+                    <a:blip r:embed="rId16"/>
+                    <a:stretch>
+                      <a:fillRect/>
+                    </a:stretch>
+                  </pic:blipFill>
+                  <pic:spPr>
+                    <a:xfrm>
+                      <a:off x="0" y="0"/>
+                      <a:ext cx="80527" cy="80086"/>
+                    </a:xfrm>
+                    <a:prstGeom prst="rect">
+                      <a:avLst/>
+                    </a:prstGeom>
+                  </pic:spPr>
+                </pic:pic>
+              </a:graphicData>
+            </a:graphic>
+          </wp:inline>
+        </w:drawing>
+      </w:r>
+      <w:r>
+        <w:rPr>
+          <w:color w:val="EE0000"/>
+          <w:sz w:val="12"/>
+          <w:szCs w:val="12"/>
+          <w:u w:val="single"/>
+        </w:rPr>
+        <w:br/>
+        <w:t xml:space="preserve">Run </w:t>
+      </w:r>
+      <w:r>
+        <w:rPr>
+          <w:color w:val="EE0000"/>
+          <w:sz w:val="12"/>
+          <w:szCs w:val="12"/>
+          <w:u w:val="single"/>
+        </w:rPr>
+        <w:t>7</w:t>
+      </w:r>
+      <w:r>
+        <w:rPr>
+          <w:color w:val="EE0000"/>
+          <w:sz w:val="12"/>
+          <w:szCs w:val="12"/>
+          <w:u w:val="single"/>
+        </w:rPr>
+        <w:t>:</w:t>
+      </w:r>
+      <w:r>
+        <w:rPr>
+          <w:color w:val="EE0000"/>
+          <w:sz w:val="12"/>
+          <w:szCs w:val="12"/>
+          <w:u w:val="single"/>
+        </w:rPr>
+        <w:br/>
+        <w:t>Run 8:</w:t>
+      </w:r>
+      <w:r>
+        <w:rPr>
+          <w:color w:val="EE0000"/>
+          <w:sz w:val="12"/>
+          <w:szCs w:val="12"/>
+          <w:u w:val="single"/>
+        </w:rPr>
+        <w:br/>
+        <w:t>Run 9:</w:t>
+      </w:r>
+    </w:p>
+    <w:p>
+      <w:pPr>
+        <w:rPr>
+          <w:sz w:val="12"/>
+          <w:szCs w:val="12"/>
+        </w:rPr>
+      </w:pPr>
+      <w:r>
+        <w:rPr>
+          <w:sz w:val="12"/>
+          <w:szCs w:val="12"/>
+          <w:lang w:val="en-US"/>
+        </w:rPr>
+        <w:t xml:space="preserve">occupancy_jpg = </w:t>
+      </w:r>
+      <w:r>
+        <w:rPr>
+          <w:sz w:val="12"/>
+          <w:szCs w:val="12"/>
+          <w:lang w:val="en-US"/>
+        </w:rPr>
+        <w:t>[</w:t>
+      </w:r>
+      <w:r>
+        <w:rPr>
+          <w:color w:val="EE0000"/>
+          <w:sz w:val="12"/>
+          <w:szCs w:val="12"/>
+          <w:lang w:val="en-US"/>
+        </w:rPr>
+        <w:t>1.153846153846154</w:t>
+      </w:r>
+      <w:r>
+        <w:rPr>
+          <w:sz w:val="12"/>
+          <w:szCs w:val="12"/>
+          <w:lang w:val="en-US"/>
+        </w:rPr>
+        <w:t>, 0.0, 0.0, 0.0, 0.0, 0.0, 0.0, 0.0, 0.0, 0.0</w:t>
+      </w:r>
+      <w:r>
+        <w:rPr>
+          <w:sz w:val="12"/>
+          <w:szCs w:val="12"/>
+          <w:lang w:val="en-US"/>
+        </w:rPr>
+        <w:t>]</w:t>
+      </w:r>
+      <w:r>
+        <w:rPr>
+          <w:sz w:val="12"/>
+          <w:szCs w:val="12"/>
+          <w:lang w:val="en-US"/>
+        </w:rPr>
+        <w:br/>
+      </w:r>
+      <w:r>
+        <w:rPr>
+          <w:sz w:val="12"/>
+          <w:szCs w:val="12"/>
+          <w:u w:val="single"/>
+          <w:lang w:val="en-US"/>
+        </w:rPr>
+        <w:t>Run 1:</w:t>
+      </w:r>
+      <w:r>
+        <w:rPr>
+          <w:sz w:val="12"/>
+          <w:szCs w:val="12"/>
+          <w:u w:val="single"/>
+          <w:lang w:val="en-US"/>
+        </w:rPr>
+        <w:t xml:space="preserve"> eindpunt fout. </w:t>
+      </w:r>
+      <w:r>
+        <w:rPr>
+          <w:sz w:val="12"/>
+          <w:szCs w:val="12"/>
+          <w:u w:val="single"/>
+        </w:rPr>
+        <w:t>Omschrifjt dat veel corridors ‘E-shaped’ zijn. Z</w:t>
+      </w:r>
+      <w:r>
+        <w:rPr>
+          <w:sz w:val="12"/>
+          <w:szCs w:val="12"/>
+          <w:u w:val="single"/>
+        </w:rPr>
+        <w:t xml:space="preserve">o lees je vaker bij de JPG’s dat de muur/corridor vormen worden omschreven, ik vermoed dat in de vertaling van img -&gt; tekst, de muren worden omschreven als vorm maar niet systematisch omschreven. </w:t>
+      </w:r>
+    </w:p>
+    <w:p>
+      <w:pPr>
+        <w:rPr>
+          <w:sz w:val="12"/>
+          <w:szCs w:val="12"/>
+          <w:lang w:val="en-US"/>
+        </w:rPr>
+      </w:pPr>
+      <w:r>
+        <w:rPr>
+          <w:sz w:val="12"/>
+          <w:szCs w:val="12"/>
+          <w:lang w:val="en-US"/>
+        </w:rPr>
+        <w:t xml:space="preserve">occupancy_json = </w:t>
+      </w:r>
+      <w:r>
+        <w:rPr>
+          <w:sz w:val="12"/>
+          <w:szCs w:val="12"/>
+          <w:lang w:val="en-US"/>
+        </w:rPr>
+        <w:t>[</w:t>
+      </w:r>
+      <w:r>
+        <w:rPr>
+          <w:sz w:val="12"/>
+          <w:szCs w:val="12"/>
+          <w:lang w:val="en-US"/>
+        </w:rPr>
+        <w:t>0.38461538461538464, 27.941176470588236, 5.797101449275362, 39.285714285714285, 3.1746031746031744, 7.000000000000001, 3.0303030303030303, 0.0, 3.0303030303030303, 7.608695652173914</w:t>
+      </w:r>
+      <w:r>
+        <w:rPr>
+          <w:sz w:val="12"/>
+          <w:szCs w:val="12"/>
+          <w:lang w:val="en-US"/>
+        </w:rPr>
+        <w:t>]</w:t>
+      </w:r>
+    </w:p>
+    <w:p>
+      <w:pPr>
+        <w:rPr>
+          <w:color w:val="EE0000"/>
+          <w:sz w:val="12"/>
+          <w:szCs w:val="12"/>
+          <w:u w:val="single"/>
+        </w:rPr>
+      </w:pPr>
+      <w:r>
+        <w:rPr>
+          <w:sz w:val="12"/>
+          <w:szCs w:val="12"/>
+        </w:rPr>
+        <w:t xml:space="preserve">occupancy_tokenized_txt = </w:t>
+      </w:r>
+      <w:r>
+        <w:rPr>
+          <w:sz w:val="12"/>
+          <w:szCs w:val="12"/>
+        </w:rPr>
+        <w:t>[</w:t>
+      </w:r>
+      <w:r>
+        <w:rPr>
+          <w:color w:val="EE0000"/>
+          <w:sz w:val="12"/>
+          <w:szCs w:val="12"/>
+        </w:rPr>
+        <w:t>25.384615384615383</w:t>
+      </w:r>
+      <w:r>
+        <w:rPr>
+          <w:color w:val="0D0D0D" w:themeColor="text1" w:themeTint="F2"/>
+          <w:sz w:val="12"/>
+          <w:szCs w:val="12"/>
+        </w:rPr>
+        <w:t>, 100.0</w:t>
+      </w:r>
+      <w:r>
+        <w:rPr>
+          <w:color w:val="EE0000"/>
+          <w:sz w:val="12"/>
+          <w:szCs w:val="12"/>
+        </w:rPr>
+        <w:t xml:space="preserve">, 4.3478260869565215, </w:t>
+      </w:r>
+      <w:r>
+        <w:rPr>
+          <w:color w:val="0D0D0D" w:themeColor="text1" w:themeTint="F2"/>
+          <w:sz w:val="12"/>
+          <w:szCs w:val="12"/>
+        </w:rPr>
+        <w:t>100.0</w:t>
+      </w:r>
+      <w:r>
+        <w:rPr>
+          <w:color w:val="EE0000"/>
+          <w:sz w:val="12"/>
+          <w:szCs w:val="12"/>
+        </w:rPr>
+        <w:t xml:space="preserve">, 50.79365079365079, 10.0, 18.181818181818183, 61.53846153846154, 0.7575757575757576, </w:t>
+      </w:r>
+      <w:r>
+        <w:rPr>
+          <w:sz w:val="12"/>
+          <w:szCs w:val="12"/>
+        </w:rPr>
+        <w:t>100.0</w:t>
+      </w:r>
+      <w:r>
+        <w:rPr>
+          <w:sz w:val="12"/>
+          <w:szCs w:val="12"/>
+        </w:rPr>
+        <w:t>]</w:t>
+      </w:r>
+      <w:r>
+        <w:rPr>
+          <w:sz w:val="12"/>
+          <w:szCs w:val="12"/>
+        </w:rPr>
+        <w:br/>
+      </w:r>
+      <w:r>
+        <w:rPr>
+          <w:color w:val="EE0000"/>
+          <w:sz w:val="12"/>
+          <w:szCs w:val="12"/>
+          <w:u w:val="single"/>
+        </w:rPr>
+        <w:t>Run 1:</w:t>
+      </w:r>
+      <w:r>
+        <w:rPr>
+          <w:color w:val="EE0000"/>
+          <w:sz w:val="12"/>
+          <w:szCs w:val="12"/>
+          <w:u w:val="single"/>
+        </w:rPr>
+        <w:t xml:space="preserve"> gaat gewoon g</w:t>
+      </w:r>
+      <w:r>
+        <w:rPr>
+          <w:color w:val="EE0000"/>
+          <w:sz w:val="12"/>
+          <w:szCs w:val="12"/>
+          <w:u w:val="single"/>
+        </w:rPr>
+        <w:t>oe</w:t>
+      </w:r>
+      <w:r>
+        <w:rPr>
+          <w:color w:val="EE0000"/>
+          <w:sz w:val="12"/>
+          <w:szCs w:val="12"/>
+          <w:u w:val="single"/>
+        </w:rPr>
+        <w:t>d tot hij opeens rogue gaat en dan terug naar regios waar</w:t>
+      </w:r>
+      <w:r>
+        <w:rPr>
+          <w:color w:val="EE0000"/>
+          <w:sz w:val="12"/>
+          <w:szCs w:val="12"/>
+          <w:u w:val="single"/>
+        </w:rPr>
+        <w:t xml:space="preserve"> hij al is geweest en het vierkant uit. </w:t>
+      </w:r>
+      <w:r>
+        <w:rPr>
+          <w:color w:val="EE0000"/>
+          <w:sz w:val="12"/>
+          <w:szCs w:val="12"/>
+          <w:u w:val="single"/>
+        </w:rPr>
+        <w:t xml:space="preserve">Is vaker gebeurd met deze maze in Andere representaties. </w:t>
+      </w:r>
+      <w:r>
+        <w:rPr>
+          <w:color w:val="EE0000"/>
+          <w:sz w:val="12"/>
+          <w:szCs w:val="12"/>
+          <w:u w:val="single"/>
+          <w:lang w:val="en-US"/>
+        </w:rPr>
+        <w:drawing>
+          <wp:inline distT="0" distB="0" distL="0" distR="0" wp14:anchorId="5C597AE7" wp14:editId="0B6CC2D9">
+            <wp:extent cx="155695" cy="57150"/>
+            <wp:effectExtent l="0" t="0" r="0" b="0"/>
+            <wp:docPr id="1820111402" name="Picture 1" descr="A maze with a blue line&#10;&#10;AI-generated content may be incorrect."/>
+            <wp:cNvGraphicFramePr>
+              <a:graphicFrameLocks xmlns:a="http://schemas.openxmlformats.org/drawingml/2006/main" noChangeAspect="1"/>
+            </wp:cNvGraphicFramePr>
+            <a:graphic xmlns:a="http://schemas.openxmlformats.org/drawingml/2006/main">
+              <a:graphicData uri="http://schemas.openxmlformats.org/drawingml/2006/picture">
+                <pic:pic xmlns:pic="http://schemas.openxmlformats.org/drawingml/2006/picture">
+                  <pic:nvPicPr>
+                    <pic:cNvPr id="1820111402" name="Picture 1" descr="A maze with a blue line&#10;&#10;AI-generated content may be incorrect."/>
+                    <pic:cNvPicPr/>
+                  </pic:nvPicPr>
+                  <pic:blipFill>
+                    <a:blip r:embed="rId17"/>
+                    <a:stretch>
+                      <a:fillRect/>
+                    </a:stretch>
+                  </pic:blipFill>
+                  <pic:spPr>
+                    <a:xfrm>
+                      <a:off x="0" y="0"/>
+                      <a:ext cx="159567" cy="58571"/>
+                    </a:xfrm>
+                    <a:prstGeom prst="rect">
+                      <a:avLst/>
+                    </a:prstGeom>
+                  </pic:spPr>
+                </pic:pic>
+              </a:graphicData>
+            </a:graphic>
+          </wp:inline>
+        </w:drawing>
+      </w:r>
+      <w:r>
+        <w:rPr>
+          <w:color w:val="EE0000"/>
+          <w:sz w:val="12"/>
+          <w:szCs w:val="12"/>
+          <w:u w:val="single"/>
+          <w:lang w:val="en-US"/>
+        </w:rPr>
+        <w:br/>
+        <w:t>Run 3:</w:t>
+      </w:r>
+      <w:r>
+        <w:rPr>
+          <w:color w:val="EE0000"/>
+          <w:sz w:val="12"/>
+          <w:szCs w:val="12"/>
+          <w:u w:val="single"/>
+          <w:lang w:val="en-US"/>
+        </w:rPr>
+        <w:t xml:space="preserve"> “</w:t>
+      </w:r>
+      <w:r>
+        <w:rPr>
+          <w:color w:val="EE0000"/>
+          <w:sz w:val="12"/>
+          <w:szCs w:val="12"/>
+          <w:u w:val="single"/>
+          <w:lang w:val="en-US"/>
+        </w:rPr>
+        <w:t> I also notice a general strategy of going to the right then making a drop-down.</w:t>
+      </w:r>
+      <w:r>
+        <w:rPr>
+          <w:color w:val="EE0000"/>
+          <w:sz w:val="12"/>
+          <w:szCs w:val="12"/>
+          <w:u w:val="single"/>
+          <w:lang w:val="en-US"/>
+        </w:rPr>
+        <w:t>”</w:t>
+      </w:r>
+      <w:r>
+        <w:rPr>
+          <w:color w:val="EE0000"/>
+          <w:sz w:val="12"/>
+          <w:szCs w:val="12"/>
+          <w:u w:val="single"/>
+          <w:lang w:val="en-US"/>
+        </w:rPr>
+        <w:t xml:space="preserve"> </w:t>
+      </w:r>
+      <w:r>
+        <w:rPr>
+          <w:color w:val="EE0000"/>
+          <w:sz w:val="12"/>
+          <w:szCs w:val="12"/>
+          <w:u w:val="single"/>
+        </w:rPr>
+        <w:t>Gaat een paar stapjes goed en</w:t>
+      </w:r>
+      <w:r>
+        <w:rPr>
+          <w:color w:val="EE0000"/>
+          <w:sz w:val="12"/>
+          <w:szCs w:val="12"/>
+          <w:u w:val="single"/>
+        </w:rPr>
+        <w:t xml:space="preserve"> daarna rogue, door muren heen, random trappen en in </w:t>
+      </w:r>
+      <w:r>
+        <w:rPr>
+          <w:color w:val="EE0000"/>
+          <w:sz w:val="12"/>
+          <w:szCs w:val="12"/>
+          <w:u w:val="single"/>
+        </w:rPr>
+        <w:lastRenderedPageBreak/>
+        <w:t>zichzelf.</w:t>
+      </w:r>
+      <w:r>
+        <w:rPr>
+          <w:color w:val="EE0000"/>
+          <w:sz w:val="12"/>
+          <w:szCs w:val="12"/>
+          <w:u w:val="single"/>
+        </w:rPr>
+        <w:br/>
+        <w:t>Run 5:</w:t>
+      </w:r>
+      <w:r>
+        <w:rPr>
+          <w:color w:val="EE0000"/>
+          <w:sz w:val="12"/>
+          <w:szCs w:val="12"/>
+          <w:u w:val="single"/>
+        </w:rPr>
+        <w:br/>
+        <w:t>Run 6:</w:t>
+      </w:r>
+      <w:r>
+        <w:rPr>
+          <w:sz w:val="12"/>
+          <w:szCs w:val="12"/>
+          <w:u w:val="single"/>
+        </w:rPr>
+        <w:br/>
+      </w:r>
+      <w:r>
+        <w:rPr>
+          <w:color w:val="EE0000"/>
+          <w:sz w:val="12"/>
+          <w:szCs w:val="12"/>
+          <w:u w:val="single"/>
+        </w:rPr>
+        <w:t>Run 7:</w:t>
+      </w:r>
+      <w:r>
+        <w:rPr>
+          <w:color w:val="EE0000"/>
+          <w:sz w:val="12"/>
+          <w:szCs w:val="12"/>
+          <w:u w:val="single"/>
+        </w:rPr>
+        <w:br/>
+        <w:t>Run 8:</w:t>
+      </w:r>
+      <w:r>
+        <w:rPr>
+          <w:color w:val="EE0000"/>
+          <w:sz w:val="12"/>
+          <w:szCs w:val="12"/>
+          <w:u w:val="single"/>
+        </w:rPr>
+        <w:br/>
+        <w:t>Run 9:</w:t>
       </w:r>
     </w:p>
     <w:p>
@@ -1657,8 +3805,6 @@
     <w:p>
       <w:pPr>
         <w:rPr>
-          <w:b/>
-          <w:bCs/>
           <w:sz w:val="12"/>
           <w:szCs w:val="12"/>
         </w:rPr>

</xml_diff>